<commit_message>
Soporte para carpetas de imagenes especificas por estudiante en compilador y creacion de directorios de imagenes para Amaal y Juliano
</commit_message>
<xml_diff>
--- a/keidy/reportes/Informe_Pasantia_IUTECP.docx
+++ b/keidy/reportes/Informe_Pasantia_IUTECP.docx
@@ -98,7 +98,7 @@
     <w:p>
       <w:pPr>
         <w:sectPr>
-          <w:footerReference w:type="default" r:id="rId9"/>
+          <w:footerReference w:type="default" r:id="rId11"/>
           <w:pgSz w:w="12240" w:h="15840"/>
           <w:pgMar w:top="1701" w:right="1701" w:bottom="1701" w:left="2268" w:header="720" w:footer="720" w:gutter="0"/>
           <w:cols w:space="720"/>
@@ -202,7 +202,7 @@
     <w:p>
       <w:pPr>
         <w:sectPr>
-          <w:footerReference w:type="default" r:id="rId10"/>
+          <w:footerReference w:type="default" r:id="rId12"/>
           <w:pgSz w:w="12240" w:h="15840"/>
           <w:pgMar w:top="1701" w:right="1701" w:bottom="1701" w:left="2268" w:header="720" w:footer="720" w:gutter="0"/>
           <w:cols w:space="720"/>
@@ -228,7 +228,7 @@
     <w:p>
       <w:pPr>
         <w:sectPr>
-          <w:footerReference w:type="default" r:id="rId11"/>
+          <w:footerReference w:type="default" r:id="rId13"/>
           <w:pgSz w:w="12240" w:h="15840"/>
           <w:pgMar w:top="2835" w:right="1701" w:bottom="1701" w:left="2268" w:header="720" w:footer="720" w:gutter="0"/>
           <w:cols w:space="720"/>
@@ -993,7 +993,7 @@
     <w:p>
       <w:pPr>
         <w:sectPr>
-          <w:footerReference w:type="default" r:id="rId12"/>
+          <w:footerReference w:type="default" r:id="rId14"/>
           <w:type w:val="continuous"/>
           <w:pgSz w:w="12240" w:h="15840"/>
           <w:pgMar w:top="1701" w:right="1701" w:bottom="1701" w:left="2268" w:header="720" w:footer="720" w:gutter="0"/>
@@ -1020,7 +1020,7 @@
     <w:p>
       <w:pPr>
         <w:sectPr>
-          <w:footerReference w:type="default" r:id="rId13"/>
+          <w:footerReference w:type="default" r:id="rId15"/>
           <w:pgSz w:w="12240" w:h="15840"/>
           <w:pgMar w:top="2835" w:right="1701" w:bottom="1701" w:left="2268" w:header="720" w:footer="720" w:gutter="0"/>
           <w:cols w:space="720"/>
@@ -1101,7 +1101,7 @@
     <w:p>
       <w:pPr>
         <w:sectPr>
-          <w:footerReference w:type="default" r:id="rId14"/>
+          <w:footerReference w:type="default" r:id="rId16"/>
           <w:type w:val="continuous"/>
           <w:pgSz w:w="12240" w:h="15840"/>
           <w:pgMar w:top="1701" w:right="1701" w:bottom="1701" w:left="2268" w:header="720" w:footer="720" w:gutter="0"/>
@@ -1128,7 +1128,7 @@
     <w:p>
       <w:pPr>
         <w:sectPr>
-          <w:footerReference w:type="default" r:id="rId15"/>
+          <w:footerReference w:type="default" r:id="rId17"/>
           <w:pgSz w:w="12240" w:h="15840"/>
           <w:pgMar w:top="2835" w:right="1701" w:bottom="1701" w:left="2268" w:header="720" w:footer="720" w:gutter="0"/>
           <w:cols w:space="720"/>
@@ -1209,7 +1209,7 @@
     <w:p>
       <w:pPr>
         <w:sectPr>
-          <w:footerReference w:type="default" r:id="rId16"/>
+          <w:footerReference w:type="default" r:id="rId18"/>
           <w:type w:val="continuous"/>
           <w:pgSz w:w="12240" w:h="15840"/>
           <w:pgMar w:top="1701" w:right="1701" w:bottom="1701" w:left="2268" w:header="720" w:footer="720" w:gutter="0"/>
@@ -1236,7 +1236,7 @@
     <w:p>
       <w:pPr>
         <w:sectPr>
-          <w:footerReference w:type="default" r:id="rId17"/>
+          <w:footerReference w:type="default" r:id="rId19"/>
           <w:pgSz w:w="12240" w:h="15840"/>
           <w:pgMar w:top="2835" w:right="1701" w:bottom="1701" w:left="2268" w:header="720" w:footer="720" w:gutter="0"/>
           <w:cols w:space="720"/>
@@ -1263,7 +1263,7 @@
     <w:p>
       <w:pPr>
         <w:sectPr>
-          <w:footerReference w:type="default" r:id="rId18"/>
+          <w:footerReference w:type="default" r:id="rId20"/>
           <w:type w:val="continuous"/>
           <w:pgSz w:w="12240" w:h="15840"/>
           <w:pgMar w:top="1701" w:right="1701" w:bottom="1701" w:left="2268" w:header="720" w:footer="720" w:gutter="0"/>
@@ -1304,7 +1304,7 @@
     <w:p>
       <w:pPr>
         <w:sectPr>
-          <w:footerReference w:type="default" r:id="rId19"/>
+          <w:footerReference w:type="default" r:id="rId21"/>
           <w:pgSz w:w="12240" w:h="15840"/>
           <w:pgMar w:top="2835" w:right="1701" w:bottom="1701" w:left="2268" w:header="720" w:footer="720" w:gutter="0"/>
           <w:cols w:space="720"/>
@@ -1740,14 +1740,64 @@
     </w:p>
     <w:p>
       <w:pPr>
+        <w:spacing w:before="480"/>
+        <w:jc w:val="center"/>
+      </w:pPr>
+      <w:r>
+        <w:drawing>
+          <wp:inline xmlns:a="http://schemas.openxmlformats.org/drawingml/2006/main" xmlns:pic="http://schemas.openxmlformats.org/drawingml/2006/picture">
+            <wp:extent cx="1800000" cy="1315385"/>
+            <wp:docPr id="1" name="Picture 1"/>
+            <wp:cNvGraphicFramePr>
+              <a:graphicFrameLocks noChangeAspect="1"/>
+            </wp:cNvGraphicFramePr>
+            <a:graphic>
+              <a:graphicData uri="http://schemas.openxmlformats.org/drawingml/2006/picture">
+                <pic:pic>
+                  <pic:nvPicPr>
+                    <pic:cNvPr id="0" name="1.png"/>
+                    <pic:cNvPicPr/>
+                  </pic:nvPicPr>
+                  <pic:blipFill>
+                    <a:blip r:embed="rId9"/>
+                    <a:stretch>
+                      <a:fillRect/>
+                    </a:stretch>
+                  </pic:blipFill>
+                  <pic:spPr>
+                    <a:xfrm>
+                      <a:off x="0" y="0"/>
+                      <a:ext cx="1800000" cy="1315385"/>
+                    </a:xfrm>
+                    <a:prstGeom prst="rect"/>
+                  </pic:spPr>
+                </pic:pic>
+              </a:graphicData>
+            </a:graphic>
+          </wp:inline>
+        </w:drawing>
+      </w:r>
+    </w:p>
+    <w:p>
+      <w:pPr>
+        <w:spacing w:before="120" w:after="480"/>
         <w:jc w:val="center"/>
       </w:pPr>
       <w:r>
         <w:rPr>
+          <w:rFonts w:ascii="Times New Roman" w:hAnsi="Times New Roman"/>
           <w:i/>
-          <w:color w:val="FF0000"/>
+          <w:sz w:val="24"/>
         </w:rPr>
-        <w:t>[IMAGEN NO ENCONTRADA: Gráfico 1. Representación cartográfica y ubicación espacial de la empresa.]</w:t>
+        <w:t xml:space="preserve">Gráfico 1. </w:t>
+      </w:r>
+      <w:r>
+        <w:rPr>
+          <w:rFonts w:ascii="Times New Roman" w:hAnsi="Times New Roman"/>
+          <w:b/>
+          <w:sz w:val="24"/>
+        </w:rPr>
+        <w:t>Representación cartográfica y ubicación espacial de la empresa.</w:t>
       </w:r>
     </w:p>
     <w:p>
@@ -1814,20 +1864,70 @@
     </w:p>
     <w:p>
       <w:pPr>
+        <w:spacing w:before="480"/>
+        <w:jc w:val="center"/>
+      </w:pPr>
+      <w:r>
+        <w:drawing>
+          <wp:inline xmlns:a="http://schemas.openxmlformats.org/drawingml/2006/main" xmlns:pic="http://schemas.openxmlformats.org/drawingml/2006/picture">
+            <wp:extent cx="4320000" cy="2603179"/>
+            <wp:docPr id="2" name="Picture 2"/>
+            <wp:cNvGraphicFramePr>
+              <a:graphicFrameLocks noChangeAspect="1"/>
+            </wp:cNvGraphicFramePr>
+            <a:graphic>
+              <a:graphicData uri="http://schemas.openxmlformats.org/drawingml/2006/picture">
+                <pic:pic>
+                  <pic:nvPicPr>
+                    <pic:cNvPr id="0" name="2.png"/>
+                    <pic:cNvPicPr/>
+                  </pic:nvPicPr>
+                  <pic:blipFill>
+                    <a:blip r:embed="rId10"/>
+                    <a:stretch>
+                      <a:fillRect/>
+                    </a:stretch>
+                  </pic:blipFill>
+                  <pic:spPr>
+                    <a:xfrm>
+                      <a:off x="0" y="0"/>
+                      <a:ext cx="4320000" cy="2603179"/>
+                    </a:xfrm>
+                    <a:prstGeom prst="rect"/>
+                  </pic:spPr>
+                </pic:pic>
+              </a:graphicData>
+            </a:graphic>
+          </wp:inline>
+        </w:drawing>
+      </w:r>
+    </w:p>
+    <w:p>
+      <w:pPr>
+        <w:spacing w:before="120" w:after="480"/>
         <w:jc w:val="center"/>
       </w:pPr>
       <w:r>
         <w:rPr>
+          <w:rFonts w:ascii="Times New Roman" w:hAnsi="Times New Roman"/>
           <w:i/>
-          <w:color w:val="FF0000"/>
+          <w:sz w:val="24"/>
         </w:rPr>
-        <w:t>[IMAGEN NO ENCONTRADA: Gráfico 2. Organigrama estructural y niveles jerárquicos de la organización.]</w:t>
+        <w:t xml:space="preserve">Gráfico 2. </w:t>
+      </w:r>
+      <w:r>
+        <w:rPr>
+          <w:rFonts w:ascii="Times New Roman" w:hAnsi="Times New Roman"/>
+          <w:b/>
+          <w:sz w:val="24"/>
+        </w:rPr>
+        <w:t>Organigrama estructural y niveles jerárquicos de la organización.</w:t>
       </w:r>
     </w:p>
     <w:p>
       <w:pPr>
         <w:sectPr>
-          <w:footerReference w:type="default" r:id="rId20"/>
+          <w:footerReference w:type="default" r:id="rId22"/>
           <w:type w:val="continuous"/>
           <w:pgSz w:w="12240" w:h="15840"/>
           <w:pgMar w:top="1701" w:right="1701" w:bottom="1701" w:left="2268" w:header="720" w:footer="720" w:gutter="0"/>
@@ -1868,7 +1968,7 @@
     <w:p>
       <w:pPr>
         <w:sectPr>
-          <w:footerReference w:type="default" r:id="rId21"/>
+          <w:footerReference w:type="default" r:id="rId23"/>
           <w:pgSz w:w="12240" w:h="15840"/>
           <w:pgMar w:top="2835" w:right="1701" w:bottom="1701" w:left="2268" w:header="720" w:footer="720" w:gutter="0"/>
           <w:cols w:space="720"/>
@@ -3491,7 +3591,7 @@
     <w:p>
       <w:pPr>
         <w:sectPr>
-          <w:footerReference w:type="default" r:id="rId22"/>
+          <w:footerReference w:type="default" r:id="rId24"/>
           <w:type w:val="continuous"/>
           <w:pgSz w:w="12240" w:h="15840"/>
           <w:pgMar w:top="1701" w:right="1701" w:bottom="1701" w:left="2268" w:header="720" w:footer="720" w:gutter="0"/>
@@ -3532,7 +3632,7 @@
     <w:p>
       <w:pPr>
         <w:sectPr>
-          <w:footerReference w:type="default" r:id="rId23"/>
+          <w:footerReference w:type="default" r:id="rId25"/>
           <w:pgSz w:w="12240" w:h="15840"/>
           <w:pgMar w:top="2835" w:right="1701" w:bottom="1701" w:left="2268" w:header="720" w:footer="720" w:gutter="0"/>
           <w:cols w:space="720"/>
@@ -3573,7 +3673,7 @@
     <w:p>
       <w:pPr>
         <w:sectPr>
-          <w:footerReference w:type="default" r:id="rId24"/>
+          <w:footerReference w:type="default" r:id="rId26"/>
           <w:type w:val="continuous"/>
           <w:pgSz w:w="12240" w:h="15840"/>
           <w:pgMar w:top="1701" w:right="1701" w:bottom="1701" w:left="2268" w:header="720" w:footer="720" w:gutter="0"/>
@@ -3614,7 +3714,7 @@
     <w:p>
       <w:pPr>
         <w:sectPr>
-          <w:footerReference w:type="default" r:id="rId25"/>
+          <w:footerReference w:type="default" r:id="rId27"/>
           <w:pgSz w:w="12240" w:h="15840"/>
           <w:pgMar w:top="2835" w:right="1701" w:bottom="1701" w:left="2268" w:header="720" w:footer="720" w:gutter="0"/>
           <w:cols w:space="720"/>
@@ -3655,7 +3755,7 @@
     <w:p>
       <w:pPr>
         <w:sectPr>
-          <w:footerReference w:type="default" r:id="rId26"/>
+          <w:footerReference w:type="default" r:id="rId28"/>
           <w:type w:val="continuous"/>
           <w:pgSz w:w="12240" w:h="15840"/>
           <w:pgMar w:top="1701" w:right="1701" w:bottom="1701" w:left="2268" w:header="720" w:footer="720" w:gutter="0"/>
@@ -3696,7 +3796,7 @@
     <w:p>
       <w:pPr>
         <w:sectPr>
-          <w:footerReference w:type="default" r:id="rId27"/>
+          <w:footerReference w:type="default" r:id="rId29"/>
           <w:pgSz w:w="12240" w:h="15840"/>
           <w:pgMar w:top="2835" w:right="1701" w:bottom="1701" w:left="2268" w:header="720" w:footer="720" w:gutter="0"/>
           <w:cols w:space="720"/>
@@ -3736,7 +3836,7 @@
     <w:p>
       <w:pPr>
         <w:sectPr>
-          <w:footerReference w:type="default" r:id="rId28"/>
+          <w:footerReference w:type="default" r:id="rId30"/>
           <w:type w:val="continuous"/>
           <w:pgSz w:w="12240" w:h="15840"/>
           <w:pgMar w:top="1701" w:right="1701" w:bottom="1701" w:left="2268" w:header="720" w:footer="720" w:gutter="0"/>
@@ -3763,7 +3863,7 @@
     <w:p>
       <w:pPr>
         <w:sectPr>
-          <w:footerReference w:type="default" r:id="rId29"/>
+          <w:footerReference w:type="default" r:id="rId31"/>
           <w:pgSz w:w="12240" w:h="15840"/>
           <w:pgMar w:top="2835" w:right="1701" w:bottom="1701" w:left="2268" w:header="720" w:footer="720" w:gutter="0"/>
           <w:cols w:space="720"/>
@@ -3778,7 +3878,7 @@
       </w:pPr>
     </w:p>
     <w:sectPr>
-      <w:footerReference w:type="default" r:id="rId30"/>
+      <w:footerReference w:type="default" r:id="rId32"/>
       <w:type w:val="continuous"/>
       <w:pgSz w:w="12240" w:h="15840"/>
       <w:pgMar w:top="1701" w:right="1701" w:bottom="1701" w:left="2268" w:header="720" w:footer="720" w:gutter="0"/>

</xml_diff>

<commit_message>
Fix: desvincular footer del indice para que no herede numeracion
</commit_message>
<xml_diff>
--- a/keidy/reportes/Informe_Pasantia_IUTECP.docx
+++ b/keidy/reportes/Informe_Pasantia_IUTECP.docx
@@ -517,6 +517,7 @@
     <w:p>
       <w:pPr>
         <w:sectPr>
+          <w:footerReference w:type="default" r:id="rId18"/>
           <w:pgSz w:w="12240" w:h="15840"/>
           <w:pgMar w:top="2835" w:right="1701" w:bottom="1701" w:left="2268" w:header="720" w:footer="720" w:gutter="0"/>
           <w:cols w:space="720"/>
@@ -1543,6 +1544,7 @@
     <w:p>
       <w:pPr>
         <w:sectPr>
+          <w:footerReference w:type="default" r:id="rId19"/>
           <w:type w:val="continuous"/>
           <w:pgSz w:w="12240" w:h="15840"/>
           <w:pgMar w:top="1701" w:right="1701" w:bottom="1701" w:left="2268" w:header="720" w:footer="720" w:gutter="0"/>
@@ -1571,7 +1573,7 @@
     <w:p>
       <w:pPr>
         <w:sectPr>
-          <w:footerReference w:type="default" r:id="rId18"/>
+          <w:footerReference w:type="default" r:id="rId20"/>
           <w:pgSz w:w="12240" w:h="15840"/>
           <w:pgMar w:top="2835" w:right="1701" w:bottom="1701" w:left="2268" w:header="720" w:footer="720" w:gutter="0"/>
           <w:cols w:space="720"/>
@@ -1674,7 +1676,7 @@
     <w:p>
       <w:pPr>
         <w:sectPr>
-          <w:footerReference w:type="default" r:id="rId19"/>
+          <w:footerReference w:type="default" r:id="rId21"/>
           <w:type w:val="continuous"/>
           <w:pgSz w:w="12240" w:h="15840"/>
           <w:pgMar w:top="1701" w:right="1701" w:bottom="1701" w:left="2268" w:header="720" w:footer="720" w:gutter="0"/>
@@ -1703,7 +1705,7 @@
     <w:p>
       <w:pPr>
         <w:sectPr>
-          <w:footerReference w:type="default" r:id="rId20"/>
+          <w:footerReference w:type="default" r:id="rId22"/>
           <w:pgSz w:w="12240" w:h="15840"/>
           <w:pgMar w:top="2835" w:right="1701" w:bottom="1701" w:left="2268" w:header="720" w:footer="720" w:gutter="0"/>
           <w:cols w:space="720"/>
@@ -1715,7 +1717,7 @@
     <w:p>
       <w:pPr>
         <w:sectPr>
-          <w:footerReference w:type="default" r:id="rId21"/>
+          <w:footerReference w:type="default" r:id="rId23"/>
           <w:type w:val="continuous"/>
           <w:pgSz w:w="12240" w:h="15840"/>
           <w:pgMar w:top="1701" w:right="1701" w:bottom="1701" w:left="2268" w:header="720" w:footer="720" w:gutter="0"/>
@@ -1744,7 +1746,7 @@
     <w:p>
       <w:pPr>
         <w:sectPr>
-          <w:footerReference w:type="default" r:id="rId22"/>
+          <w:footerReference w:type="default" r:id="rId24"/>
           <w:pgSz w:w="12240" w:h="15840"/>
           <w:pgMar w:top="2835" w:right="1701" w:bottom="1701" w:left="2268" w:header="720" w:footer="720" w:gutter="0"/>
           <w:cols w:space="720"/>
@@ -1847,7 +1849,7 @@
     <w:p>
       <w:pPr>
         <w:sectPr>
-          <w:footerReference w:type="default" r:id="rId23"/>
+          <w:footerReference w:type="default" r:id="rId25"/>
           <w:type w:val="continuous"/>
           <w:pgSz w:w="12240" w:h="15840"/>
           <w:pgMar w:top="1701" w:right="1701" w:bottom="1701" w:left="2268" w:header="720" w:footer="720" w:gutter="0"/>
@@ -1876,7 +1878,7 @@
     <w:p>
       <w:pPr>
         <w:sectPr>
-          <w:footerReference w:type="default" r:id="rId24"/>
+          <w:footerReference w:type="default" r:id="rId26"/>
           <w:pgSz w:w="12240" w:h="15840"/>
           <w:pgMar w:top="2835" w:right="1701" w:bottom="1701" w:left="2268" w:header="720" w:footer="720" w:gutter="0"/>
           <w:cols w:space="720"/>
@@ -2011,7 +2013,7 @@
     <w:p>
       <w:pPr>
         <w:sectPr>
-          <w:footerReference w:type="default" r:id="rId25"/>
+          <w:footerReference w:type="default" r:id="rId27"/>
           <w:type w:val="continuous"/>
           <w:pgSz w:w="12240" w:h="15840"/>
           <w:pgMar w:top="1701" w:right="1701" w:bottom="1701" w:left="2268" w:header="720" w:footer="720" w:gutter="0"/>
@@ -2040,7 +2042,7 @@
     <w:p>
       <w:pPr>
         <w:sectPr>
-          <w:footerReference w:type="default" r:id="rId26"/>
+          <w:footerReference w:type="default" r:id="rId28"/>
           <w:pgSz w:w="12240" w:h="15840"/>
           <w:pgMar w:top="2835" w:right="1701" w:bottom="1701" w:left="2268" w:header="720" w:footer="720" w:gutter="0"/>
           <w:cols w:space="720"/>
@@ -2082,7 +2084,7 @@
     <w:p>
       <w:pPr>
         <w:sectPr>
-          <w:footerReference w:type="default" r:id="rId27"/>
+          <w:footerReference w:type="default" r:id="rId29"/>
           <w:type w:val="continuous"/>
           <w:pgSz w:w="12240" w:h="15840"/>
           <w:pgMar w:top="1701" w:right="1701" w:bottom="1701" w:left="2268" w:header="720" w:footer="720" w:gutter="0"/>
@@ -2111,7 +2113,7 @@
     <w:p>
       <w:pPr>
         <w:sectPr>
-          <w:footerReference w:type="default" r:id="rId28"/>
+          <w:footerReference w:type="default" r:id="rId30"/>
           <w:pgSz w:w="12240" w:h="15840"/>
           <w:pgMar w:top="2835" w:right="1701" w:bottom="1701" w:left="2268" w:header="720" w:footer="720" w:gutter="0"/>
           <w:cols w:space="720"/>
@@ -2138,7 +2140,7 @@
     <w:p>
       <w:pPr>
         <w:sectPr>
-          <w:footerReference w:type="default" r:id="rId29"/>
+          <w:footerReference w:type="default" r:id="rId31"/>
           <w:type w:val="continuous"/>
           <w:pgSz w:w="12240" w:h="15840"/>
           <w:pgMar w:top="1701" w:right="1701" w:bottom="1701" w:left="2268" w:header="720" w:footer="720" w:gutter="0"/>
@@ -2181,7 +2183,7 @@
     <w:p>
       <w:pPr>
         <w:sectPr>
-          <w:footerReference w:type="default" r:id="rId30"/>
+          <w:footerReference w:type="default" r:id="rId32"/>
           <w:pgSz w:w="12240" w:h="15840"/>
           <w:pgMar w:top="2835" w:right="1701" w:bottom="1701" w:left="2268" w:header="720" w:footer="720" w:gutter="0"/>
           <w:cols w:space="720"/>
@@ -2841,7 +2843,7 @@
     <w:p>
       <w:pPr>
         <w:sectPr>
-          <w:footerReference w:type="default" r:id="rId31"/>
+          <w:footerReference w:type="default" r:id="rId33"/>
           <w:type w:val="continuous"/>
           <w:pgSz w:w="12240" w:h="15840"/>
           <w:pgMar w:top="1701" w:right="1701" w:bottom="1701" w:left="2268" w:header="720" w:footer="720" w:gutter="0"/>
@@ -2884,7 +2886,7 @@
     <w:p>
       <w:pPr>
         <w:sectPr>
-          <w:footerReference w:type="default" r:id="rId32"/>
+          <w:footerReference w:type="default" r:id="rId34"/>
           <w:pgSz w:w="12240" w:h="15840"/>
           <w:pgMar w:top="2835" w:right="1701" w:bottom="1701" w:left="2268" w:header="720" w:footer="720" w:gutter="0"/>
           <w:cols w:space="720"/>
@@ -6132,7 +6134,7 @@
     <w:p>
       <w:pPr>
         <w:sectPr>
-          <w:footerReference w:type="default" r:id="rId33"/>
+          <w:footerReference w:type="default" r:id="rId35"/>
           <w:type w:val="continuous"/>
           <w:pgSz w:w="12240" w:h="15840"/>
           <w:pgMar w:top="1701" w:right="1701" w:bottom="1701" w:left="2268" w:header="720" w:footer="720" w:gutter="0"/>
@@ -6175,7 +6177,7 @@
     <w:p>
       <w:pPr>
         <w:sectPr>
-          <w:footerReference w:type="default" r:id="rId34"/>
+          <w:footerReference w:type="default" r:id="rId36"/>
           <w:pgSz w:w="12240" w:h="15840"/>
           <w:pgMar w:top="2835" w:right="1701" w:bottom="1701" w:left="2268" w:header="720" w:footer="720" w:gutter="0"/>
           <w:cols w:space="720"/>
@@ -6445,7 +6447,7 @@
     <w:p>
       <w:pPr>
         <w:sectPr>
-          <w:footerReference w:type="default" r:id="rId35"/>
+          <w:footerReference w:type="default" r:id="rId37"/>
           <w:type w:val="continuous"/>
           <w:pgSz w:w="12240" w:h="15840"/>
           <w:pgMar w:top="1701" w:right="1701" w:bottom="1701" w:left="2268" w:header="720" w:footer="720" w:gutter="0"/>
@@ -6488,7 +6490,7 @@
     <w:p>
       <w:pPr>
         <w:sectPr>
-          <w:footerReference w:type="default" r:id="rId36"/>
+          <w:footerReference w:type="default" r:id="rId38"/>
           <w:pgSz w:w="12240" w:h="15840"/>
           <w:pgMar w:top="2835" w:right="1701" w:bottom="1701" w:left="2268" w:header="720" w:footer="720" w:gutter="0"/>
           <w:cols w:space="720"/>
@@ -7251,7 +7253,7 @@
     <w:p>
       <w:pPr>
         <w:sectPr>
-          <w:footerReference w:type="default" r:id="rId37"/>
+          <w:footerReference w:type="default" r:id="rId39"/>
           <w:type w:val="continuous"/>
           <w:pgSz w:w="12240" w:h="15840"/>
           <w:pgMar w:top="1701" w:right="1701" w:bottom="1701" w:left="2268" w:header="720" w:footer="720" w:gutter="0"/>
@@ -7294,7 +7296,7 @@
     <w:p>
       <w:pPr>
         <w:sectPr>
-          <w:footerReference w:type="default" r:id="rId38"/>
+          <w:footerReference w:type="default" r:id="rId40"/>
           <w:pgSz w:w="12240" w:h="15840"/>
           <w:pgMar w:top="2835" w:right="1701" w:bottom="1701" w:left="2268" w:header="720" w:footer="720" w:gutter="0"/>
           <w:cols w:space="720"/>
@@ -7506,7 +7508,7 @@
     <w:p>
       <w:pPr>
         <w:sectPr>
-          <w:footerReference w:type="default" r:id="rId39"/>
+          <w:footerReference w:type="default" r:id="rId41"/>
           <w:type w:val="continuous"/>
           <w:pgSz w:w="12240" w:h="15840"/>
           <w:pgMar w:top="1701" w:right="1701" w:bottom="1701" w:left="2268" w:header="720" w:footer="720" w:gutter="0"/>
@@ -7535,7 +7537,7 @@
     <w:p>
       <w:pPr>
         <w:sectPr>
-          <w:footerReference w:type="default" r:id="rId40"/>
+          <w:footerReference w:type="default" r:id="rId42"/>
           <w:pgSz w:w="12240" w:h="15840"/>
           <w:pgMar w:top="2835" w:right="1701" w:bottom="1701" w:left="2268" w:header="720" w:footer="720" w:gutter="0"/>
           <w:cols w:space="720"/>
@@ -7636,7 +7638,7 @@
     <w:p>
       <w:pPr>
         <w:sectPr>
-          <w:footerReference w:type="default" r:id="rId41"/>
+          <w:footerReference w:type="default" r:id="rId43"/>
           <w:type w:val="continuous"/>
           <w:pgSz w:w="12240" w:h="15840"/>
           <w:pgMar w:top="1701" w:right="1701" w:bottom="1701" w:left="2268" w:header="720" w:footer="720" w:gutter="0"/>
@@ -7665,7 +7667,7 @@
     <w:p>
       <w:pPr>
         <w:sectPr>
-          <w:footerReference w:type="default" r:id="rId42"/>
+          <w:footerReference w:type="default" r:id="rId44"/>
           <w:pgSz w:w="12240" w:h="15840"/>
           <w:pgMar w:top="2835" w:right="1701" w:bottom="1701" w:left="2268" w:header="720" w:footer="720" w:gutter="0"/>
           <w:cols w:space="720"/>
@@ -7720,7 +7722,7 @@
     <w:p>
       <w:pPr>
         <w:sectPr>
-          <w:footerReference w:type="default" r:id="rId43"/>
+          <w:footerReference w:type="default" r:id="rId45"/>
           <w:pgSz w:w="12240" w:h="15840"/>
           <w:pgMar w:top="2835" w:right="1701" w:bottom="1701" w:left="2268" w:header="720" w:footer="720" w:gutter="0"/>
           <w:cols w:space="720"/>
@@ -7775,7 +7777,7 @@
     <w:p>
       <w:pPr>
         <w:sectPr>
-          <w:footerReference w:type="default" r:id="rId44"/>
+          <w:footerReference w:type="default" r:id="rId46"/>
           <w:pgSz w:w="12240" w:h="15840"/>
           <w:pgMar w:top="2835" w:right="1701" w:bottom="1701" w:left="2268" w:header="720" w:footer="720" w:gutter="0"/>
           <w:cols w:space="720"/>
@@ -7828,7 +7830,7 @@
       </w:r>
     </w:p>
     <w:sectPr>
-      <w:footerReference w:type="default" r:id="rId45"/>
+      <w:footerReference w:type="default" r:id="rId47"/>
       <w:pgSz w:w="12240" w:h="15840"/>
       <w:pgMar w:top="2835" w:right="1701" w:bottom="1701" w:left="2268" w:header="720" w:footer="720" w:gutter="0"/>
       <w:cols w:space="720"/>
@@ -8051,7 +8053,7 @@
         <w:sz w:val="24"/>
       </w:rPr>
       <w:fldChar w:fldCharType="begin"/>
-      <w:instrText xml:space="preserve"> PAGE </w:instrText>
+      <w:instrText xml:space="preserve"> PAGE \* roman </w:instrText>
       <w:fldChar w:fldCharType="separate"/>
       <w:fldChar w:fldCharType="end"/>
     </w:r>
@@ -8082,7 +8084,7 @@
         <w:sz w:val="24"/>
       </w:rPr>
       <w:fldChar w:fldCharType="begin"/>
-      <w:instrText xml:space="preserve"> PAGE </w:instrText>
+      <w:instrText xml:space="preserve"> PAGE \* roman </w:instrText>
       <w:fldChar w:fldCharType="separate"/>
       <w:fldChar w:fldCharType="end"/>
     </w:r>
@@ -8405,6 +8407,48 @@
 </w:ftr>
 </file>
 
+<file path=word/footer35.xml><?xml version="1.0" encoding="utf-8"?>
+<w:ftr xmlns:m="http://schemas.openxmlformats.org/officeDocument/2006/math" xmlns:mc="http://schemas.openxmlformats.org/markup-compatibility/2006" xmlns:mo="http://schemas.microsoft.com/office/mac/office/2008/main" xmlns:mv="urn:schemas-microsoft-com:mac:vml" xmlns:o="urn:schemas-microsoft-com:office:office" xmlns:r="http://schemas.openxmlformats.org/officeDocument/2006/relationships" xmlns:v="urn:schemas-microsoft-com:vml" xmlns:w10="urn:schemas-microsoft-com:office:word" xmlns:w14="http://schemas.microsoft.com/office/word/2010/wordml" xmlns:w="http://schemas.openxmlformats.org/wordprocessingml/2006/main" xmlns:wne="http://schemas.microsoft.com/office/word/2006/wordml" xmlns:wp14="http://schemas.microsoft.com/office/word/2010/wordprocessingDrawing" xmlns:wp="http://schemas.openxmlformats.org/drawingml/2006/wordprocessingDrawing" xmlns:wpc="http://schemas.microsoft.com/office/word/2010/wordprocessingCanvas" xmlns:wpg="http://schemas.microsoft.com/office/word/2010/wordprocessingGroup" xmlns:wpi="http://schemas.microsoft.com/office/word/2010/wordprocessingInk" xmlns:wps="http://schemas.microsoft.com/office/word/2010/wordprocessingShape" mc:Ignorable="w14 wp14">
+  <w:p>
+    <w:pPr>
+      <w:pStyle w:val="Footer"/>
+      <w:jc w:val="center"/>
+    </w:pPr>
+    <w:r>
+      <w:rPr>
+        <w:rFonts w:ascii="Times New Roman" w:hAnsi="Times New Roman"/>
+        <w:sz w:val="24"/>
+      </w:rPr>
+      <w:fldChar w:fldCharType="begin"/>
+      <w:instrText xml:space="preserve"> PAGE </w:instrText>
+      <w:fldChar w:fldCharType="separate"/>
+      <w:fldChar w:fldCharType="end"/>
+    </w:r>
+  </w:p>
+</w:ftr>
+</file>
+
+<file path=word/footer36.xml><?xml version="1.0" encoding="utf-8"?>
+<w:ftr xmlns:m="http://schemas.openxmlformats.org/officeDocument/2006/math" xmlns:mc="http://schemas.openxmlformats.org/markup-compatibility/2006" xmlns:mo="http://schemas.microsoft.com/office/mac/office/2008/main" xmlns:mv="urn:schemas-microsoft-com:mac:vml" xmlns:o="urn:schemas-microsoft-com:office:office" xmlns:r="http://schemas.openxmlformats.org/officeDocument/2006/relationships" xmlns:v="urn:schemas-microsoft-com:vml" xmlns:w10="urn:schemas-microsoft-com:office:word" xmlns:w14="http://schemas.microsoft.com/office/word/2010/wordml" xmlns:w="http://schemas.openxmlformats.org/wordprocessingml/2006/main" xmlns:wne="http://schemas.microsoft.com/office/word/2006/wordml" xmlns:wp14="http://schemas.microsoft.com/office/word/2010/wordprocessingDrawing" xmlns:wp="http://schemas.openxmlformats.org/drawingml/2006/wordprocessingDrawing" xmlns:wpc="http://schemas.microsoft.com/office/word/2010/wordprocessingCanvas" xmlns:wpg="http://schemas.microsoft.com/office/word/2010/wordprocessingGroup" xmlns:wpi="http://schemas.microsoft.com/office/word/2010/wordprocessingInk" xmlns:wps="http://schemas.microsoft.com/office/word/2010/wordprocessingShape" mc:Ignorable="w14 wp14">
+  <w:p>
+    <w:pPr>
+      <w:pStyle w:val="Footer"/>
+      <w:jc w:val="center"/>
+    </w:pPr>
+    <w:r>
+      <w:rPr>
+        <w:rFonts w:ascii="Times New Roman" w:hAnsi="Times New Roman"/>
+        <w:sz w:val="24"/>
+      </w:rPr>
+      <w:fldChar w:fldCharType="begin"/>
+      <w:instrText xml:space="preserve"> PAGE </w:instrText>
+      <w:fldChar w:fldCharType="separate"/>
+      <w:fldChar w:fldCharType="end"/>
+    </w:r>
+  </w:p>
+</w:ftr>
+</file>
+
 <file path=word/footer4.xml><?xml version="1.0" encoding="utf-8"?>
 <w:ftr xmlns:m="http://schemas.openxmlformats.org/officeDocument/2006/math" xmlns:mc="http://schemas.openxmlformats.org/markup-compatibility/2006" xmlns:mo="http://schemas.microsoft.com/office/mac/office/2008/main" xmlns:mv="urn:schemas-microsoft-com:mac:vml" xmlns:o="urn:schemas-microsoft-com:office:office" xmlns:r="http://schemas.openxmlformats.org/officeDocument/2006/relationships" xmlns:v="urn:schemas-microsoft-com:vml" xmlns:w10="urn:schemas-microsoft-com:office:word" xmlns:w14="http://schemas.microsoft.com/office/word/2010/wordml" xmlns:w="http://schemas.openxmlformats.org/wordprocessingml/2006/main" xmlns:wne="http://schemas.microsoft.com/office/word/2006/wordml" xmlns:wp14="http://schemas.microsoft.com/office/word/2010/wordprocessingDrawing" xmlns:wp="http://schemas.openxmlformats.org/drawingml/2006/wordprocessingDrawing" xmlns:wpc="http://schemas.microsoft.com/office/word/2010/wordprocessingCanvas" xmlns:wpg="http://schemas.microsoft.com/office/word/2010/wordprocessingGroup" xmlns:wpi="http://schemas.microsoft.com/office/word/2010/wordprocessingInk" xmlns:wps="http://schemas.microsoft.com/office/word/2010/wordprocessingShape" mc:Ignorable="w14 wp14">
   <w:p>
@@ -8473,18 +8517,7 @@
   <w:p>
     <w:pPr>
       <w:pStyle w:val="Footer"/>
-      <w:jc w:val="center"/>
     </w:pPr>
-    <w:r>
-      <w:rPr>
-        <w:rFonts w:ascii="Times New Roman" w:hAnsi="Times New Roman"/>
-        <w:sz w:val="24"/>
-      </w:rPr>
-      <w:fldChar w:fldCharType="begin"/>
-      <w:instrText xml:space="preserve"> PAGE \* roman </w:instrText>
-      <w:fldChar w:fldCharType="separate"/>
-      <w:fldChar w:fldCharType="end"/>
-    </w:r>
   </w:p>
 </w:ftr>
 </file>
@@ -8494,18 +8527,7 @@
   <w:p>
     <w:pPr>
       <w:pStyle w:val="Footer"/>
-      <w:jc w:val="center"/>
     </w:pPr>
-    <w:r>
-      <w:rPr>
-        <w:rFonts w:ascii="Times New Roman" w:hAnsi="Times New Roman"/>
-        <w:sz w:val="24"/>
-      </w:rPr>
-      <w:fldChar w:fldCharType="begin"/>
-      <w:instrText xml:space="preserve"> PAGE \* roman </w:instrText>
-      <w:fldChar w:fldCharType="separate"/>
-      <w:fldChar w:fldCharType="end"/>
-    </w:r>
   </w:p>
 </w:ftr>
 </file>

</xml_diff>

<commit_message>
Fix sintaxis OBJETIVOS_ESPECIFICOS_EMPRESA en keidy
</commit_message>
<xml_diff>
--- a/keidy/reportes/Informe_Pasantia_IUTECP.docx
+++ b/keidy/reportes/Informe_Pasantia_IUTECP.docx
@@ -103,7 +103,7 @@
           <w:b/>
           <w:sz w:val="24"/>
         </w:rPr>
-        <w:t>PROPUESTA DE OPTIMIZACIÓN DEL PROCESO DE PROCURA EN EL DEPARTAMENTO ADMINISTRATIVO DE LUBRICANTES Y EQUIPOS VARYNA, C.A.</w:t>
+        <w:t>PROPUESTA DE SIMPLIFICACIÓN ADMINISTRATIVA DE LA PROCURA EN LUBRICANTES Y EQUIPOS VARYNA, C.A.</w:t>
       </w:r>
     </w:p>
     <w:p>
@@ -223,7 +223,7 @@
           <w:b/>
           <w:sz w:val="24"/>
         </w:rPr>
-        <w:t>PROPUESTA DE OPTIMIZACIÓN DEL PROCESO DE PROCURA EN EL DEPARTAMENTO ADMINISTRATIVO DE LUBRICANTES Y EQUIPOS VARYNA, C.A.</w:t>
+        <w:t>PROPUESTA DE SIMPLIFICACIÓN ADMINISTRATIVA DE LA PROCURA EN LUBRICANTES Y EQUIPOS VARYNA, C.A.</w:t>
       </w:r>
     </w:p>
     <w:p>
@@ -2535,6 +2535,41 @@
           <w:sz w:val="24"/>
         </w:rPr>
         <w:t>Ejecutar todo género de actividad o prestación de servicios relacionados directa o indirectamente con el ramo de las comunicaciones, computación y la electrónica en general; prestar servicios de importación, manufacturación, asesoría, ventas, instalaciones, arrendamientos, supervisión y mantenimiento en el área de telecomunicaciones; así como representar total o parcialmente cualquier producto comercial relacionado con sus operaciones mercantiles.</w:t>
+      </w:r>
+    </w:p>
+    <w:p>
+      <w:pPr>
+        <w:spacing w:before="480" w:after="480" w:line="360" w:lineRule="auto"/>
+        <w:jc w:val="left"/>
+      </w:pPr>
+      <w:r>
+        <w:rPr>
+          <w:rFonts w:ascii="Times New Roman" w:hAnsi="Times New Roman"/>
+          <w:b/>
+          <w:sz w:val="24"/>
+        </w:rPr>
+        <w:t>Objetivos Específicos</w:t>
+      </w:r>
+    </w:p>
+    <w:p>
+      <w:pPr>
+        <w:spacing w:line="360" w:lineRule="auto"/>
+        <w:ind w:firstLine="709"/>
+        <w:jc w:val="both"/>
+      </w:pPr>
+      <w:r>
+        <w:rPr>
+          <w:rFonts w:ascii="Times New Roman" w:hAnsi="Times New Roman"/>
+          <w:sz w:val="24"/>
+        </w:rPr>
+        <w:t xml:space="preserve">1. </w:t>
+      </w:r>
+      <w:r>
+        <w:rPr>
+          <w:rFonts w:ascii="Times New Roman" w:hAnsi="Times New Roman"/>
+          <w:sz w:val="24"/>
+        </w:rPr>
+        <w:t>Ejecutar todo género de actividad o prestación de servicios relacionados directa o indirectamente con el ramo de las comunicaciones, computación y la electrónica en general.Prestar servicios de importación, manufacturación, asesoría, ventas, instalaciones, arrendamientos, supervisión y mantenimiento en el área de telecomunicaciones.Representar total o parcialmente cualquier producto comercial relacionado con sus operaciones mercantiles.</w:t>
       </w:r>
     </w:p>
     <w:p>

</xml_diff>

<commit_message>
keidy contexto: departamento asistente administrativo
</commit_message>
<xml_diff>
--- a/keidy/reportes/Informe_Pasantia_IUTECP.docx
+++ b/keidy/reportes/Informe_Pasantia_IUTECP.docx
@@ -2569,7 +2569,49 @@
           <w:rFonts w:ascii="Times New Roman" w:hAnsi="Times New Roman"/>
           <w:sz w:val="24"/>
         </w:rPr>
-        <w:t>Ejecutar todo género de actividad o prestación de servicios relacionados directa o indirectamente con el ramo de las comunicaciones, computación y la electrónica en general.Prestar servicios de importación, manufacturación, asesoría, ventas, instalaciones, arrendamientos, supervisión y mantenimiento en el área de telecomunicaciones.Representar total o parcialmente cualquier producto comercial relacionado con sus operaciones mercantiles.</w:t>
+        <w:t>Ejecutar todo género de actividad o prestación de servicios relacionados directa o indirectamente con el ramo de las comunicaciones, computación y la electrónica en general.</w:t>
+      </w:r>
+    </w:p>
+    <w:p>
+      <w:pPr>
+        <w:spacing w:line="360" w:lineRule="auto"/>
+        <w:ind w:firstLine="709"/>
+        <w:jc w:val="both"/>
+      </w:pPr>
+      <w:r>
+        <w:rPr>
+          <w:rFonts w:ascii="Times New Roman" w:hAnsi="Times New Roman"/>
+          <w:sz w:val="24"/>
+        </w:rPr>
+        <w:t xml:space="preserve">2. </w:t>
+      </w:r>
+      <w:r>
+        <w:rPr>
+          <w:rFonts w:ascii="Times New Roman" w:hAnsi="Times New Roman"/>
+          <w:sz w:val="24"/>
+        </w:rPr>
+        <w:t>Prestar servicios de importación, manufacturación, asesoría, ventas, instalaciones, arrendamientos, supervisión y mantenimiento en el área de telecomunicaciones.</w:t>
+      </w:r>
+    </w:p>
+    <w:p>
+      <w:pPr>
+        <w:spacing w:line="360" w:lineRule="auto"/>
+        <w:ind w:firstLine="709"/>
+        <w:jc w:val="both"/>
+      </w:pPr>
+      <w:r>
+        <w:rPr>
+          <w:rFonts w:ascii="Times New Roman" w:hAnsi="Times New Roman"/>
+          <w:sz w:val="24"/>
+        </w:rPr>
+        <w:t xml:space="preserve">3. </w:t>
+      </w:r>
+      <w:r>
+        <w:rPr>
+          <w:rFonts w:ascii="Times New Roman" w:hAnsi="Times New Roman"/>
+          <w:sz w:val="24"/>
+        </w:rPr>
+        <w:t>Representar total o parcialmente cualquier producto comercial relacionado con sus operaciones mercantiles.</w:t>
       </w:r>
     </w:p>
     <w:p>

</xml_diff>

<commit_message>
Actualizar README con cambios recientes (portada, preliminares, subtitulos, objetivos)
</commit_message>
<xml_diff>
--- a/keidy/reportes/Informe_Pasantia_IUTECP.docx
+++ b/keidy/reportes/Informe_Pasantia_IUTECP.docx
@@ -2265,7 +2265,7 @@
           <w:i w:val="0"/>
           <w:sz w:val="24"/>
         </w:rPr>
-        <w:t>Lubricantes y Equipos Varyná C.A. es una empresa venezolana con más de treinta y seis (36) años de trayectoria en el sector petrolero, industrial y de construcción, consolidándose como una organización de amplia experiencia y reconocimiento dentro del mercado nacional. Desde sus inicios, la empresa ha orientado sus esfuerzos al desarrollo de soluciones integrales que contribuyan al fortalecimiento de las actividades productivas del país.</w:t>
+        <w:t>Lubricantes y Equipos Varyná, C.A. es una empresa venezolana fundada con la visión de responder a las crecientes demandas operativas e industriales del país. A lo largo de más de treinta y seis (36) años de trayectoria ininterrumpida, la organización se ha consolidado en el sector petrolero, industrial y de construcción, posicionándose como un aliado estratégico de alta confiabilidad en el mercado nacional gracias a su capacidad de respuesta y solvencia técnica.</w:t>
       </w:r>
     </w:p>
     <w:p>
@@ -2280,7 +2280,22 @@
           <w:i w:val="0"/>
           <w:sz w:val="24"/>
         </w:rPr>
-        <w:t>Como empresa integrante del Grupo Corporativo VTC, ha profesionalizado un crecimiento sostenido basado en la innovación, la calidad de sus servicios y el compromiso con sus clientes. Su actividad principal se enfoca en el procesamiento y suministro de productos químicos especializados, el tratamiento de crudo y la provisión de maquinaria pesada para operaciones industriales.</w:t>
+        <w:t>Desde sus primeros años de operaciones, la empresa enfocó su estrategia en la diversificación técnica de sus servicios, pasando de ser un proveedor local de insumos a una estructura corporativa especializada en el procesamiento y suministro de productos químicos de alto rendimiento, tratamiento químico de crudo y provisión de maquinaria pesada para proyectos de gran escala. Este desarrollo progresivo le permitió establecer estándares operacionales alineados con las exigencias de la industria energética regional y nacional.</w:t>
+      </w:r>
+    </w:p>
+    <w:p>
+      <w:pPr>
+        <w:spacing w:line="360" w:lineRule="auto" w:after="0" w:before="0"/>
+        <w:ind w:firstLine="709"/>
+        <w:jc w:val="both"/>
+      </w:pPr>
+      <w:r>
+        <w:rPr>
+          <w:rFonts w:ascii="Times New Roman" w:hAnsi="Times New Roman"/>
+          <w:i w:val="0"/>
+          <w:sz w:val="24"/>
+        </w:rPr>
+        <w:t>Su integración como parte fundamental del Grupo Corporativo VTC marcó un hito en su madurez organizacional, impulsando un crecimiento sostenido mediante la profesionalización de sus procesos, la adopción de tecnologías de vanguardia y la consolidación de alianzas comerciales de largo alcance. Hoy en día, Lubricantes y Equipos Varyná, C.A. mantiene su compromiso con el desarrollo productivo del país, sustentando su liderazgo en la innovación continua, la calidad de servicio y el fortalecimiento constante de su capital humano y capacidad logística.</w:t>
       </w:r>
     </w:p>
     <w:p>

</xml_diff>

<commit_message>
keidy: hilo conductor simplificacion (reemplazar optimizacion)
</commit_message>
<xml_diff>
--- a/keidy/reportes/Informe_Pasantia_IUTECP.docx
+++ b/keidy/reportes/Informe_Pasantia_IUTECP.docx
@@ -418,7 +418,7 @@
     </w:p>
     <w:p>
       <w:pPr>
-        <w:spacing w:line="360" w:lineRule="auto" w:after="120" w:before="0"/>
+        <w:spacing w:line="360" w:lineRule="auto" w:after="0" w:before="0"/>
         <w:ind w:firstLine="709"/>
         <w:jc w:val="both"/>
       </w:pPr>
@@ -474,7 +474,7 @@
     </w:p>
     <w:p>
       <w:pPr>
-        <w:spacing w:line="360" w:lineRule="auto" w:after="120" w:before="0"/>
+        <w:spacing w:line="360" w:lineRule="auto" w:after="0" w:before="0"/>
         <w:ind w:firstLine="709"/>
         <w:jc w:val="both"/>
       </w:pPr>
@@ -2053,7 +2053,7 @@
     </w:p>
     <w:p>
       <w:pPr>
-        <w:spacing w:line="360" w:lineRule="auto" w:after="120" w:before="0"/>
+        <w:spacing w:line="360" w:lineRule="auto" w:after="0" w:before="0"/>
         <w:ind w:firstLine="709"/>
         <w:jc w:val="both"/>
       </w:pPr>
@@ -2063,7 +2063,7 @@
           <w:i w:val="0"/>
           <w:sz w:val="24"/>
         </w:rPr>
-        <w:t>El presente informe describe la propuesta de optimización del proceso de procura en el departamento administrativo de Lubricantes y Equipos Varyna, C.A. La investigación se enmarca en la modalidad de proyecto factible apoyado en un diagnóstico de campo. Durante el estudio se identificó la ausencia de canales formalizados de recepción de requisiciones, tiempos de respuesta prolongados en las fases de cotización y aprobación, y la inexistencia de formatos estandarizados de control. La propuesta contempla un nuevo flujo de trabajo procedimental, plantillas estandarizadas de solicitud y orden de compra, y una matriz de autorización por monto, orientadas a fortalecer el control interno y agilizar el ciclo de adquisición de insumos y materiales.</w:t>
+        <w:t>El presente informe describe la propuesta de simplificación administrativa del proceso de procura en el departamento administrativo de Lubricantes y Equipos Varyna, C.A. La investigación se enmarca en la modalidad de proyecto factible apoyado en un diagnóstico de campo. Durante el estudio se identificó la ausencia de canales formalizados de recepción de requisiciones, tiempos de respuesta prolongados en las fases de cotización y aprobación, y la inexistencia de formatos estandarizados de control. La propuesta contempla un nuevo flujo de trabajo procedimental simplificado, plantillas estandarizadas de solicitud y orden de compra, y una matriz de autorización por monto, orientadas a fortalecer el control interno y agilizar el ciclo de adquisición de insumos y materiales.</w:t>
       </w:r>
     </w:p>
     <w:p/>
@@ -2078,7 +2078,7 @@
         <w:t xml:space="preserve">Palabras claves: </w:t>
       </w:r>
       <w:r>
-        <w:t>procura, optimización, proceso administrativo, proyecto factible, pasantías.</w:t>
+        <w:t>procura, simplificación administrativa, proceso administrativo, proyecto factible, pasantías.</w:t>
       </w:r>
     </w:p>
     <w:p>
@@ -2124,7 +2124,7 @@
     </w:p>
     <w:p>
       <w:pPr>
-        <w:spacing w:line="360" w:lineRule="auto" w:after="120" w:before="0"/>
+        <w:spacing w:line="360" w:lineRule="auto" w:after="0" w:before="0"/>
         <w:ind w:firstLine="709"/>
         <w:jc w:val="both"/>
       </w:pPr>
@@ -2134,7 +2134,7 @@
           <w:i w:val="0"/>
           <w:sz w:val="24"/>
         </w:rPr>
-        <w:t>La presente pasantía, desarrollada como requisito para optar al título de Técnico Superior Universitario en Administración, tiene como propósito proponer mejoras procedimentales para optimizar el proceso de procura en el departamento administrativo de Lubricantes y Equipos Varyna, C.A. La investigación parte del diagnóstico de las deficiencias actuales en el ciclo de adquisición de insumos y materiales, identificando los factores que generan retrasos operativos y debilidades en el control interno del departamento. El informe se estructura en cinco capítulos: el Capítulo I presenta la realidad organizacional de la empresa; el Capítulo II desarrolla el diagnóstico situacional y la planificación del proyecto; el Capítulo III sustenta las bases teóricas que orientan la propuesta; el Capítulo IV describe las actividades ejecutadas durante las diez semanas de pasantía; y el Capítulo V presenta las conclusiones y recomendaciones derivadas del proceso investigativo.</w:t>
+        <w:t>La presente pasantía, desarrollada como requisito para optar al título de Técnico Superior Universitario en Administración, tiene como propósito proponer la simplificación administrativa del proceso de procura en el departamento administrativo de Lubricantes y Equipos Varyna, C.A. La investigación parte del diagnóstico de las deficiencias actuales en el ciclo de adquisición de insumos y materiales, identificando los factores que generan retrasos operativos y complejidades innecesarias en el control interno del departamento. El informe se estructura en cinco capítulos: el Capítulo I presenta la realidad organizacional de la empresa; el Capítulo II desarrolla el diagnóstico situacional y la planificación del proyecto; el Capítulo III sustenta las bases teóricas que orientan la propuesta; el Capítulo IV describe las actividades ejecutadas durante las diez semanas de pasantía; y el Capítulo V presenta las conclusiones y recomendaciones derivadas del proceso investigativo.</w:t>
       </w:r>
     </w:p>
     <w:p>
@@ -2224,7 +2224,7 @@
     </w:p>
     <w:p>
       <w:pPr>
-        <w:spacing w:line="360" w:lineRule="auto" w:after="120" w:before="0"/>
+        <w:spacing w:line="360" w:lineRule="auto" w:after="0" w:before="0"/>
         <w:ind w:firstLine="0"/>
         <w:jc w:val="both"/>
       </w:pPr>
@@ -2255,7 +2255,7 @@
     </w:p>
     <w:p>
       <w:pPr>
-        <w:spacing w:line="360" w:lineRule="auto" w:after="120" w:before="0"/>
+        <w:spacing w:line="360" w:lineRule="auto" w:after="0" w:before="0"/>
         <w:ind w:firstLine="709"/>
         <w:jc w:val="both"/>
       </w:pPr>
@@ -2270,7 +2270,7 @@
     </w:p>
     <w:p>
       <w:pPr>
-        <w:spacing w:line="360" w:lineRule="auto" w:after="120" w:before="0"/>
+        <w:spacing w:line="360" w:lineRule="auto" w:after="0" w:before="0"/>
         <w:ind w:firstLine="709"/>
         <w:jc w:val="both"/>
       </w:pPr>
@@ -2285,7 +2285,7 @@
     </w:p>
     <w:p>
       <w:pPr>
-        <w:spacing w:line="360" w:lineRule="auto" w:after="120" w:before="0"/>
+        <w:spacing w:line="360" w:lineRule="auto" w:after="0" w:before="0"/>
         <w:ind w:firstLine="709"/>
         <w:jc w:val="both"/>
       </w:pPr>
@@ -2316,7 +2316,7 @@
     </w:p>
     <w:p>
       <w:pPr>
-        <w:spacing w:line="360" w:lineRule="auto" w:after="120" w:before="0"/>
+        <w:spacing w:line="360" w:lineRule="auto" w:after="0" w:before="0"/>
         <w:ind w:firstLine="709"/>
         <w:jc w:val="both"/>
       </w:pPr>
@@ -2347,7 +2347,7 @@
     </w:p>
     <w:p>
       <w:pPr>
-        <w:spacing w:line="360" w:lineRule="auto" w:after="120" w:before="0"/>
+        <w:spacing w:line="360" w:lineRule="auto" w:after="0" w:before="0"/>
         <w:ind w:firstLine="709"/>
         <w:jc w:val="both"/>
       </w:pPr>
@@ -2378,7 +2378,7 @@
     </w:p>
     <w:p>
       <w:pPr>
-        <w:spacing w:line="360" w:lineRule="auto" w:after="120" w:before="0"/>
+        <w:spacing w:line="360" w:lineRule="auto" w:after="0" w:before="0"/>
         <w:ind w:firstLine="709"/>
         <w:jc w:val="both"/>
       </w:pPr>
@@ -2539,7 +2539,7 @@
     </w:p>
     <w:p>
       <w:pPr>
-        <w:spacing w:line="360" w:lineRule="auto" w:after="120" w:before="0"/>
+        <w:spacing w:line="360" w:lineRule="auto" w:after="0" w:before="0"/>
         <w:ind w:firstLine="709"/>
         <w:jc w:val="both"/>
       </w:pPr>
@@ -2549,7 +2549,7 @@
           <w:i w:val="0"/>
           <w:sz w:val="24"/>
         </w:rPr>
-        <w:t>Ejecutar todo género de actividad o prestación de servicios relacionados directa o indirectamente con el ramo de las comunicaciones, computación y la electrónica en general; prestar servicios de importación, manufacturación, asesoría, ventas, instalaciones, arrendamientos, supervisión y mantenimiento en el área de telecomunicaciones; así como representar total o parcialmente cualquier producto comercial relacionado con sus operaciones mercantiles.</w:t>
+        <w:t>Posicionarse como una empresa líder en el sector petrolero, industrial y de construcción a nivel nacional, garantizando la provisión oportuna de productos químicos especializados, tratamiento de crudo y maquinaria pesada, mediante una gestión administrativa, operacional y de procura transparente, eficiente y orientada a la calidad total.</w:t>
       </w:r>
     </w:p>
     <w:p>
@@ -2584,7 +2584,7 @@
           <w:rFonts w:ascii="Times New Roman" w:hAnsi="Times New Roman"/>
           <w:sz w:val="24"/>
         </w:rPr>
-        <w:t>Ejecutar todo género de actividad o prestación de servicios relacionados directa o indirectamente con el ramo de las comunicaciones, computación y la electrónica en general.</w:t>
+        <w:t>Proporcionar soluciones eficientes y oportunas a las necesidades de sus clientes.</w:t>
       </w:r>
     </w:p>
     <w:p>
@@ -2605,7 +2605,7 @@
           <w:rFonts w:ascii="Times New Roman" w:hAnsi="Times New Roman"/>
           <w:sz w:val="24"/>
         </w:rPr>
-        <w:t>Prestar servicios de importación, manufacturación, asesoría, ventas, instalaciones, arrendamientos, supervisión y mantenimiento en el área de telecomunicaciones.</w:t>
+        <w:t>Mantener altos estándares de calidad en los productos y servicios ofrecidos.</w:t>
       </w:r>
     </w:p>
     <w:p>
@@ -2626,7 +2626,7 @@
           <w:rFonts w:ascii="Times New Roman" w:hAnsi="Times New Roman"/>
           <w:sz w:val="24"/>
         </w:rPr>
-        <w:t>Representar total o parcialmente cualquier producto comercial relacionado con sus operaciones mercantiles.</w:t>
+        <w:t>Asegurar el abastecimiento continuo y eficiente de insumos mediante una gestión administrativa transparente.</w:t>
       </w:r>
     </w:p>
     <w:p>
@@ -2647,7 +2647,7 @@
     </w:p>
     <w:p>
       <w:pPr>
-        <w:spacing w:line="360" w:lineRule="auto" w:after="120" w:before="0"/>
+        <w:spacing w:line="360" w:lineRule="auto" w:after="0" w:before="0"/>
         <w:ind w:firstLine="0"/>
         <w:jc w:val="both"/>
       </w:pPr>
@@ -2742,7 +2742,7 @@
     </w:p>
     <w:p>
       <w:pPr>
-        <w:spacing w:line="360" w:lineRule="auto" w:after="120" w:before="0"/>
+        <w:spacing w:line="360" w:lineRule="auto" w:after="0" w:before="0"/>
         <w:ind w:firstLine="709"/>
         <w:jc w:val="both"/>
       </w:pPr>
@@ -2773,7 +2773,7 @@
     </w:p>
     <w:p>
       <w:pPr>
-        <w:spacing w:line="360" w:lineRule="auto" w:after="120" w:before="0"/>
+        <w:spacing w:line="360" w:lineRule="auto" w:after="0" w:before="0"/>
         <w:ind w:firstLine="709"/>
         <w:jc w:val="both"/>
       </w:pPr>
@@ -2923,7 +2923,7 @@
     </w:p>
     <w:p>
       <w:pPr>
-        <w:spacing w:line="360" w:lineRule="auto" w:after="120" w:before="0"/>
+        <w:spacing w:line="360" w:lineRule="auto" w:after="0" w:before="0"/>
         <w:ind w:firstLine="709"/>
         <w:jc w:val="both"/>
       </w:pPr>
@@ -2933,12 +2933,12 @@
           <w:i w:val="0"/>
           <w:sz w:val="24"/>
         </w:rPr>
-        <w:t>En el departamento administrativo de Lubricantes y Equipos Varyna, C.A., se ha identificado una situación desfavorable relacionada con el control y flujo procedimental de la procura. En la actualidad, las solicitudes de compras de materiales e insumos críticos presentan marcados retrasos debido a la ausencia de un canal formalizado de recepción, lo que ocasiona que las requisiciones no sigan una ruta clara de procesamiento.</w:t>
+        <w:t>En el departamento administrativo de Lubricantes y Equipos Varyna, C.A., se ha identificado una situación desfavorable relacionada con la complejidad y dispersión del flujo procedimental de la procura. En la actualidad, las solicitudes de compras de materiales e insumos críticos presentan marcados retrasos debido a la ausencia de un canal formalizado de recepción, lo que ocasiona que las requisiciones no sigan una ruta clara ni simplificada de procesamiento.</w:t>
       </w:r>
     </w:p>
     <w:p>
       <w:pPr>
-        <w:spacing w:line="360" w:lineRule="auto" w:after="120" w:before="0"/>
+        <w:spacing w:line="360" w:lineRule="auto" w:after="0" w:before="0"/>
         <w:ind w:firstLine="709"/>
         <w:jc w:val="both"/>
       </w:pPr>
@@ -2948,7 +2948,7 @@
           <w:i w:val="0"/>
           <w:sz w:val="24"/>
         </w:rPr>
-        <w:t>Esta falta de estandarización administrativa genera cuellos de botella en las instancias de aprobación, pérdida de trazabilidad en el seguimiento de las cotizaciones y tiempos prolongados para la adquisición definitiva de los insumos. Como consecuencia directa, se producen retrasos logísticos en las obras operativas y una sobrecarga de funciones correctivas en el personal de compras, haciendo necesaria una propuesta de optimización procedimental adaptada a los estándares organizacionales vigentes.</w:t>
+        <w:t>Esta falta de estandarización y simplificación administrativa genera cuellos de botella en las instancias de aprobación, pérdida de trazabilidad en el seguimiento de las cotizaciones y tiempos prolongados para la adquisición definitiva de los insumos. Como consecuencia directa, se producen retrasos logísticos en las obras operativas y una sobrecarga de funciones correctivas en el personal de compras, haciendo necesaria una propuesta de simplificación procedimental adaptada a los estándares organizacionales vigentes.</w:t>
       </w:r>
     </w:p>
     <w:p>
@@ -2969,7 +2969,7 @@
     </w:p>
     <w:p>
       <w:pPr>
-        <w:spacing w:line="360" w:lineRule="auto" w:after="120" w:before="0"/>
+        <w:spacing w:line="360" w:lineRule="auto" w:after="0" w:before="0"/>
         <w:ind w:firstLine="709"/>
         <w:jc w:val="both"/>
       </w:pPr>
@@ -2979,7 +2979,7 @@
           <w:i w:val="0"/>
           <w:sz w:val="24"/>
         </w:rPr>
-        <w:t>Proponer mejoras procedimentales para optimizar el proceso de procura en el departamento administrativo de Lubricantes y Equipos Varyna, C.A., con la finalidad de agilizar los tiempos de adquisición y fortalecer el control interno de las operaciones de compras.</w:t>
+        <w:t>Proponer la simplificación administrativa del proceso de procura en el departamento administrativo de Lubricantes y Equipos Varyna, C.A., con la finalidad de reducir la complejidad procedimental, agilizar los tiempos de adquisición y fortalecer el control interno de las operaciones de compras.</w:t>
       </w:r>
     </w:p>
     <w:p>
@@ -3016,7 +3016,7 @@
           <w:rFonts w:ascii="Times New Roman" w:hAnsi="Times New Roman"/>
           <w:sz w:val="24"/>
         </w:rPr>
-        <w:t>Diagnosticar el proceso actual de procura en el departamento administrativo de la empresa para identificar el flujo secuencial de las solicitudes de compra.</w:t>
+        <w:t>Diagnosticar el proceso actual de procura en el departamento administrativo de la empresa para identificar los pasos y procedimientos susceptibles de simplificación.</w:t>
       </w:r>
     </w:p>
     <w:p>
@@ -3037,7 +3037,7 @@
           <w:rFonts w:ascii="Times New Roman" w:hAnsi="Times New Roman"/>
           <w:sz w:val="24"/>
         </w:rPr>
-        <w:t>Identificar las debilidades y cuellos de botella presentes en las fases de seguimiento, cotización y aprobación de las adquisiciones.</w:t>
+        <w:t>Identificar las complejidades, redundancias y cuellos de botella presentes en las fases de seguimiento, cotización y aprobación de las adquisiciones.</w:t>
       </w:r>
     </w:p>
     <w:p>
@@ -3058,7 +3058,7 @@
           <w:rFonts w:ascii="Times New Roman" w:hAnsi="Times New Roman"/>
           <w:sz w:val="24"/>
         </w:rPr>
-        <w:t>Analizar las causas organizativas que generan retrasos y tiempos prolongados en el ciclo de adquisición de insumos y materiales.</w:t>
+        <w:t>Analizar las causas organizativas que generan retrasos y procedimientos innecesariamente complejos en el ciclo de adquisición de insumos y materiales.</w:t>
       </w:r>
     </w:p>
     <w:p>
@@ -3079,7 +3079,7 @@
           <w:rFonts w:ascii="Times New Roman" w:hAnsi="Times New Roman"/>
           <w:sz w:val="24"/>
         </w:rPr>
-        <w:t>Diseñar una propuesta de mejora procedimental que agilice los tiempos de respuesta y optimice el control de la procura en el área administrativa.</w:t>
+        <w:t>Diseñar una propuesta de simplificación administrativa que reduzca los pasos procedimentales, agilice los tiempos de respuesta y optimice el control de la procura en el área administrativa.</w:t>
       </w:r>
     </w:p>
     <w:p>
@@ -3100,7 +3100,7 @@
     </w:p>
     <w:p>
       <w:pPr>
-        <w:spacing w:line="360" w:lineRule="auto" w:after="120" w:before="0"/>
+        <w:spacing w:line="360" w:lineRule="auto" w:after="0" w:before="0"/>
         <w:ind w:firstLine="709"/>
         <w:jc w:val="both"/>
       </w:pPr>
@@ -3110,7 +3110,7 @@
           <w:i w:val="0"/>
           <w:sz w:val="24"/>
         </w:rPr>
-        <w:t>La planificación establece la relación entre cada objetivo específico y las actividades técnicas a ejecutar para el desarrollo de la propuesta de optimización:</w:t>
+        <w:t>La planificación establece la relación entre cada objetivo específico y las actividades técnicas a ejecutar para el desarrollo de la propuesta de simplificación administrativa:</w:t>
       </w:r>
     </w:p>
     <w:p>
@@ -3254,7 +3254,7 @@
                 <w:color w:val="000000"/>
                 <w:sz w:val="20"/>
               </w:rPr>
-              <w:t>Diagnosticar el proceso actual de procura en el departamento administrativo.</w:t>
+              <w:t>Diagnosticar el proceso actual de procura e identificar los pasos susceptibles de simplificación.</w:t>
             </w:r>
           </w:p>
         </w:tc>
@@ -3340,7 +3340,7 @@
                 <w:color w:val="000000"/>
                 <w:sz w:val="20"/>
               </w:rPr>
-              <w:t>Identificar las debilidades y cuellos de botella en el seguimiento y aprobación.</w:t>
+              <w:t>Identificar complejidades, redundancias y cuellos de botella en el seguimiento y aprobación.</w:t>
             </w:r>
           </w:p>
         </w:tc>
@@ -3361,7 +3361,7 @@
                 <w:color w:val="000000"/>
                 <w:sz w:val="20"/>
               </w:rPr>
-              <w:t>Revisión y análisis de los tiempos promedio de respuesta en expedientes de compras anteriores y detección de fases críticas.</w:t>
+              <w:t>Revisión y análisis de los tiempos promedio de respuesta en expedientes de compras anteriores y detección de fases críticas y pasos duplicados.</w:t>
             </w:r>
           </w:p>
         </w:tc>
@@ -3403,7 +3403,7 @@
                 <w:color w:val="000000"/>
                 <w:sz w:val="20"/>
               </w:rPr>
-              <w:t>Matriz de criticidad con los puntos de retraso documental identificados.</w:t>
+              <w:t>Matriz de criticidad con los puntos de complejidad y retraso documental identificados.</w:t>
             </w:r>
           </w:p>
         </w:tc>
@@ -3426,7 +3426,7 @@
                 <w:color w:val="000000"/>
                 <w:sz w:val="20"/>
               </w:rPr>
-              <w:t>Analizar las causas organizativas que generan retrasos en la adquisición.</w:t>
+              <w:t>Analizar las causas organizativas que generan procedimientos innecesariamente complejos.</w:t>
             </w:r>
           </w:p>
         </w:tc>
@@ -3447,7 +3447,7 @@
                 <w:color w:val="000000"/>
                 <w:sz w:val="20"/>
               </w:rPr>
-              <w:t>Clasificación analítica de los factores determinantes de las demoras mediante mesas de trabajo técnica con la administración.</w:t>
+              <w:t>Clasificación analítica de los factores determinantes de las demoras y redundancias mediante mesas de trabajo técnica con la administración.</w:t>
             </w:r>
           </w:p>
         </w:tc>
@@ -3489,7 +3489,7 @@
                 <w:color w:val="000000"/>
                 <w:sz w:val="20"/>
               </w:rPr>
-              <w:t>Informe analítico con la jerarquización de las causas raíz de las demoras.</w:t>
+              <w:t>Informe analítico con la jerarquización de las causas raíz de la complejidad procedimental.</w:t>
             </w:r>
           </w:p>
         </w:tc>
@@ -3512,7 +3512,7 @@
                 <w:color w:val="000000"/>
                 <w:sz w:val="20"/>
               </w:rPr>
-              <w:t>Diseñar una propuesta de mejora procedimental para el control de la procura.</w:t>
+              <w:t>Diseñar una propuesta de simplificación administrativa para el control de la procura.</w:t>
             </w:r>
           </w:p>
         </w:tc>
@@ -3533,7 +3533,7 @@
                 <w:color w:val="000000"/>
                 <w:sz w:val="20"/>
               </w:rPr>
-              <w:t>Redacción del nuevo flujo de trabajo optimizado, asignación formal de roles y diseño de plantillas estandarizadas para cotizaciones.</w:t>
+              <w:t>Redacción del nuevo flujo de trabajo simplificado, asignación formal de roles y diseño de plantillas estandarizadas para cotizaciones.</w:t>
             </w:r>
           </w:p>
         </w:tc>
@@ -3575,7 +3575,7 @@
                 <w:color w:val="000000"/>
                 <w:sz w:val="20"/>
               </w:rPr>
-              <w:t>Propuesta metodológica de optimización de procura formulada y validada.</w:t>
+              <w:t>Propuesta de simplificación administrativa de la procura formulada y validada.</w:t>
             </w:r>
           </w:p>
         </w:tc>
@@ -3600,7 +3600,7 @@
     </w:p>
     <w:p>
       <w:pPr>
-        <w:spacing w:line="360" w:lineRule="auto" w:after="120" w:before="0"/>
+        <w:spacing w:line="360" w:lineRule="auto" w:after="0" w:before="0"/>
         <w:ind w:firstLine="709"/>
         <w:jc w:val="both"/>
       </w:pPr>
@@ -6214,7 +6214,7 @@
     </w:p>
     <w:p>
       <w:pPr>
-        <w:spacing w:line="360" w:lineRule="auto" w:after="120" w:before="0"/>
+        <w:spacing w:line="360" w:lineRule="auto" w:after="0" w:before="0"/>
         <w:ind w:firstLine="709"/>
         <w:jc w:val="both"/>
       </w:pPr>
@@ -6229,7 +6229,7 @@
     </w:p>
     <w:p>
       <w:pPr>
-        <w:spacing w:line="360" w:lineRule="auto" w:after="120" w:before="0"/>
+        <w:spacing w:line="360" w:lineRule="auto" w:after="0" w:before="0"/>
         <w:ind w:firstLine="709"/>
         <w:jc w:val="both"/>
       </w:pPr>
@@ -6265,7 +6265,7 @@
     </w:p>
     <w:p>
       <w:pPr>
-        <w:spacing w:line="360" w:lineRule="auto" w:after="120" w:before="0"/>
+        <w:spacing w:line="360" w:lineRule="auto" w:after="0" w:before="0"/>
         <w:ind w:firstLine="709"/>
         <w:jc w:val="both"/>
       </w:pPr>
@@ -6294,7 +6294,7 @@
     </w:p>
     <w:p>
       <w:pPr>
-        <w:spacing w:line="360" w:lineRule="auto" w:after="120" w:before="0"/>
+        <w:spacing w:line="360" w:lineRule="auto" w:after="0" w:before="0"/>
         <w:ind w:firstLine="709"/>
         <w:jc w:val="both"/>
       </w:pPr>
@@ -6309,7 +6309,7 @@
     </w:p>
     <w:p>
       <w:pPr>
-        <w:spacing w:line="360" w:lineRule="auto" w:after="120" w:before="0"/>
+        <w:spacing w:line="360" w:lineRule="auto" w:after="0" w:before="0"/>
         <w:ind w:firstLine="709"/>
         <w:jc w:val="both"/>
       </w:pPr>
@@ -6338,7 +6338,7 @@
     </w:p>
     <w:p>
       <w:pPr>
-        <w:spacing w:line="360" w:lineRule="auto" w:after="120" w:before="0"/>
+        <w:spacing w:line="360" w:lineRule="auto" w:after="0" w:before="0"/>
         <w:ind w:firstLine="709"/>
         <w:jc w:val="both"/>
       </w:pPr>
@@ -6353,7 +6353,7 @@
     </w:p>
     <w:p>
       <w:pPr>
-        <w:spacing w:line="360" w:lineRule="auto" w:after="120" w:before="0"/>
+        <w:spacing w:line="360" w:lineRule="auto" w:after="0" w:before="0"/>
         <w:ind w:firstLine="709"/>
         <w:jc w:val="both"/>
       </w:pPr>
@@ -6377,12 +6377,12 @@
           <w:b/>
           <w:sz w:val="24"/>
         </w:rPr>
-        <w:t>Optimización de Procesos Organizacionales</w:t>
+        <w:t>Simplificación Administrativa de Procesos</w:t>
       </w:r>
     </w:p>
     <w:p>
       <w:pPr>
-        <w:spacing w:line="360" w:lineRule="auto" w:after="120" w:before="0"/>
+        <w:spacing w:line="360" w:lineRule="auto" w:after="0" w:before="0"/>
         <w:ind w:firstLine="709"/>
         <w:jc w:val="both"/>
       </w:pPr>
@@ -6392,12 +6392,12 @@
           <w:i w:val="0"/>
           <w:sz w:val="24"/>
         </w:rPr>
-        <w:t>La optimización de procesos organizacionales consiste en el análisis sistemático de los flujos de trabajo existentes con el propósito de identificar ineficiencias, eliminar pasos redundantes y rediseñar los procedimientos para lograr los mismos resultados con menor consumo de tiempo y recursos. Según Harrington (1993), un proceso optimizado debe ser simple, medible, controlable y adaptable a las variaciones del entorno operativo.</w:t>
+        <w:t>La simplificación administrativa consiste en la revisión sistemática y el rediseño de los procedimientos organizacionales con el propósito de eliminar pasos innecesarios, reducir la burocracia interna y facilitar la ejecución ágil de las operaciones. Según Harrington (1993), un proceso simplificado debe ser comprensible para todos los actores involucrados, ejecutable con el menor número de pasos posible y orientado a resultados medibles y verificables.</w:t>
       </w:r>
     </w:p>
     <w:p>
       <w:pPr>
-        <w:spacing w:line="360" w:lineRule="auto" w:after="120" w:before="0"/>
+        <w:spacing w:line="360" w:lineRule="auto" w:after="0" w:before="0"/>
         <w:ind w:firstLine="709"/>
         <w:jc w:val="both"/>
       </w:pPr>
@@ -6407,7 +6407,7 @@
           <w:i w:val="0"/>
           <w:sz w:val="24"/>
         </w:rPr>
-        <w:t>En el ámbito de la administración de compras, la optimización procedimental se traduce en la reducción de los ciclos de aprobación, la estandarización de los formatos de cotización y la clarificación de los roles y responsabilidades de cada actor. El resultado esperado es una disminución verificable de los tiempos de respuesta en la adquisición de insumos y una mejora en la capacidad de la organización para anticipar sus necesidades de abastecimiento.</w:t>
+        <w:t>En el ámbito de la administración de compras, la simplificación procedimental se traduce en la reducción de los ciclos de aprobación, la unificación de los formatos de cotización y la clarificación de los roles y responsabilidades de cada actor. El resultado esperado es una disminución verificable de los tiempos de respuesta en la adquisición de insumos y una mayor capacidad de la organización para atender sus necesidades de abastecimiento de forma oportuna y transparente.</w:t>
       </w:r>
     </w:p>
     <w:p>
@@ -6426,7 +6426,7 @@
     </w:p>
     <w:p>
       <w:pPr>
-        <w:spacing w:line="360" w:lineRule="auto" w:after="120" w:before="0"/>
+        <w:spacing w:line="360" w:lineRule="auto" w:after="0" w:before="0"/>
         <w:ind w:firstLine="709"/>
         <w:jc w:val="both"/>
       </w:pPr>
@@ -6441,7 +6441,7 @@
     </w:p>
     <w:p>
       <w:pPr>
-        <w:spacing w:line="360" w:lineRule="auto" w:after="120" w:before="0"/>
+        <w:spacing w:line="360" w:lineRule="auto" w:after="0" w:before="0"/>
         <w:ind w:firstLine="709"/>
         <w:jc w:val="both"/>
       </w:pPr>
@@ -6527,7 +6527,7 @@
     </w:p>
     <w:p>
       <w:pPr>
-        <w:spacing w:line="360" w:lineRule="auto" w:after="120" w:before="0"/>
+        <w:spacing w:line="360" w:lineRule="auto" w:after="0" w:before="0"/>
         <w:ind w:firstLine="709"/>
         <w:jc w:val="both"/>
       </w:pPr>
@@ -6537,7 +6537,7 @@
           <w:i w:val="0"/>
           <w:sz w:val="24"/>
         </w:rPr>
-        <w:t>Durante las diez (10) semanas de práctica profesional, se ejecutaron fases sucesivas de diagnóstico, análisis y diseño de la propuesta de optimización:</w:t>
+        <w:t>Durante las diez (10) semanas de práctica profesional, se ejecutaron fases sucesivas de diagnóstico, análisis y diseño de la propuesta de simplificación administrativa:</w:t>
       </w:r>
     </w:p>
     <w:p>
@@ -6609,7 +6609,7 @@
           <w:rFonts w:ascii="Times New Roman" w:hAnsi="Times New Roman"/>
           <w:sz w:val="24"/>
         </w:rPr>
-        <w:t>Observación directa del flujo procedimental de las solicitudes de compra, identificación preliminar de las etapas del ciclo de procura y formulación inicial de la situación problemática.</w:t>
+        <w:t>Observación directa del flujo procedimental de las solicitudes de compra, identificación preliminar de las etapas del ciclo de procura y formulación inicial de la situación problemática en términos de complejidad administrativa.</w:t>
       </w:r>
     </w:p>
     <w:p>
@@ -6969,7 +6969,7 @@
           <w:rFonts w:ascii="Times New Roman" w:hAnsi="Times New Roman"/>
           <w:sz w:val="24"/>
         </w:rPr>
-        <w:t>Diseño del nuevo flujo de trabajo optimizado para el proceso de procura, con definición de los puntos de control, los responsables de cada etapa y los tiempos máximos de respuesta por fase.</w:t>
+        <w:t>Diseño del nuevo flujo de trabajo simplificado para el proceso de procura, con reducción de pasos, definición de puntos de control, responsables de cada etapa y tiempos máximos de respuesta por fase.</w:t>
       </w:r>
     </w:p>
     <w:p>
@@ -7113,7 +7113,7 @@
           <w:rFonts w:ascii="Times New Roman" w:hAnsi="Times New Roman"/>
           <w:sz w:val="24"/>
         </w:rPr>
-        <w:t>Redacción del documento de propuesta de optimización procedimental, integrando el nuevo flujo, los formatos diseñados y las recomendaciones de mejora de control interno.</w:t>
+        <w:t>Redacción del documento de propuesta de simplificación administrativa, integrando el nuevo flujo simplificado, los formatos diseñados y las recomendaciones de mejora de control interno.</w:t>
       </w:r>
     </w:p>
     <w:p>
@@ -7185,7 +7185,7 @@
           <w:rFonts w:ascii="Times New Roman" w:hAnsi="Times New Roman"/>
           <w:sz w:val="24"/>
         </w:rPr>
-        <w:t>Validación de la propuesta con el tutor industrial, incorporación de observaciones y ajustes al documento final de optimización procedimental para su presentación formal.</w:t>
+        <w:t>Validación de la propuesta de simplificación con el tutor industrial, incorporación de observaciones y ajustes al documento final para su presentación formal.</w:t>
       </w:r>
     </w:p>
     <w:p>
@@ -7349,7 +7349,7 @@
           <w:rFonts w:ascii="Times New Roman" w:hAnsi="Times New Roman"/>
           <w:sz w:val="24"/>
         </w:rPr>
-        <w:t>Se diagnosticó que el proceso actual de procura carece de una ruta formalizada de procesamiento de solicitudes, lo que genera que las requisiciones no sigan un canal claro desde su origen hasta la orden de compra, prolongando los tiempos de respuesta y dificultando el seguimiento de cada adquisición.</w:t>
+        <w:t>Se diagnosticó que el proceso actual de procura carece de una ruta simplificada de procesamiento de solicitudes, lo que genera que las requisiciones no sigan un canal claro desde su origen hasta la orden de compra, prolongando los tiempos de respuesta y dificultando el seguimiento de cada adquisición.</w:t>
       </w:r>
     </w:p>
     <w:p>
@@ -7370,7 +7370,7 @@
           <w:rFonts w:ascii="Times New Roman" w:hAnsi="Times New Roman"/>
           <w:sz w:val="24"/>
         </w:rPr>
-        <w:t>Se identificaron como principales cuellos de botella la ausencia de formatos estandarizados de solicitud, la falta de niveles de autorización definidos por monto y la inexistencia de un mecanismo de seguimiento del estatus de cotizaciones, concentrando la carga operativa en pocos actores del proceso.</w:t>
+        <w:t>Se identificaron como principales complejidades y cuellos de botella la ausencia de formatos estandarizados de solicitud, la falta de niveles de autorización definidos por monto y la inexistencia de un mecanismo ágil de seguimiento del estatus de cotizaciones, concentrando la carga operativa en pocos actores del proceso.</w:t>
       </w:r>
     </w:p>
     <w:p>
@@ -7391,7 +7391,7 @@
           <w:rFonts w:ascii="Times New Roman" w:hAnsi="Times New Roman"/>
           <w:sz w:val="24"/>
         </w:rPr>
-        <w:t>Se determinó que las causas organizativas de los retrasos en el ciclo de adquisición responden a la ausencia de procedimientos escritos, la dispersión de responsabilidades y la inexistencia de indicadores que permitan medir el desempeño del proceso de compras.</w:t>
+        <w:t>Se determinó que las causas organizativas de los retrasos en el ciclo de adquisición responden a la ausencia de procedimientos escritos simplificados, la dispersión de responsabilidades y la inexistencia de indicadores que permitan medir el desempeño del proceso de compras.</w:t>
       </w:r>
     </w:p>
     <w:p>
@@ -7412,7 +7412,7 @@
           <w:rFonts w:ascii="Times New Roman" w:hAnsi="Times New Roman"/>
           <w:sz w:val="24"/>
         </w:rPr>
-        <w:t>Se diseñó una propuesta de mejora procedimental que contempla un nuevo flujo de trabajo con puntos de control definidos, plantillas estandarizadas de cotización y orden de compra, y una matriz de autorización por monto, herramientas que en conjunto fortalecen el control interno y agilizar el ciclo de adquisición.</w:t>
+        <w:t>Se diseñó una propuesta de simplificación administrativa que contempla un nuevo flujo de trabajo con menor número de pasos y puntos de control definidos, plantillas estandarizadas de cotización y orden de compra, y una matriz de autorización por monto, herramientas que en conjunto fortalecen el control interno y agilizan el ciclo de adquisición.</w:t>
       </w:r>
     </w:p>
     <w:p>
@@ -7449,7 +7449,7 @@
           <w:rFonts w:ascii="Times New Roman" w:hAnsi="Times New Roman"/>
           <w:sz w:val="24"/>
         </w:rPr>
-        <w:t>Implementar el nuevo flujo de trabajo propuesto de forma gradual, comenzando por la formalización del canal de recepción de requisiciones y la adopción de las plantillas estandarizadas de solicitud de cotización y orden de compra.</w:t>
+        <w:t>Implementar el nuevo flujo simplificado de forma gradual, comenzando por la formalización del canal de recepción de requisiciones y la adopción de las plantillas estandarizadas de solicitud de cotización y orden de compra.</w:t>
       </w:r>
     </w:p>
     <w:p>
@@ -7470,7 +7470,7 @@
           <w:rFonts w:ascii="Times New Roman" w:hAnsi="Times New Roman"/>
           <w:sz w:val="24"/>
         </w:rPr>
-        <w:t>Socializar el manual de procedimientos de procura con todo el personal involucrado en el ciclo de compras, garantizando que cada actor conozca sus responsabilidades y los tiempos máximos de respuesta establecidos para cada fase.</w:t>
+        <w:t>Socializar el manual de procedimientos simplificados de procura con todo el personal involucrado en el ciclo de compras, garantizando que cada actor conozca sus responsabilidades y los tiempos máximos de respuesta establecidos para cada fase.</w:t>
       </w:r>
     </w:p>
     <w:p>
@@ -7512,7 +7512,7 @@
           <w:rFonts w:ascii="Times New Roman" w:hAnsi="Times New Roman"/>
           <w:sz w:val="24"/>
         </w:rPr>
-        <w:t>Revisar y actualizar el procedimiento optimizado al menos una vez al año, incorporando las lecciones aprendidas durante su ejecución y los cambios en las condiciones operativas o normativas de la organización.</w:t>
+        <w:t>Revisar y actualizar el procedimiento simplificado al menos una vez al año, incorporando las lecciones aprendidas durante su ejecución y los cambios en las condiciones operativas o normativas de la organización.</w:t>
       </w:r>
     </w:p>
     <w:p>

</xml_diff>

<commit_message>
keidy: poblacion 42 trabajadores con tabla y descripcion de departamentos
</commit_message>
<xml_diff>
--- a/keidy/reportes/Informe_Pasantia_IUTECP.docx
+++ b/keidy/reportes/Informe_Pasantia_IUTECP.docx
@@ -2454,7 +2454,319 @@
           <w:i w:val="0"/>
           <w:sz w:val="24"/>
         </w:rPr>
-        <w:t>La población de trabajadores de Lubricantes y Equipos Varyná C.A. está conformada por personal administrativo, técnico y operativo. Toda la empresa trabaja de manera coordinada para garantizar la calidad de los servicios prestados, recayendo sobre el área de procura administrativa la responsabilidad de asegurar la disponibilidad oportuna de materiales y repuestos para la continuidad operativa.</w:t>
+        <w:t>La población de trabajadores de Lubricantes y Equipos Varyná C.A. está conformada por un total de cuarenta y dos (42) trabajadores distribuidos en los siguientes departamentos y áreas operativas:</w:t>
+      </w:r>
+    </w:p>
+    <w:p>
+      <w:pPr>
+        <w:spacing w:line="360" w:lineRule="auto" w:after="0" w:before="0"/>
+        <w:ind w:firstLine="709"/>
+        <w:jc w:val="both"/>
+      </w:pPr>
+      <w:r>
+        <w:rPr>
+          <w:rFonts w:ascii="Times New Roman" w:hAnsi="Times New Roman"/>
+          <w:i w:val="0"/>
+          <w:sz w:val="24"/>
+        </w:rPr>
+      </w:r>
+    </w:p>
+    <w:p>
+      <w:pPr>
+        <w:spacing w:line="360" w:lineRule="auto" w:after="0" w:before="0"/>
+        <w:ind w:firstLine="709"/>
+        <w:jc w:val="both"/>
+      </w:pPr>
+      <w:r>
+        <w:rPr>
+          <w:rFonts w:ascii="Times New Roman" w:hAnsi="Times New Roman"/>
+          <w:i w:val="0"/>
+          <w:sz w:val="24"/>
+        </w:rPr>
+        <w:t>Cuadro N° X. Distribución de la Población de Trabajadores</w:t>
+      </w:r>
+    </w:p>
+    <w:p>
+      <w:pPr>
+        <w:spacing w:line="360" w:lineRule="auto" w:after="0" w:before="0"/>
+        <w:ind w:firstLine="709"/>
+        <w:jc w:val="both"/>
+      </w:pPr>
+      <w:r>
+        <w:rPr>
+          <w:rFonts w:ascii="Times New Roman" w:hAnsi="Times New Roman"/>
+          <w:i w:val="0"/>
+          <w:sz w:val="24"/>
+        </w:rPr>
+      </w:r>
+    </w:p>
+    <w:p>
+      <w:pPr>
+        <w:spacing w:line="360" w:lineRule="auto" w:after="0" w:before="0"/>
+        <w:ind w:firstLine="709"/>
+        <w:jc w:val="both"/>
+      </w:pPr>
+      <w:r>
+        <w:rPr>
+          <w:rFonts w:ascii="Times New Roman" w:hAnsi="Times New Roman"/>
+          <w:i w:val="0"/>
+          <w:sz w:val="24"/>
+        </w:rPr>
+        <w:t>| Departamento / Área | Cargo | Sexo Femenino | Sexo Masculino | Total |</w:t>
+      </w:r>
+    </w:p>
+    <w:p>
+      <w:pPr>
+        <w:spacing w:line="360" w:lineRule="auto" w:after="0" w:before="0"/>
+        <w:ind w:firstLine="709"/>
+        <w:jc w:val="both"/>
+      </w:pPr>
+      <w:r>
+        <w:rPr>
+          <w:rFonts w:ascii="Times New Roman" w:hAnsi="Times New Roman"/>
+          <w:i w:val="0"/>
+          <w:sz w:val="24"/>
+        </w:rPr>
+        <w:t>| --- | --- | --- | --- | --- |</w:t>
+      </w:r>
+    </w:p>
+    <w:p>
+      <w:pPr>
+        <w:spacing w:line="360" w:lineRule="auto" w:after="0" w:before="0"/>
+        <w:ind w:firstLine="709"/>
+        <w:jc w:val="both"/>
+      </w:pPr>
+      <w:r>
+        <w:rPr>
+          <w:rFonts w:ascii="Times New Roman" w:hAnsi="Times New Roman"/>
+          <w:i w:val="0"/>
+          <w:sz w:val="24"/>
+        </w:rPr>
+        <w:t>| Alta Dirección | Gerente General | 0 | 1 | 1 |</w:t>
+      </w:r>
+    </w:p>
+    <w:p>
+      <w:pPr>
+        <w:spacing w:line="360" w:lineRule="auto" w:after="0" w:before="0"/>
+        <w:ind w:firstLine="709"/>
+        <w:jc w:val="both"/>
+      </w:pPr>
+      <w:r>
+        <w:rPr>
+          <w:rFonts w:ascii="Times New Roman" w:hAnsi="Times New Roman"/>
+          <w:i w:val="0"/>
+          <w:sz w:val="24"/>
+        </w:rPr>
+        <w:t>| Dirección Operativa | Gerente de Operaciones | 0 | 1 | 1 |</w:t>
+      </w:r>
+    </w:p>
+    <w:p>
+      <w:pPr>
+        <w:spacing w:line="360" w:lineRule="auto" w:after="0" w:before="0"/>
+        <w:ind w:firstLine="709"/>
+        <w:jc w:val="both"/>
+      </w:pPr>
+      <w:r>
+        <w:rPr>
+          <w:rFonts w:ascii="Times New Roman" w:hAnsi="Times New Roman"/>
+          <w:i w:val="0"/>
+          <w:sz w:val="24"/>
+        </w:rPr>
+        <w:t>| Control y Avance | Gerente / Operaciones Morichal | 1 | 1 | 2 |</w:t>
+      </w:r>
+    </w:p>
+    <w:p>
+      <w:pPr>
+        <w:spacing w:line="360" w:lineRule="auto" w:after="0" w:before="0"/>
+        <w:ind w:firstLine="709"/>
+        <w:jc w:val="both"/>
+      </w:pPr>
+      <w:r>
+        <w:rPr>
+          <w:rFonts w:ascii="Times New Roman" w:hAnsi="Times New Roman"/>
+          <w:i w:val="0"/>
+          <w:sz w:val="24"/>
+        </w:rPr>
+        <w:t>| Administración (Área de Pasantía) | Administración / Asistentes Administrativos | 2 | 1 | 3 |</w:t>
+      </w:r>
+    </w:p>
+    <w:p>
+      <w:pPr>
+        <w:spacing w:line="360" w:lineRule="auto" w:after="0" w:before="0"/>
+        <w:ind w:firstLine="709"/>
+        <w:jc w:val="both"/>
+      </w:pPr>
+      <w:r>
+        <w:rPr>
+          <w:rFonts w:ascii="Times New Roman" w:hAnsi="Times New Roman"/>
+          <w:i w:val="0"/>
+          <w:sz w:val="24"/>
+        </w:rPr>
+        <w:t>| | Control de Avance, Logística y Compras (Procura) | 1 | 1 | 2 |</w:t>
+      </w:r>
+    </w:p>
+    <w:p>
+      <w:pPr>
+        <w:spacing w:line="360" w:lineRule="auto" w:after="0" w:before="0"/>
+        <w:ind w:firstLine="709"/>
+        <w:jc w:val="both"/>
+      </w:pPr>
+      <w:r>
+        <w:rPr>
+          <w:rFonts w:ascii="Times New Roman" w:hAnsi="Times New Roman"/>
+          <w:i w:val="0"/>
+          <w:sz w:val="24"/>
+        </w:rPr>
+        <w:t>| | Operarios, Sup. Patio, Mantenimiento y Logística | 0 | 2 | 2 |</w:t>
+      </w:r>
+    </w:p>
+    <w:p>
+      <w:pPr>
+        <w:spacing w:line="360" w:lineRule="auto" w:after="0" w:before="0"/>
+        <w:ind w:firstLine="709"/>
+        <w:jc w:val="both"/>
+      </w:pPr>
+      <w:r>
+        <w:rPr>
+          <w:rFonts w:ascii="Times New Roman" w:hAnsi="Times New Roman"/>
+          <w:i w:val="0"/>
+          <w:sz w:val="24"/>
+        </w:rPr>
+        <w:t>| Contratación y Adm. Contratos | Gerente / Estimadores, Administradores, Planificadores | 2 | 1 | 3 |</w:t>
+      </w:r>
+    </w:p>
+    <w:p>
+      <w:pPr>
+        <w:spacing w:line="360" w:lineRule="auto" w:after="0" w:before="0"/>
+        <w:ind w:firstLine="709"/>
+        <w:jc w:val="both"/>
+      </w:pPr>
+      <w:r>
+        <w:rPr>
+          <w:rFonts w:ascii="Times New Roman" w:hAnsi="Times New Roman"/>
+          <w:i w:val="0"/>
+          <w:sz w:val="24"/>
+        </w:rPr>
+        <w:t>| Recursos Humanos | Gerente de RRHH-Laborales / Asistentes | 2 | 1 | 3 |</w:t>
+      </w:r>
+    </w:p>
+    <w:p>
+      <w:pPr>
+        <w:spacing w:line="360" w:lineRule="auto" w:after="0" w:before="0"/>
+        <w:ind w:firstLine="709"/>
+        <w:jc w:val="both"/>
+      </w:pPr>
+      <w:r>
+        <w:rPr>
+          <w:rFonts w:ascii="Times New Roman" w:hAnsi="Times New Roman"/>
+          <w:i w:val="0"/>
+          <w:sz w:val="24"/>
+        </w:rPr>
+        <w:t>| Proyectos y Producción | Gerentes de Proyecto, Optimización y Servicios | 1 | 2 | 3 |</w:t>
+      </w:r>
+    </w:p>
+    <w:p>
+      <w:pPr>
+        <w:spacing w:line="360" w:lineRule="auto" w:after="0" w:before="0"/>
+        <w:ind w:firstLine="709"/>
+        <w:jc w:val="both"/>
+      </w:pPr>
+      <w:r>
+        <w:rPr>
+          <w:rFonts w:ascii="Times New Roman" w:hAnsi="Times New Roman"/>
+          <w:i w:val="0"/>
+          <w:sz w:val="24"/>
+        </w:rPr>
+        <w:t>| | Gerente Metalmecánico | 0 | 1 | 1 |</w:t>
+      </w:r>
+    </w:p>
+    <w:p>
+      <w:pPr>
+        <w:spacing w:line="360" w:lineRule="auto" w:after="0" w:before="0"/>
+        <w:ind w:firstLine="709"/>
+        <w:jc w:val="both"/>
+      </w:pPr>
+      <w:r>
+        <w:rPr>
+          <w:rFonts w:ascii="Times New Roman" w:hAnsi="Times New Roman"/>
+          <w:i w:val="0"/>
+          <w:sz w:val="24"/>
+        </w:rPr>
+        <w:t>| Ingeniería y Campo | Ingenieros Residentes / Coordinadores (SIHO-A, Calidad) | 2 | 3 | 5 |</w:t>
+      </w:r>
+    </w:p>
+    <w:p>
+      <w:pPr>
+        <w:spacing w:line="360" w:lineRule="auto" w:after="0" w:before="0"/>
+        <w:ind w:firstLine="709"/>
+        <w:jc w:val="both"/>
+      </w:pPr>
+      <w:r>
+        <w:rPr>
+          <w:rFonts w:ascii="Times New Roman" w:hAnsi="Times New Roman"/>
+          <w:i w:val="0"/>
+          <w:sz w:val="24"/>
+        </w:rPr>
+        <w:t>| | Inspectores (SIHO, Ambiente, Paramédicos, Calidad) | 2 | 2 | 4 |</w:t>
+      </w:r>
+    </w:p>
+    <w:p>
+      <w:pPr>
+        <w:spacing w:line="360" w:lineRule="auto" w:after="0" w:before="0"/>
+        <w:ind w:firstLine="709"/>
+        <w:jc w:val="both"/>
+      </w:pPr>
+      <w:r>
+        <w:rPr>
+          <w:rFonts w:ascii="Times New Roman" w:hAnsi="Times New Roman"/>
+          <w:i w:val="0"/>
+          <w:sz w:val="24"/>
+        </w:rPr>
+        <w:t>| | Supervisor de Obras, Operadores, Chóferes, Soldadores, Obreros | 1 | 10 | 11 |</w:t>
+      </w:r>
+    </w:p>
+    <w:p>
+      <w:pPr>
+        <w:spacing w:line="360" w:lineRule="auto" w:after="0" w:before="0"/>
+        <w:ind w:firstLine="709"/>
+        <w:jc w:val="both"/>
+      </w:pPr>
+      <w:r>
+        <w:rPr>
+          <w:rFonts w:ascii="Times New Roman" w:hAnsi="Times New Roman"/>
+          <w:i w:val="0"/>
+          <w:sz w:val="24"/>
+        </w:rPr>
+        <w:t>| **TOTAL GENERAL** | | **14** | **28** | **42** |</w:t>
+      </w:r>
+    </w:p>
+    <w:p>
+      <w:pPr>
+        <w:spacing w:line="360" w:lineRule="auto" w:after="0" w:before="0"/>
+        <w:ind w:firstLine="709"/>
+        <w:jc w:val="both"/>
+      </w:pPr>
+      <w:r>
+        <w:rPr>
+          <w:rFonts w:ascii="Times New Roman" w:hAnsi="Times New Roman"/>
+          <w:i w:val="0"/>
+          <w:sz w:val="24"/>
+        </w:rPr>
+      </w:r>
+    </w:p>
+    <w:p>
+      <w:pPr>
+        <w:spacing w:line="360" w:lineRule="auto" w:after="0" w:before="0"/>
+        <w:ind w:firstLine="709"/>
+        <w:jc w:val="both"/>
+      </w:pPr>
+      <w:r>
+        <w:rPr>
+          <w:rFonts w:ascii="Times New Roman" w:hAnsi="Times New Roman"/>
+          <w:i w:val="0"/>
+          <w:sz w:val="24"/>
+        </w:rPr>
+        <w:t>*Fuente: Departamento Administrativo de Lubricantes y Equipos Varyna, C.A. (2026).*</w:t>
       </w:r>
     </w:p>
     <w:p>
@@ -2485,7 +2797,31 @@
           <w:i w:val="0"/>
           <w:sz w:val="24"/>
         </w:rPr>
-        <w:t>A continuación, se presenta la estructura organizativa de la empresa, reflejando las líneas de mando y la distribución de los departamentos administrativos y de procura:</w:t>
+        <w:t>A continuación, se presenta la estructura organizativa de la empresa, reflejando las líneas de mando y la distribución de los departamentos administrativos y de procura. Los departamentos que conforman la organización son los siguientes:</w:t>
+        <w:br/>
+        <w:br/>
+        <w:t>Gerencia General: Es la máxima autoridad ejecutiva encargada de la dirección estratégica, la toma de decisiones corporativas y el cumplimiento de los objetivos globales de la organización.</w:t>
+        <w:br/>
+        <w:br/>
+        <w:t>Gerencia de Operaciones: Coordina y supervisa la ejecución técnica y operativa de los proyectos, garantizando la eficiencia en el uso de recursos e infraestructura en campo.</w:t>
+        <w:br/>
+        <w:br/>
+        <w:t>Gerencia de Control y Avance (y Operaciones Morichal): Responsable de monitorear el rendimiento, cumplimiento de metas de avance físico de obras y la logística operativa regional en el área de Morichal.</w:t>
+        <w:br/>
+        <w:br/>
+        <w:t>Departamento Administrativo (Área de Pasantía): Unidad encargada de la gestión financiera, presupuestaria, logística interna, control contable e inventarios. En este departamento se desenvuelve la pasante en el rol de Asistente Administrativo, brindando apoyo operativo y de control, con énfasis en el área de Procura (Compras y Logística) mediante la recepción de requerimientos, solicitud de cotizaciones, selección de proveedores y seguimiento a la adquisición oportuna de bienes, materiales y servicios esenciales.</w:t>
+        <w:br/>
+        <w:br/>
+        <w:t>Gerencia de Contratación y Administración de Contratos: Encargada del análisis de costos, estimaciones presupuestarias, planificación y control legal y operativo de las licitaciones y contratos vigentes.</w:t>
+        <w:br/>
+        <w:br/>
+        <w:t>Gerencia de Recursos Humanos y Relaciones Laborales: Dirige el reclutamiento, selección, administración de personal, nómina y la gestión del clima laboral de la empresa.</w:t>
+        <w:br/>
+        <w:br/>
+        <w:t>Gerencias Técnicas (Proyectos, Optimización, Servicios Eléctricos y Metalmecánico): Áreas especializadas dedicadas al diseño, mantenimiento, ejecución de estructuras metálicas y optimización de servicios de ingeniería en campo.</w:t>
+        <w:br/>
+        <w:br/>
+        <w:t>Coordinaciones de SIHO-A y Calidad: Unidades orientadas a garantizar la Seguridad Industrial, Higiene Ocupacional y Ambiente, asegurando el cumplimiento de normas de prevención de riesgos y estándares de calidad en las operaciones.</w:t>
       </w:r>
     </w:p>
     <w:p>

</xml_diff>

<commit_message>
Keidy: poblacion en prosa (sin markdown); organigrama como lista de parrafos
</commit_message>
<xml_diff>
--- a/keidy/reportes/Informe_Pasantia_IUTECP.docx
+++ b/keidy/reportes/Informe_Pasantia_IUTECP.docx
@@ -2454,7 +2454,7 @@
           <w:i w:val="0"/>
           <w:sz w:val="24"/>
         </w:rPr>
-        <w:t>La población de trabajadores de Lubricantes y Equipos Varyná C.A. está conformada por un total de cuarenta y dos (42) trabajadores distribuidos en los siguientes departamentos y áreas operativas:</w:t>
+        <w:t>La población de trabajadores de Lubricantes y Equipos Varyná C.A. está conformada por un total de cuarenta y dos (42) trabajadores, distribuidos en catorce (14) del sexo femenino y veintiocho (28) del sexo masculino, organizados en los siguientes departamentos y áreas operativas:</w:t>
       </w:r>
     </w:p>
     <w:p>
@@ -2469,6 +2469,7 @@
           <w:i w:val="0"/>
           <w:sz w:val="24"/>
         </w:rPr>
+        <w:t>En la Alta Dirección labora 1 Gerente General (masculino). En la Dirección Operativa, 1 Gerente de Operaciones (masculino). En Control y Avance y Operaciones Morichal, 2 trabajadores (1 femenino, 1 masculino).</w:t>
       </w:r>
     </w:p>
     <w:p>
@@ -2483,7 +2484,7 @@
           <w:i w:val="0"/>
           <w:sz w:val="24"/>
         </w:rPr>
-        <w:t>Cuadro N° X. Distribución de la Población de Trabajadores</w:t>
+        <w:t>En el Departamento Administrativo, área donde se desarrolla la pasantía, se desempeñan 3 trabajadores en Administración y Asistentes Administrativos (2 femenino, 1 masculino); 2 en Control de Avance, Logística y Compras o Procura (1 femenino, 1 masculino); y 2 operarios, supervisores de patio, mantenimiento y logística (masculino).</w:t>
       </w:r>
     </w:p>
     <w:p>
@@ -2498,6 +2499,7 @@
           <w:i w:val="0"/>
           <w:sz w:val="24"/>
         </w:rPr>
+        <w:t>En Contratación y Administración de Contratos laboran 3 trabajadores (2 femenino, 1 masculino). En Recursos Humanos, 3 trabajadores (2 femenino, 1 masculino).</w:t>
       </w:r>
     </w:p>
     <w:p>
@@ -2512,7 +2514,7 @@
           <w:i w:val="0"/>
           <w:sz w:val="24"/>
         </w:rPr>
-        <w:t>| Departamento / Área | Cargo | Sexo Femenino | Sexo Masculino | Total |</w:t>
+        <w:t>En Proyectos y Producción se desempeñan 3 Gerentes de Proyecto, Optimización y Servicios (1 femenino, 2 masculino); y 1 Gerente Metalmecánico (masculino).</w:t>
       </w:r>
     </w:p>
     <w:p>
@@ -2527,7 +2529,7 @@
           <w:i w:val="0"/>
           <w:sz w:val="24"/>
         </w:rPr>
-        <w:t>| --- | --- | --- | --- | --- |</w:t>
+        <w:t>En Ingeniería y Campo laboran 5 Ingenieros Residentes y Coordinadores de SIHO-A y Calidad (2 femenino, 3 masculino); 4 Inspectores de SIHO, Ambiente, Paramédicos y Calidad (2 femenino, 2 masculino); y 11 Supervisores de Obras, Operadores, Chóferes, Soldadores y Obreros (1 femenino, 10 masculino).</w:t>
       </w:r>
     </w:p>
     <w:p>
@@ -2542,231 +2544,7 @@
           <w:i w:val="0"/>
           <w:sz w:val="24"/>
         </w:rPr>
-        <w:t>| Alta Dirección | Gerente General | 0 | 1 | 1 |</w:t>
-      </w:r>
-    </w:p>
-    <w:p>
-      <w:pPr>
-        <w:spacing w:line="360" w:lineRule="auto" w:after="0" w:before="0"/>
-        <w:ind w:firstLine="709"/>
-        <w:jc w:val="both"/>
-      </w:pPr>
-      <w:r>
-        <w:rPr>
-          <w:rFonts w:ascii="Times New Roman" w:hAnsi="Times New Roman"/>
-          <w:i w:val="0"/>
-          <w:sz w:val="24"/>
-        </w:rPr>
-        <w:t>| Dirección Operativa | Gerente de Operaciones | 0 | 1 | 1 |</w:t>
-      </w:r>
-    </w:p>
-    <w:p>
-      <w:pPr>
-        <w:spacing w:line="360" w:lineRule="auto" w:after="0" w:before="0"/>
-        <w:ind w:firstLine="709"/>
-        <w:jc w:val="both"/>
-      </w:pPr>
-      <w:r>
-        <w:rPr>
-          <w:rFonts w:ascii="Times New Roman" w:hAnsi="Times New Roman"/>
-          <w:i w:val="0"/>
-          <w:sz w:val="24"/>
-        </w:rPr>
-        <w:t>| Control y Avance | Gerente / Operaciones Morichal | 1 | 1 | 2 |</w:t>
-      </w:r>
-    </w:p>
-    <w:p>
-      <w:pPr>
-        <w:spacing w:line="360" w:lineRule="auto" w:after="0" w:before="0"/>
-        <w:ind w:firstLine="709"/>
-        <w:jc w:val="both"/>
-      </w:pPr>
-      <w:r>
-        <w:rPr>
-          <w:rFonts w:ascii="Times New Roman" w:hAnsi="Times New Roman"/>
-          <w:i w:val="0"/>
-          <w:sz w:val="24"/>
-        </w:rPr>
-        <w:t>| Administración (Área de Pasantía) | Administración / Asistentes Administrativos | 2 | 1 | 3 |</w:t>
-      </w:r>
-    </w:p>
-    <w:p>
-      <w:pPr>
-        <w:spacing w:line="360" w:lineRule="auto" w:after="0" w:before="0"/>
-        <w:ind w:firstLine="709"/>
-        <w:jc w:val="both"/>
-      </w:pPr>
-      <w:r>
-        <w:rPr>
-          <w:rFonts w:ascii="Times New Roman" w:hAnsi="Times New Roman"/>
-          <w:i w:val="0"/>
-          <w:sz w:val="24"/>
-        </w:rPr>
-        <w:t>| | Control de Avance, Logística y Compras (Procura) | 1 | 1 | 2 |</w:t>
-      </w:r>
-    </w:p>
-    <w:p>
-      <w:pPr>
-        <w:spacing w:line="360" w:lineRule="auto" w:after="0" w:before="0"/>
-        <w:ind w:firstLine="709"/>
-        <w:jc w:val="both"/>
-      </w:pPr>
-      <w:r>
-        <w:rPr>
-          <w:rFonts w:ascii="Times New Roman" w:hAnsi="Times New Roman"/>
-          <w:i w:val="0"/>
-          <w:sz w:val="24"/>
-        </w:rPr>
-        <w:t>| | Operarios, Sup. Patio, Mantenimiento y Logística | 0 | 2 | 2 |</w:t>
-      </w:r>
-    </w:p>
-    <w:p>
-      <w:pPr>
-        <w:spacing w:line="360" w:lineRule="auto" w:after="0" w:before="0"/>
-        <w:ind w:firstLine="709"/>
-        <w:jc w:val="both"/>
-      </w:pPr>
-      <w:r>
-        <w:rPr>
-          <w:rFonts w:ascii="Times New Roman" w:hAnsi="Times New Roman"/>
-          <w:i w:val="0"/>
-          <w:sz w:val="24"/>
-        </w:rPr>
-        <w:t>| Contratación y Adm. Contratos | Gerente / Estimadores, Administradores, Planificadores | 2 | 1 | 3 |</w:t>
-      </w:r>
-    </w:p>
-    <w:p>
-      <w:pPr>
-        <w:spacing w:line="360" w:lineRule="auto" w:after="0" w:before="0"/>
-        <w:ind w:firstLine="709"/>
-        <w:jc w:val="both"/>
-      </w:pPr>
-      <w:r>
-        <w:rPr>
-          <w:rFonts w:ascii="Times New Roman" w:hAnsi="Times New Roman"/>
-          <w:i w:val="0"/>
-          <w:sz w:val="24"/>
-        </w:rPr>
-        <w:t>| Recursos Humanos | Gerente de RRHH-Laborales / Asistentes | 2 | 1 | 3 |</w:t>
-      </w:r>
-    </w:p>
-    <w:p>
-      <w:pPr>
-        <w:spacing w:line="360" w:lineRule="auto" w:after="0" w:before="0"/>
-        <w:ind w:firstLine="709"/>
-        <w:jc w:val="both"/>
-      </w:pPr>
-      <w:r>
-        <w:rPr>
-          <w:rFonts w:ascii="Times New Roman" w:hAnsi="Times New Roman"/>
-          <w:i w:val="0"/>
-          <w:sz w:val="24"/>
-        </w:rPr>
-        <w:t>| Proyectos y Producción | Gerentes de Proyecto, Optimización y Servicios | 1 | 2 | 3 |</w:t>
-      </w:r>
-    </w:p>
-    <w:p>
-      <w:pPr>
-        <w:spacing w:line="360" w:lineRule="auto" w:after="0" w:before="0"/>
-        <w:ind w:firstLine="709"/>
-        <w:jc w:val="both"/>
-      </w:pPr>
-      <w:r>
-        <w:rPr>
-          <w:rFonts w:ascii="Times New Roman" w:hAnsi="Times New Roman"/>
-          <w:i w:val="0"/>
-          <w:sz w:val="24"/>
-        </w:rPr>
-        <w:t>| | Gerente Metalmecánico | 0 | 1 | 1 |</w:t>
-      </w:r>
-    </w:p>
-    <w:p>
-      <w:pPr>
-        <w:spacing w:line="360" w:lineRule="auto" w:after="0" w:before="0"/>
-        <w:ind w:firstLine="709"/>
-        <w:jc w:val="both"/>
-      </w:pPr>
-      <w:r>
-        <w:rPr>
-          <w:rFonts w:ascii="Times New Roman" w:hAnsi="Times New Roman"/>
-          <w:i w:val="0"/>
-          <w:sz w:val="24"/>
-        </w:rPr>
-        <w:t>| Ingeniería y Campo | Ingenieros Residentes / Coordinadores (SIHO-A, Calidad) | 2 | 3 | 5 |</w:t>
-      </w:r>
-    </w:p>
-    <w:p>
-      <w:pPr>
-        <w:spacing w:line="360" w:lineRule="auto" w:after="0" w:before="0"/>
-        <w:ind w:firstLine="709"/>
-        <w:jc w:val="both"/>
-      </w:pPr>
-      <w:r>
-        <w:rPr>
-          <w:rFonts w:ascii="Times New Roman" w:hAnsi="Times New Roman"/>
-          <w:i w:val="0"/>
-          <w:sz w:val="24"/>
-        </w:rPr>
-        <w:t>| | Inspectores (SIHO, Ambiente, Paramédicos, Calidad) | 2 | 2 | 4 |</w:t>
-      </w:r>
-    </w:p>
-    <w:p>
-      <w:pPr>
-        <w:spacing w:line="360" w:lineRule="auto" w:after="0" w:before="0"/>
-        <w:ind w:firstLine="709"/>
-        <w:jc w:val="both"/>
-      </w:pPr>
-      <w:r>
-        <w:rPr>
-          <w:rFonts w:ascii="Times New Roman" w:hAnsi="Times New Roman"/>
-          <w:i w:val="0"/>
-          <w:sz w:val="24"/>
-        </w:rPr>
-        <w:t>| | Supervisor de Obras, Operadores, Chóferes, Soldadores, Obreros | 1 | 10 | 11 |</w:t>
-      </w:r>
-    </w:p>
-    <w:p>
-      <w:pPr>
-        <w:spacing w:line="360" w:lineRule="auto" w:after="0" w:before="0"/>
-        <w:ind w:firstLine="709"/>
-        <w:jc w:val="both"/>
-      </w:pPr>
-      <w:r>
-        <w:rPr>
-          <w:rFonts w:ascii="Times New Roman" w:hAnsi="Times New Roman"/>
-          <w:i w:val="0"/>
-          <w:sz w:val="24"/>
-        </w:rPr>
-        <w:t>| **TOTAL GENERAL** | | **14** | **28** | **42** |</w:t>
-      </w:r>
-    </w:p>
-    <w:p>
-      <w:pPr>
-        <w:spacing w:line="360" w:lineRule="auto" w:after="0" w:before="0"/>
-        <w:ind w:firstLine="709"/>
-        <w:jc w:val="both"/>
-      </w:pPr>
-      <w:r>
-        <w:rPr>
-          <w:rFonts w:ascii="Times New Roman" w:hAnsi="Times New Roman"/>
-          <w:i w:val="0"/>
-          <w:sz w:val="24"/>
-        </w:rPr>
-      </w:r>
-    </w:p>
-    <w:p>
-      <w:pPr>
-        <w:spacing w:line="360" w:lineRule="auto" w:after="0" w:before="0"/>
-        <w:ind w:firstLine="709"/>
-        <w:jc w:val="both"/>
-      </w:pPr>
-      <w:r>
-        <w:rPr>
-          <w:rFonts w:ascii="Times New Roman" w:hAnsi="Times New Roman"/>
-          <w:i w:val="0"/>
-          <w:sz w:val="24"/>
-        </w:rPr>
-        <w:t>*Fuente: Departamento Administrativo de Lubricantes y Equipos Varyna, C.A. (2026).*</w:t>
+        <w:t>Fuente: Departamento Administrativo de Lubricantes y Equipos Varyna, C.A. (2026).</w:t>
       </w:r>
     </w:p>
     <w:p>
@@ -2798,29 +2576,125 @@
           <w:sz w:val="24"/>
         </w:rPr>
         <w:t>A continuación, se presenta la estructura organizativa de la empresa, reflejando las líneas de mando y la distribución de los departamentos administrativos y de procura. Los departamentos que conforman la organización son los siguientes:</w:t>
-        <w:br/>
-        <w:br/>
+      </w:r>
+    </w:p>
+    <w:p>
+      <w:pPr>
+        <w:spacing w:line="360" w:lineRule="auto" w:after="0" w:before="0"/>
+        <w:ind w:firstLine="709"/>
+        <w:jc w:val="both"/>
+      </w:pPr>
+      <w:r>
+        <w:rPr>
+          <w:rFonts w:ascii="Times New Roman" w:hAnsi="Times New Roman"/>
+          <w:i w:val="0"/>
+          <w:sz w:val="24"/>
+        </w:rPr>
         <w:t>Gerencia General: Es la máxima autoridad ejecutiva encargada de la dirección estratégica, la toma de decisiones corporativas y el cumplimiento de los objetivos globales de la organización.</w:t>
-        <w:br/>
-        <w:br/>
+      </w:r>
+    </w:p>
+    <w:p>
+      <w:pPr>
+        <w:spacing w:line="360" w:lineRule="auto" w:after="0" w:before="0"/>
+        <w:ind w:firstLine="709"/>
+        <w:jc w:val="both"/>
+      </w:pPr>
+      <w:r>
+        <w:rPr>
+          <w:rFonts w:ascii="Times New Roman" w:hAnsi="Times New Roman"/>
+          <w:i w:val="0"/>
+          <w:sz w:val="24"/>
+        </w:rPr>
         <w:t>Gerencia de Operaciones: Coordina y supervisa la ejecución técnica y operativa de los proyectos, garantizando la eficiencia en el uso de recursos e infraestructura en campo.</w:t>
-        <w:br/>
-        <w:br/>
+      </w:r>
+    </w:p>
+    <w:p>
+      <w:pPr>
+        <w:spacing w:line="360" w:lineRule="auto" w:after="0" w:before="0"/>
+        <w:ind w:firstLine="709"/>
+        <w:jc w:val="both"/>
+      </w:pPr>
+      <w:r>
+        <w:rPr>
+          <w:rFonts w:ascii="Times New Roman" w:hAnsi="Times New Roman"/>
+          <w:i w:val="0"/>
+          <w:sz w:val="24"/>
+        </w:rPr>
         <w:t>Gerencia de Control y Avance (y Operaciones Morichal): Responsable de monitorear el rendimiento, cumplimiento de metas de avance físico de obras y la logística operativa regional en el área de Morichal.</w:t>
-        <w:br/>
-        <w:br/>
+      </w:r>
+    </w:p>
+    <w:p>
+      <w:pPr>
+        <w:spacing w:line="360" w:lineRule="auto" w:after="0" w:before="0"/>
+        <w:ind w:firstLine="709"/>
+        <w:jc w:val="both"/>
+      </w:pPr>
+      <w:r>
+        <w:rPr>
+          <w:rFonts w:ascii="Times New Roman" w:hAnsi="Times New Roman"/>
+          <w:i w:val="0"/>
+          <w:sz w:val="24"/>
+        </w:rPr>
         <w:t>Departamento Administrativo (Área de Pasantía): Unidad encargada de la gestión financiera, presupuestaria, logística interna, control contable e inventarios. En este departamento se desenvuelve la pasante en el rol de Asistente Administrativo, brindando apoyo operativo y de control, con énfasis en el área de Procura (Compras y Logística) mediante la recepción de requerimientos, solicitud de cotizaciones, selección de proveedores y seguimiento a la adquisición oportuna de bienes, materiales y servicios esenciales.</w:t>
-        <w:br/>
-        <w:br/>
+      </w:r>
+    </w:p>
+    <w:p>
+      <w:pPr>
+        <w:spacing w:line="360" w:lineRule="auto" w:after="0" w:before="0"/>
+        <w:ind w:firstLine="709"/>
+        <w:jc w:val="both"/>
+      </w:pPr>
+      <w:r>
+        <w:rPr>
+          <w:rFonts w:ascii="Times New Roman" w:hAnsi="Times New Roman"/>
+          <w:i w:val="0"/>
+          <w:sz w:val="24"/>
+        </w:rPr>
         <w:t>Gerencia de Contratación y Administración de Contratos: Encargada del análisis de costos, estimaciones presupuestarias, planificación y control legal y operativo de las licitaciones y contratos vigentes.</w:t>
-        <w:br/>
-        <w:br/>
+      </w:r>
+    </w:p>
+    <w:p>
+      <w:pPr>
+        <w:spacing w:line="360" w:lineRule="auto" w:after="0" w:before="0"/>
+        <w:ind w:firstLine="709"/>
+        <w:jc w:val="both"/>
+      </w:pPr>
+      <w:r>
+        <w:rPr>
+          <w:rFonts w:ascii="Times New Roman" w:hAnsi="Times New Roman"/>
+          <w:i w:val="0"/>
+          <w:sz w:val="24"/>
+        </w:rPr>
         <w:t>Gerencia de Recursos Humanos y Relaciones Laborales: Dirige el reclutamiento, selección, administración de personal, nómina y la gestión del clima laboral de la empresa.</w:t>
-        <w:br/>
-        <w:br/>
+      </w:r>
+    </w:p>
+    <w:p>
+      <w:pPr>
+        <w:spacing w:line="360" w:lineRule="auto" w:after="0" w:before="0"/>
+        <w:ind w:firstLine="709"/>
+        <w:jc w:val="both"/>
+      </w:pPr>
+      <w:r>
+        <w:rPr>
+          <w:rFonts w:ascii="Times New Roman" w:hAnsi="Times New Roman"/>
+          <w:i w:val="0"/>
+          <w:sz w:val="24"/>
+        </w:rPr>
         <w:t>Gerencias Técnicas (Proyectos, Optimización, Servicios Eléctricos y Metalmecánico): Áreas especializadas dedicadas al diseño, mantenimiento, ejecución de estructuras metálicas y optimización de servicios de ingeniería en campo.</w:t>
-        <w:br/>
-        <w:br/>
+      </w:r>
+    </w:p>
+    <w:p>
+      <w:pPr>
+        <w:spacing w:line="360" w:lineRule="auto" w:after="0" w:before="0"/>
+        <w:ind w:firstLine="709"/>
+        <w:jc w:val="both"/>
+      </w:pPr>
+      <w:r>
+        <w:rPr>
+          <w:rFonts w:ascii="Times New Roman" w:hAnsi="Times New Roman"/>
+          <w:i w:val="0"/>
+          <w:sz w:val="24"/>
+        </w:rPr>
         <w:t>Coordinaciones de SIHO-A y Calidad: Unidades orientadas a garantizar la Seguridad Industrial, Higiene Ocupacional y Ambiente, asegurando el cumplimiento de normas de prevención de riesgos y estándares de calidad en las operaciones.</w:t>
       </w:r>
     </w:p>

</xml_diff>

<commit_message>
Keidy: poblacion como cuadro (tabla Word) via POBLACION_TABLA
</commit_message>
<xml_diff>
--- a/keidy/reportes/Informe_Pasantia_IUTECP.docx
+++ b/keidy/reportes/Informe_Pasantia_IUTECP.docx
@@ -2444,105 +2444,1418 @@
     </w:p>
     <w:p>
       <w:pPr>
-        <w:spacing w:line="360" w:lineRule="auto" w:after="0" w:before="0"/>
-        <w:ind w:firstLine="709"/>
-        <w:jc w:val="both"/>
+        <w:spacing w:after="120"/>
+      </w:pPr>
+    </w:p>
+    <w:tbl>
+      <w:tblPr>
+        <w:tblStyle w:val="TableGrid"/>
+        <w:tblW w:type="auto" w:w="0"/>
+        <w:jc w:val="center"/>
+        <w:tblLook w:firstColumn="1" w:firstRow="1" w:lastColumn="0" w:lastRow="0" w:noHBand="0" w:noVBand="1" w:val="04A0"/>
+      </w:tblPr>
+      <w:tblGrid>
+        <w:gridCol w:w="1654"/>
+        <w:gridCol w:w="1654"/>
+        <w:gridCol w:w="1654"/>
+        <w:gridCol w:w="1654"/>
+        <w:gridCol w:w="1654"/>
+      </w:tblGrid>
+      <w:tr>
+        <w:tc>
+          <w:tcPr>
+            <w:tcW w:type="dxa" w:w="1654"/>
+            <w:shd w:fill="D9E2F3"/>
+          </w:tcPr>
+          <w:p>
+            <w:pPr>
+              <w:jc w:val="center"/>
+            </w:pPr>
+            <w:r/>
+            <w:r>
+              <w:rPr>
+                <w:rFonts w:ascii="Times New Roman" w:hAnsi="Times New Roman"/>
+                <w:b/>
+                <w:sz w:val="16"/>
+              </w:rPr>
+              <w:t>Departamento / Área</w:t>
+            </w:r>
+          </w:p>
+        </w:tc>
+        <w:tc>
+          <w:tcPr>
+            <w:tcW w:type="dxa" w:w="1654"/>
+            <w:shd w:fill="D9E2F3"/>
+          </w:tcPr>
+          <w:p>
+            <w:pPr>
+              <w:jc w:val="center"/>
+            </w:pPr>
+            <w:r/>
+            <w:r>
+              <w:rPr>
+                <w:rFonts w:ascii="Times New Roman" w:hAnsi="Times New Roman"/>
+                <w:b/>
+                <w:sz w:val="16"/>
+              </w:rPr>
+              <w:t>Cargo</w:t>
+            </w:r>
+          </w:p>
+        </w:tc>
+        <w:tc>
+          <w:tcPr>
+            <w:tcW w:type="dxa" w:w="1654"/>
+            <w:shd w:fill="D9E2F3"/>
+          </w:tcPr>
+          <w:p>
+            <w:pPr>
+              <w:jc w:val="center"/>
+            </w:pPr>
+            <w:r/>
+            <w:r>
+              <w:rPr>
+                <w:rFonts w:ascii="Times New Roman" w:hAnsi="Times New Roman"/>
+                <w:b/>
+                <w:sz w:val="16"/>
+              </w:rPr>
+              <w:t>Femenino</w:t>
+            </w:r>
+          </w:p>
+        </w:tc>
+        <w:tc>
+          <w:tcPr>
+            <w:tcW w:type="dxa" w:w="1654"/>
+            <w:shd w:fill="D9E2F3"/>
+          </w:tcPr>
+          <w:p>
+            <w:pPr>
+              <w:jc w:val="center"/>
+            </w:pPr>
+            <w:r/>
+            <w:r>
+              <w:rPr>
+                <w:rFonts w:ascii="Times New Roman" w:hAnsi="Times New Roman"/>
+                <w:b/>
+                <w:sz w:val="16"/>
+              </w:rPr>
+              <w:t>Masculino</w:t>
+            </w:r>
+          </w:p>
+        </w:tc>
+        <w:tc>
+          <w:tcPr>
+            <w:tcW w:type="dxa" w:w="1654"/>
+            <w:shd w:fill="D9E2F3"/>
+          </w:tcPr>
+          <w:p>
+            <w:pPr>
+              <w:jc w:val="center"/>
+            </w:pPr>
+            <w:r/>
+            <w:r>
+              <w:rPr>
+                <w:rFonts w:ascii="Times New Roman" w:hAnsi="Times New Roman"/>
+                <w:b/>
+                <w:sz w:val="16"/>
+              </w:rPr>
+              <w:t>Total</w:t>
+            </w:r>
+          </w:p>
+        </w:tc>
+      </w:tr>
+      <w:tr>
+        <w:tc>
+          <w:tcPr>
+            <w:tcW w:type="dxa" w:w="1654"/>
+          </w:tcPr>
+          <w:p>
+            <w:pPr>
+              <w:jc w:val="left"/>
+            </w:pPr>
+            <w:r/>
+            <w:r>
+              <w:rPr>
+                <w:rFonts w:ascii="Times New Roman" w:hAnsi="Times New Roman"/>
+                <w:sz w:val="16"/>
+              </w:rPr>
+              <w:t>Alta Dirección</w:t>
+            </w:r>
+          </w:p>
+        </w:tc>
+        <w:tc>
+          <w:tcPr>
+            <w:tcW w:type="dxa" w:w="1654"/>
+          </w:tcPr>
+          <w:p>
+            <w:pPr>
+              <w:jc w:val="left"/>
+            </w:pPr>
+            <w:r/>
+            <w:r>
+              <w:rPr>
+                <w:rFonts w:ascii="Times New Roman" w:hAnsi="Times New Roman"/>
+                <w:sz w:val="16"/>
+              </w:rPr>
+              <w:t>Gerente General</w:t>
+            </w:r>
+          </w:p>
+        </w:tc>
+        <w:tc>
+          <w:tcPr>
+            <w:tcW w:type="dxa" w:w="1654"/>
+          </w:tcPr>
+          <w:p>
+            <w:pPr>
+              <w:jc w:val="center"/>
+            </w:pPr>
+            <w:r/>
+            <w:r>
+              <w:rPr>
+                <w:rFonts w:ascii="Times New Roman" w:hAnsi="Times New Roman"/>
+                <w:sz w:val="16"/>
+              </w:rPr>
+              <w:t>0</w:t>
+            </w:r>
+          </w:p>
+        </w:tc>
+        <w:tc>
+          <w:tcPr>
+            <w:tcW w:type="dxa" w:w="1654"/>
+          </w:tcPr>
+          <w:p>
+            <w:pPr>
+              <w:jc w:val="center"/>
+            </w:pPr>
+            <w:r/>
+            <w:r>
+              <w:rPr>
+                <w:rFonts w:ascii="Times New Roman" w:hAnsi="Times New Roman"/>
+                <w:sz w:val="16"/>
+              </w:rPr>
+              <w:t>1</w:t>
+            </w:r>
+          </w:p>
+        </w:tc>
+        <w:tc>
+          <w:tcPr>
+            <w:tcW w:type="dxa" w:w="1654"/>
+          </w:tcPr>
+          <w:p>
+            <w:pPr>
+              <w:jc w:val="center"/>
+            </w:pPr>
+            <w:r/>
+            <w:r>
+              <w:rPr>
+                <w:rFonts w:ascii="Times New Roman" w:hAnsi="Times New Roman"/>
+                <w:sz w:val="16"/>
+              </w:rPr>
+              <w:t>1</w:t>
+            </w:r>
+          </w:p>
+        </w:tc>
+      </w:tr>
+      <w:tr>
+        <w:tc>
+          <w:tcPr>
+            <w:tcW w:type="dxa" w:w="1654"/>
+          </w:tcPr>
+          <w:p>
+            <w:pPr>
+              <w:jc w:val="left"/>
+            </w:pPr>
+            <w:r/>
+            <w:r>
+              <w:rPr>
+                <w:rFonts w:ascii="Times New Roman" w:hAnsi="Times New Roman"/>
+                <w:sz w:val="16"/>
+              </w:rPr>
+              <w:t>Dirección Operativa</w:t>
+            </w:r>
+          </w:p>
+        </w:tc>
+        <w:tc>
+          <w:tcPr>
+            <w:tcW w:type="dxa" w:w="1654"/>
+          </w:tcPr>
+          <w:p>
+            <w:pPr>
+              <w:jc w:val="left"/>
+            </w:pPr>
+            <w:r/>
+            <w:r>
+              <w:rPr>
+                <w:rFonts w:ascii="Times New Roman" w:hAnsi="Times New Roman"/>
+                <w:sz w:val="16"/>
+              </w:rPr>
+              <w:t>Gerente de Operaciones</w:t>
+            </w:r>
+          </w:p>
+        </w:tc>
+        <w:tc>
+          <w:tcPr>
+            <w:tcW w:type="dxa" w:w="1654"/>
+          </w:tcPr>
+          <w:p>
+            <w:pPr>
+              <w:jc w:val="center"/>
+            </w:pPr>
+            <w:r/>
+            <w:r>
+              <w:rPr>
+                <w:rFonts w:ascii="Times New Roman" w:hAnsi="Times New Roman"/>
+                <w:sz w:val="16"/>
+              </w:rPr>
+              <w:t>0</w:t>
+            </w:r>
+          </w:p>
+        </w:tc>
+        <w:tc>
+          <w:tcPr>
+            <w:tcW w:type="dxa" w:w="1654"/>
+          </w:tcPr>
+          <w:p>
+            <w:pPr>
+              <w:jc w:val="center"/>
+            </w:pPr>
+            <w:r/>
+            <w:r>
+              <w:rPr>
+                <w:rFonts w:ascii="Times New Roman" w:hAnsi="Times New Roman"/>
+                <w:sz w:val="16"/>
+              </w:rPr>
+              <w:t>1</w:t>
+            </w:r>
+          </w:p>
+        </w:tc>
+        <w:tc>
+          <w:tcPr>
+            <w:tcW w:type="dxa" w:w="1654"/>
+          </w:tcPr>
+          <w:p>
+            <w:pPr>
+              <w:jc w:val="center"/>
+            </w:pPr>
+            <w:r/>
+            <w:r>
+              <w:rPr>
+                <w:rFonts w:ascii="Times New Roman" w:hAnsi="Times New Roman"/>
+                <w:sz w:val="16"/>
+              </w:rPr>
+              <w:t>1</w:t>
+            </w:r>
+          </w:p>
+        </w:tc>
+      </w:tr>
+      <w:tr>
+        <w:tc>
+          <w:tcPr>
+            <w:tcW w:type="dxa" w:w="1654"/>
+          </w:tcPr>
+          <w:p>
+            <w:pPr>
+              <w:jc w:val="left"/>
+            </w:pPr>
+            <w:r/>
+            <w:r>
+              <w:rPr>
+                <w:rFonts w:ascii="Times New Roman" w:hAnsi="Times New Roman"/>
+                <w:sz w:val="16"/>
+              </w:rPr>
+              <w:t>Control y Avance</w:t>
+            </w:r>
+          </w:p>
+        </w:tc>
+        <w:tc>
+          <w:tcPr>
+            <w:tcW w:type="dxa" w:w="1654"/>
+          </w:tcPr>
+          <w:p>
+            <w:pPr>
+              <w:jc w:val="left"/>
+            </w:pPr>
+            <w:r/>
+            <w:r>
+              <w:rPr>
+                <w:rFonts w:ascii="Times New Roman" w:hAnsi="Times New Roman"/>
+                <w:sz w:val="16"/>
+              </w:rPr>
+              <w:t>Gerente / Operaciones Morichal</w:t>
+            </w:r>
+          </w:p>
+        </w:tc>
+        <w:tc>
+          <w:tcPr>
+            <w:tcW w:type="dxa" w:w="1654"/>
+          </w:tcPr>
+          <w:p>
+            <w:pPr>
+              <w:jc w:val="center"/>
+            </w:pPr>
+            <w:r/>
+            <w:r>
+              <w:rPr>
+                <w:rFonts w:ascii="Times New Roman" w:hAnsi="Times New Roman"/>
+                <w:sz w:val="16"/>
+              </w:rPr>
+              <w:t>1</w:t>
+            </w:r>
+          </w:p>
+        </w:tc>
+        <w:tc>
+          <w:tcPr>
+            <w:tcW w:type="dxa" w:w="1654"/>
+          </w:tcPr>
+          <w:p>
+            <w:pPr>
+              <w:jc w:val="center"/>
+            </w:pPr>
+            <w:r/>
+            <w:r>
+              <w:rPr>
+                <w:rFonts w:ascii="Times New Roman" w:hAnsi="Times New Roman"/>
+                <w:sz w:val="16"/>
+              </w:rPr>
+              <w:t>1</w:t>
+            </w:r>
+          </w:p>
+        </w:tc>
+        <w:tc>
+          <w:tcPr>
+            <w:tcW w:type="dxa" w:w="1654"/>
+          </w:tcPr>
+          <w:p>
+            <w:pPr>
+              <w:jc w:val="center"/>
+            </w:pPr>
+            <w:r/>
+            <w:r>
+              <w:rPr>
+                <w:rFonts w:ascii="Times New Roman" w:hAnsi="Times New Roman"/>
+                <w:sz w:val="16"/>
+              </w:rPr>
+              <w:t>2</w:t>
+            </w:r>
+          </w:p>
+        </w:tc>
+      </w:tr>
+      <w:tr>
+        <w:tc>
+          <w:tcPr>
+            <w:tcW w:type="dxa" w:w="1654"/>
+          </w:tcPr>
+          <w:p>
+            <w:pPr>
+              <w:jc w:val="left"/>
+            </w:pPr>
+            <w:r/>
+            <w:r>
+              <w:rPr>
+                <w:rFonts w:ascii="Times New Roman" w:hAnsi="Times New Roman"/>
+                <w:sz w:val="16"/>
+              </w:rPr>
+              <w:t>Administración (Área de Pasantía)</w:t>
+            </w:r>
+          </w:p>
+        </w:tc>
+        <w:tc>
+          <w:tcPr>
+            <w:tcW w:type="dxa" w:w="1654"/>
+          </w:tcPr>
+          <w:p>
+            <w:pPr>
+              <w:jc w:val="left"/>
+            </w:pPr>
+            <w:r/>
+            <w:r>
+              <w:rPr>
+                <w:rFonts w:ascii="Times New Roman" w:hAnsi="Times New Roman"/>
+                <w:sz w:val="16"/>
+              </w:rPr>
+              <w:t>Administración / Asistentes Administrativos</w:t>
+            </w:r>
+          </w:p>
+        </w:tc>
+        <w:tc>
+          <w:tcPr>
+            <w:tcW w:type="dxa" w:w="1654"/>
+          </w:tcPr>
+          <w:p>
+            <w:pPr>
+              <w:jc w:val="center"/>
+            </w:pPr>
+            <w:r/>
+            <w:r>
+              <w:rPr>
+                <w:rFonts w:ascii="Times New Roman" w:hAnsi="Times New Roman"/>
+                <w:sz w:val="16"/>
+              </w:rPr>
+              <w:t>2</w:t>
+            </w:r>
+          </w:p>
+        </w:tc>
+        <w:tc>
+          <w:tcPr>
+            <w:tcW w:type="dxa" w:w="1654"/>
+          </w:tcPr>
+          <w:p>
+            <w:pPr>
+              <w:jc w:val="center"/>
+            </w:pPr>
+            <w:r/>
+            <w:r>
+              <w:rPr>
+                <w:rFonts w:ascii="Times New Roman" w:hAnsi="Times New Roman"/>
+                <w:sz w:val="16"/>
+              </w:rPr>
+              <w:t>1</w:t>
+            </w:r>
+          </w:p>
+        </w:tc>
+        <w:tc>
+          <w:tcPr>
+            <w:tcW w:type="dxa" w:w="1654"/>
+          </w:tcPr>
+          <w:p>
+            <w:pPr>
+              <w:jc w:val="center"/>
+            </w:pPr>
+            <w:r/>
+            <w:r>
+              <w:rPr>
+                <w:rFonts w:ascii="Times New Roman" w:hAnsi="Times New Roman"/>
+                <w:sz w:val="16"/>
+              </w:rPr>
+              <w:t>3</w:t>
+            </w:r>
+          </w:p>
+        </w:tc>
+      </w:tr>
+      <w:tr>
+        <w:tc>
+          <w:tcPr>
+            <w:tcW w:type="dxa" w:w="1654"/>
+          </w:tcPr>
+          <w:p>
+            <w:pPr>
+              <w:jc w:val="left"/>
+            </w:pPr>
+            <w:r/>
+            <w:r>
+              <w:rPr>
+                <w:rFonts w:ascii="Times New Roman" w:hAnsi="Times New Roman"/>
+                <w:sz w:val="16"/>
+              </w:rPr>
+            </w:r>
+          </w:p>
+        </w:tc>
+        <w:tc>
+          <w:tcPr>
+            <w:tcW w:type="dxa" w:w="1654"/>
+          </w:tcPr>
+          <w:p>
+            <w:pPr>
+              <w:jc w:val="left"/>
+            </w:pPr>
+            <w:r/>
+            <w:r>
+              <w:rPr>
+                <w:rFonts w:ascii="Times New Roman" w:hAnsi="Times New Roman"/>
+                <w:sz w:val="16"/>
+              </w:rPr>
+              <w:t>Control de Avance, Logística y Compras (Procura)</w:t>
+            </w:r>
+          </w:p>
+        </w:tc>
+        <w:tc>
+          <w:tcPr>
+            <w:tcW w:type="dxa" w:w="1654"/>
+          </w:tcPr>
+          <w:p>
+            <w:pPr>
+              <w:jc w:val="center"/>
+            </w:pPr>
+            <w:r/>
+            <w:r>
+              <w:rPr>
+                <w:rFonts w:ascii="Times New Roman" w:hAnsi="Times New Roman"/>
+                <w:sz w:val="16"/>
+              </w:rPr>
+              <w:t>1</w:t>
+            </w:r>
+          </w:p>
+        </w:tc>
+        <w:tc>
+          <w:tcPr>
+            <w:tcW w:type="dxa" w:w="1654"/>
+          </w:tcPr>
+          <w:p>
+            <w:pPr>
+              <w:jc w:val="center"/>
+            </w:pPr>
+            <w:r/>
+            <w:r>
+              <w:rPr>
+                <w:rFonts w:ascii="Times New Roman" w:hAnsi="Times New Roman"/>
+                <w:sz w:val="16"/>
+              </w:rPr>
+              <w:t>1</w:t>
+            </w:r>
+          </w:p>
+        </w:tc>
+        <w:tc>
+          <w:tcPr>
+            <w:tcW w:type="dxa" w:w="1654"/>
+          </w:tcPr>
+          <w:p>
+            <w:pPr>
+              <w:jc w:val="center"/>
+            </w:pPr>
+            <w:r/>
+            <w:r>
+              <w:rPr>
+                <w:rFonts w:ascii="Times New Roman" w:hAnsi="Times New Roman"/>
+                <w:sz w:val="16"/>
+              </w:rPr>
+              <w:t>2</w:t>
+            </w:r>
+          </w:p>
+        </w:tc>
+      </w:tr>
+      <w:tr>
+        <w:tc>
+          <w:tcPr>
+            <w:tcW w:type="dxa" w:w="1654"/>
+          </w:tcPr>
+          <w:p>
+            <w:pPr>
+              <w:jc w:val="left"/>
+            </w:pPr>
+            <w:r/>
+            <w:r>
+              <w:rPr>
+                <w:rFonts w:ascii="Times New Roman" w:hAnsi="Times New Roman"/>
+                <w:sz w:val="16"/>
+              </w:rPr>
+            </w:r>
+          </w:p>
+        </w:tc>
+        <w:tc>
+          <w:tcPr>
+            <w:tcW w:type="dxa" w:w="1654"/>
+          </w:tcPr>
+          <w:p>
+            <w:pPr>
+              <w:jc w:val="left"/>
+            </w:pPr>
+            <w:r/>
+            <w:r>
+              <w:rPr>
+                <w:rFonts w:ascii="Times New Roman" w:hAnsi="Times New Roman"/>
+                <w:sz w:val="16"/>
+              </w:rPr>
+              <w:t>Operarios, Sup. Patio, Mantenimiento y Logística</w:t>
+            </w:r>
+          </w:p>
+        </w:tc>
+        <w:tc>
+          <w:tcPr>
+            <w:tcW w:type="dxa" w:w="1654"/>
+          </w:tcPr>
+          <w:p>
+            <w:pPr>
+              <w:jc w:val="center"/>
+            </w:pPr>
+            <w:r/>
+            <w:r>
+              <w:rPr>
+                <w:rFonts w:ascii="Times New Roman" w:hAnsi="Times New Roman"/>
+                <w:sz w:val="16"/>
+              </w:rPr>
+              <w:t>0</w:t>
+            </w:r>
+          </w:p>
+        </w:tc>
+        <w:tc>
+          <w:tcPr>
+            <w:tcW w:type="dxa" w:w="1654"/>
+          </w:tcPr>
+          <w:p>
+            <w:pPr>
+              <w:jc w:val="center"/>
+            </w:pPr>
+            <w:r/>
+            <w:r>
+              <w:rPr>
+                <w:rFonts w:ascii="Times New Roman" w:hAnsi="Times New Roman"/>
+                <w:sz w:val="16"/>
+              </w:rPr>
+              <w:t>2</w:t>
+            </w:r>
+          </w:p>
+        </w:tc>
+        <w:tc>
+          <w:tcPr>
+            <w:tcW w:type="dxa" w:w="1654"/>
+          </w:tcPr>
+          <w:p>
+            <w:pPr>
+              <w:jc w:val="center"/>
+            </w:pPr>
+            <w:r/>
+            <w:r>
+              <w:rPr>
+                <w:rFonts w:ascii="Times New Roman" w:hAnsi="Times New Roman"/>
+                <w:sz w:val="16"/>
+              </w:rPr>
+              <w:t>2</w:t>
+            </w:r>
+          </w:p>
+        </w:tc>
+      </w:tr>
+      <w:tr>
+        <w:tc>
+          <w:tcPr>
+            <w:tcW w:type="dxa" w:w="1654"/>
+          </w:tcPr>
+          <w:p>
+            <w:pPr>
+              <w:jc w:val="left"/>
+            </w:pPr>
+            <w:r/>
+            <w:r>
+              <w:rPr>
+                <w:rFonts w:ascii="Times New Roman" w:hAnsi="Times New Roman"/>
+                <w:sz w:val="16"/>
+              </w:rPr>
+              <w:t>Contratación y Adm. Contratos</w:t>
+            </w:r>
+          </w:p>
+        </w:tc>
+        <w:tc>
+          <w:tcPr>
+            <w:tcW w:type="dxa" w:w="1654"/>
+          </w:tcPr>
+          <w:p>
+            <w:pPr>
+              <w:jc w:val="left"/>
+            </w:pPr>
+            <w:r/>
+            <w:r>
+              <w:rPr>
+                <w:rFonts w:ascii="Times New Roman" w:hAnsi="Times New Roman"/>
+                <w:sz w:val="16"/>
+              </w:rPr>
+              <w:t>Gerente / Estimadores, Administradores, Planificadores</w:t>
+            </w:r>
+          </w:p>
+        </w:tc>
+        <w:tc>
+          <w:tcPr>
+            <w:tcW w:type="dxa" w:w="1654"/>
+          </w:tcPr>
+          <w:p>
+            <w:pPr>
+              <w:jc w:val="center"/>
+            </w:pPr>
+            <w:r/>
+            <w:r>
+              <w:rPr>
+                <w:rFonts w:ascii="Times New Roman" w:hAnsi="Times New Roman"/>
+                <w:sz w:val="16"/>
+              </w:rPr>
+              <w:t>2</w:t>
+            </w:r>
+          </w:p>
+        </w:tc>
+        <w:tc>
+          <w:tcPr>
+            <w:tcW w:type="dxa" w:w="1654"/>
+          </w:tcPr>
+          <w:p>
+            <w:pPr>
+              <w:jc w:val="center"/>
+            </w:pPr>
+            <w:r/>
+            <w:r>
+              <w:rPr>
+                <w:rFonts w:ascii="Times New Roman" w:hAnsi="Times New Roman"/>
+                <w:sz w:val="16"/>
+              </w:rPr>
+              <w:t>1</w:t>
+            </w:r>
+          </w:p>
+        </w:tc>
+        <w:tc>
+          <w:tcPr>
+            <w:tcW w:type="dxa" w:w="1654"/>
+          </w:tcPr>
+          <w:p>
+            <w:pPr>
+              <w:jc w:val="center"/>
+            </w:pPr>
+            <w:r/>
+            <w:r>
+              <w:rPr>
+                <w:rFonts w:ascii="Times New Roman" w:hAnsi="Times New Roman"/>
+                <w:sz w:val="16"/>
+              </w:rPr>
+              <w:t>3</w:t>
+            </w:r>
+          </w:p>
+        </w:tc>
+      </w:tr>
+      <w:tr>
+        <w:tc>
+          <w:tcPr>
+            <w:tcW w:type="dxa" w:w="1654"/>
+          </w:tcPr>
+          <w:p>
+            <w:pPr>
+              <w:jc w:val="left"/>
+            </w:pPr>
+            <w:r/>
+            <w:r>
+              <w:rPr>
+                <w:rFonts w:ascii="Times New Roman" w:hAnsi="Times New Roman"/>
+                <w:sz w:val="16"/>
+              </w:rPr>
+              <w:t>Recursos Humanos</w:t>
+            </w:r>
+          </w:p>
+        </w:tc>
+        <w:tc>
+          <w:tcPr>
+            <w:tcW w:type="dxa" w:w="1654"/>
+          </w:tcPr>
+          <w:p>
+            <w:pPr>
+              <w:jc w:val="left"/>
+            </w:pPr>
+            <w:r/>
+            <w:r>
+              <w:rPr>
+                <w:rFonts w:ascii="Times New Roman" w:hAnsi="Times New Roman"/>
+                <w:sz w:val="16"/>
+              </w:rPr>
+              <w:t>Gerente de RRHH-Laborales / Asistentes</w:t>
+            </w:r>
+          </w:p>
+        </w:tc>
+        <w:tc>
+          <w:tcPr>
+            <w:tcW w:type="dxa" w:w="1654"/>
+          </w:tcPr>
+          <w:p>
+            <w:pPr>
+              <w:jc w:val="center"/>
+            </w:pPr>
+            <w:r/>
+            <w:r>
+              <w:rPr>
+                <w:rFonts w:ascii="Times New Roman" w:hAnsi="Times New Roman"/>
+                <w:sz w:val="16"/>
+              </w:rPr>
+              <w:t>2</w:t>
+            </w:r>
+          </w:p>
+        </w:tc>
+        <w:tc>
+          <w:tcPr>
+            <w:tcW w:type="dxa" w:w="1654"/>
+          </w:tcPr>
+          <w:p>
+            <w:pPr>
+              <w:jc w:val="center"/>
+            </w:pPr>
+            <w:r/>
+            <w:r>
+              <w:rPr>
+                <w:rFonts w:ascii="Times New Roman" w:hAnsi="Times New Roman"/>
+                <w:sz w:val="16"/>
+              </w:rPr>
+              <w:t>1</w:t>
+            </w:r>
+          </w:p>
+        </w:tc>
+        <w:tc>
+          <w:tcPr>
+            <w:tcW w:type="dxa" w:w="1654"/>
+          </w:tcPr>
+          <w:p>
+            <w:pPr>
+              <w:jc w:val="center"/>
+            </w:pPr>
+            <w:r/>
+            <w:r>
+              <w:rPr>
+                <w:rFonts w:ascii="Times New Roman" w:hAnsi="Times New Roman"/>
+                <w:sz w:val="16"/>
+              </w:rPr>
+              <w:t>3</w:t>
+            </w:r>
+          </w:p>
+        </w:tc>
+      </w:tr>
+      <w:tr>
+        <w:tc>
+          <w:tcPr>
+            <w:tcW w:type="dxa" w:w="1654"/>
+          </w:tcPr>
+          <w:p>
+            <w:pPr>
+              <w:jc w:val="left"/>
+            </w:pPr>
+            <w:r/>
+            <w:r>
+              <w:rPr>
+                <w:rFonts w:ascii="Times New Roman" w:hAnsi="Times New Roman"/>
+                <w:sz w:val="16"/>
+              </w:rPr>
+              <w:t>Proyectos y Producción</w:t>
+            </w:r>
+          </w:p>
+        </w:tc>
+        <w:tc>
+          <w:tcPr>
+            <w:tcW w:type="dxa" w:w="1654"/>
+          </w:tcPr>
+          <w:p>
+            <w:pPr>
+              <w:jc w:val="left"/>
+            </w:pPr>
+            <w:r/>
+            <w:r>
+              <w:rPr>
+                <w:rFonts w:ascii="Times New Roman" w:hAnsi="Times New Roman"/>
+                <w:sz w:val="16"/>
+              </w:rPr>
+              <w:t>Gerentes de Proyecto, Optimización y Servicios</w:t>
+            </w:r>
+          </w:p>
+        </w:tc>
+        <w:tc>
+          <w:tcPr>
+            <w:tcW w:type="dxa" w:w="1654"/>
+          </w:tcPr>
+          <w:p>
+            <w:pPr>
+              <w:jc w:val="center"/>
+            </w:pPr>
+            <w:r/>
+            <w:r>
+              <w:rPr>
+                <w:rFonts w:ascii="Times New Roman" w:hAnsi="Times New Roman"/>
+                <w:sz w:val="16"/>
+              </w:rPr>
+              <w:t>1</w:t>
+            </w:r>
+          </w:p>
+        </w:tc>
+        <w:tc>
+          <w:tcPr>
+            <w:tcW w:type="dxa" w:w="1654"/>
+          </w:tcPr>
+          <w:p>
+            <w:pPr>
+              <w:jc w:val="center"/>
+            </w:pPr>
+            <w:r/>
+            <w:r>
+              <w:rPr>
+                <w:rFonts w:ascii="Times New Roman" w:hAnsi="Times New Roman"/>
+                <w:sz w:val="16"/>
+              </w:rPr>
+              <w:t>2</w:t>
+            </w:r>
+          </w:p>
+        </w:tc>
+        <w:tc>
+          <w:tcPr>
+            <w:tcW w:type="dxa" w:w="1654"/>
+          </w:tcPr>
+          <w:p>
+            <w:pPr>
+              <w:jc w:val="center"/>
+            </w:pPr>
+            <w:r/>
+            <w:r>
+              <w:rPr>
+                <w:rFonts w:ascii="Times New Roman" w:hAnsi="Times New Roman"/>
+                <w:sz w:val="16"/>
+              </w:rPr>
+              <w:t>3</w:t>
+            </w:r>
+          </w:p>
+        </w:tc>
+      </w:tr>
+      <w:tr>
+        <w:tc>
+          <w:tcPr>
+            <w:tcW w:type="dxa" w:w="1654"/>
+          </w:tcPr>
+          <w:p>
+            <w:pPr>
+              <w:jc w:val="left"/>
+            </w:pPr>
+            <w:r/>
+            <w:r>
+              <w:rPr>
+                <w:rFonts w:ascii="Times New Roman" w:hAnsi="Times New Roman"/>
+                <w:sz w:val="16"/>
+              </w:rPr>
+            </w:r>
+          </w:p>
+        </w:tc>
+        <w:tc>
+          <w:tcPr>
+            <w:tcW w:type="dxa" w:w="1654"/>
+          </w:tcPr>
+          <w:p>
+            <w:pPr>
+              <w:jc w:val="left"/>
+            </w:pPr>
+            <w:r/>
+            <w:r>
+              <w:rPr>
+                <w:rFonts w:ascii="Times New Roman" w:hAnsi="Times New Roman"/>
+                <w:sz w:val="16"/>
+              </w:rPr>
+              <w:t>Gerente Metalmecánico</w:t>
+            </w:r>
+          </w:p>
+        </w:tc>
+        <w:tc>
+          <w:tcPr>
+            <w:tcW w:type="dxa" w:w="1654"/>
+          </w:tcPr>
+          <w:p>
+            <w:pPr>
+              <w:jc w:val="center"/>
+            </w:pPr>
+            <w:r/>
+            <w:r>
+              <w:rPr>
+                <w:rFonts w:ascii="Times New Roman" w:hAnsi="Times New Roman"/>
+                <w:sz w:val="16"/>
+              </w:rPr>
+              <w:t>0</w:t>
+            </w:r>
+          </w:p>
+        </w:tc>
+        <w:tc>
+          <w:tcPr>
+            <w:tcW w:type="dxa" w:w="1654"/>
+          </w:tcPr>
+          <w:p>
+            <w:pPr>
+              <w:jc w:val="center"/>
+            </w:pPr>
+            <w:r/>
+            <w:r>
+              <w:rPr>
+                <w:rFonts w:ascii="Times New Roman" w:hAnsi="Times New Roman"/>
+                <w:sz w:val="16"/>
+              </w:rPr>
+              <w:t>1</w:t>
+            </w:r>
+          </w:p>
+        </w:tc>
+        <w:tc>
+          <w:tcPr>
+            <w:tcW w:type="dxa" w:w="1654"/>
+          </w:tcPr>
+          <w:p>
+            <w:pPr>
+              <w:jc w:val="center"/>
+            </w:pPr>
+            <w:r/>
+            <w:r>
+              <w:rPr>
+                <w:rFonts w:ascii="Times New Roman" w:hAnsi="Times New Roman"/>
+                <w:sz w:val="16"/>
+              </w:rPr>
+              <w:t>1</w:t>
+            </w:r>
+          </w:p>
+        </w:tc>
+      </w:tr>
+      <w:tr>
+        <w:tc>
+          <w:tcPr>
+            <w:tcW w:type="dxa" w:w="1654"/>
+          </w:tcPr>
+          <w:p>
+            <w:pPr>
+              <w:jc w:val="left"/>
+            </w:pPr>
+            <w:r/>
+            <w:r>
+              <w:rPr>
+                <w:rFonts w:ascii="Times New Roman" w:hAnsi="Times New Roman"/>
+                <w:sz w:val="16"/>
+              </w:rPr>
+              <w:t>Ingeniería y Campo</w:t>
+            </w:r>
+          </w:p>
+        </w:tc>
+        <w:tc>
+          <w:tcPr>
+            <w:tcW w:type="dxa" w:w="1654"/>
+          </w:tcPr>
+          <w:p>
+            <w:pPr>
+              <w:jc w:val="left"/>
+            </w:pPr>
+            <w:r/>
+            <w:r>
+              <w:rPr>
+                <w:rFonts w:ascii="Times New Roman" w:hAnsi="Times New Roman"/>
+                <w:sz w:val="16"/>
+              </w:rPr>
+              <w:t>Ingenieros Residentes / Coordinadores (SIHO-A, Calidad)</w:t>
+            </w:r>
+          </w:p>
+        </w:tc>
+        <w:tc>
+          <w:tcPr>
+            <w:tcW w:type="dxa" w:w="1654"/>
+          </w:tcPr>
+          <w:p>
+            <w:pPr>
+              <w:jc w:val="center"/>
+            </w:pPr>
+            <w:r/>
+            <w:r>
+              <w:rPr>
+                <w:rFonts w:ascii="Times New Roman" w:hAnsi="Times New Roman"/>
+                <w:sz w:val="16"/>
+              </w:rPr>
+              <w:t>2</w:t>
+            </w:r>
+          </w:p>
+        </w:tc>
+        <w:tc>
+          <w:tcPr>
+            <w:tcW w:type="dxa" w:w="1654"/>
+          </w:tcPr>
+          <w:p>
+            <w:pPr>
+              <w:jc w:val="center"/>
+            </w:pPr>
+            <w:r/>
+            <w:r>
+              <w:rPr>
+                <w:rFonts w:ascii="Times New Roman" w:hAnsi="Times New Roman"/>
+                <w:sz w:val="16"/>
+              </w:rPr>
+              <w:t>3</w:t>
+            </w:r>
+          </w:p>
+        </w:tc>
+        <w:tc>
+          <w:tcPr>
+            <w:tcW w:type="dxa" w:w="1654"/>
+          </w:tcPr>
+          <w:p>
+            <w:pPr>
+              <w:jc w:val="center"/>
+            </w:pPr>
+            <w:r/>
+            <w:r>
+              <w:rPr>
+                <w:rFonts w:ascii="Times New Roman" w:hAnsi="Times New Roman"/>
+                <w:sz w:val="16"/>
+              </w:rPr>
+              <w:t>5</w:t>
+            </w:r>
+          </w:p>
+        </w:tc>
+      </w:tr>
+      <w:tr>
+        <w:tc>
+          <w:tcPr>
+            <w:tcW w:type="dxa" w:w="1654"/>
+          </w:tcPr>
+          <w:p>
+            <w:pPr>
+              <w:jc w:val="left"/>
+            </w:pPr>
+            <w:r/>
+            <w:r>
+              <w:rPr>
+                <w:rFonts w:ascii="Times New Roman" w:hAnsi="Times New Roman"/>
+                <w:sz w:val="16"/>
+              </w:rPr>
+            </w:r>
+          </w:p>
+        </w:tc>
+        <w:tc>
+          <w:tcPr>
+            <w:tcW w:type="dxa" w:w="1654"/>
+          </w:tcPr>
+          <w:p>
+            <w:pPr>
+              <w:jc w:val="left"/>
+            </w:pPr>
+            <w:r/>
+            <w:r>
+              <w:rPr>
+                <w:rFonts w:ascii="Times New Roman" w:hAnsi="Times New Roman"/>
+                <w:sz w:val="16"/>
+              </w:rPr>
+              <w:t>Inspectores (SIHO, Ambiente, Paramédicos, Calidad)</w:t>
+            </w:r>
+          </w:p>
+        </w:tc>
+        <w:tc>
+          <w:tcPr>
+            <w:tcW w:type="dxa" w:w="1654"/>
+          </w:tcPr>
+          <w:p>
+            <w:pPr>
+              <w:jc w:val="center"/>
+            </w:pPr>
+            <w:r/>
+            <w:r>
+              <w:rPr>
+                <w:rFonts w:ascii="Times New Roman" w:hAnsi="Times New Roman"/>
+                <w:sz w:val="16"/>
+              </w:rPr>
+              <w:t>2</w:t>
+            </w:r>
+          </w:p>
+        </w:tc>
+        <w:tc>
+          <w:tcPr>
+            <w:tcW w:type="dxa" w:w="1654"/>
+          </w:tcPr>
+          <w:p>
+            <w:pPr>
+              <w:jc w:val="center"/>
+            </w:pPr>
+            <w:r/>
+            <w:r>
+              <w:rPr>
+                <w:rFonts w:ascii="Times New Roman" w:hAnsi="Times New Roman"/>
+                <w:sz w:val="16"/>
+              </w:rPr>
+              <w:t>2</w:t>
+            </w:r>
+          </w:p>
+        </w:tc>
+        <w:tc>
+          <w:tcPr>
+            <w:tcW w:type="dxa" w:w="1654"/>
+          </w:tcPr>
+          <w:p>
+            <w:pPr>
+              <w:jc w:val="center"/>
+            </w:pPr>
+            <w:r/>
+            <w:r>
+              <w:rPr>
+                <w:rFonts w:ascii="Times New Roman" w:hAnsi="Times New Roman"/>
+                <w:sz w:val="16"/>
+              </w:rPr>
+              <w:t>4</w:t>
+            </w:r>
+          </w:p>
+        </w:tc>
+      </w:tr>
+      <w:tr>
+        <w:tc>
+          <w:tcPr>
+            <w:tcW w:type="dxa" w:w="1654"/>
+          </w:tcPr>
+          <w:p>
+            <w:pPr>
+              <w:jc w:val="left"/>
+            </w:pPr>
+            <w:r/>
+            <w:r>
+              <w:rPr>
+                <w:rFonts w:ascii="Times New Roman" w:hAnsi="Times New Roman"/>
+                <w:sz w:val="16"/>
+              </w:rPr>
+            </w:r>
+          </w:p>
+        </w:tc>
+        <w:tc>
+          <w:tcPr>
+            <w:tcW w:type="dxa" w:w="1654"/>
+          </w:tcPr>
+          <w:p>
+            <w:pPr>
+              <w:jc w:val="left"/>
+            </w:pPr>
+            <w:r/>
+            <w:r>
+              <w:rPr>
+                <w:rFonts w:ascii="Times New Roman" w:hAnsi="Times New Roman"/>
+                <w:sz w:val="16"/>
+              </w:rPr>
+              <w:t>Supervisor de Obras, Operadores, Chóferes, Soldadores, Obreros</w:t>
+            </w:r>
+          </w:p>
+        </w:tc>
+        <w:tc>
+          <w:tcPr>
+            <w:tcW w:type="dxa" w:w="1654"/>
+          </w:tcPr>
+          <w:p>
+            <w:pPr>
+              <w:jc w:val="center"/>
+            </w:pPr>
+            <w:r/>
+            <w:r>
+              <w:rPr>
+                <w:rFonts w:ascii="Times New Roman" w:hAnsi="Times New Roman"/>
+                <w:sz w:val="16"/>
+              </w:rPr>
+              <w:t>1</w:t>
+            </w:r>
+          </w:p>
+        </w:tc>
+        <w:tc>
+          <w:tcPr>
+            <w:tcW w:type="dxa" w:w="1654"/>
+          </w:tcPr>
+          <w:p>
+            <w:pPr>
+              <w:jc w:val="center"/>
+            </w:pPr>
+            <w:r/>
+            <w:r>
+              <w:rPr>
+                <w:rFonts w:ascii="Times New Roman" w:hAnsi="Times New Roman"/>
+                <w:sz w:val="16"/>
+              </w:rPr>
+              <w:t>10</w:t>
+            </w:r>
+          </w:p>
+        </w:tc>
+        <w:tc>
+          <w:tcPr>
+            <w:tcW w:type="dxa" w:w="1654"/>
+          </w:tcPr>
+          <w:p>
+            <w:pPr>
+              <w:jc w:val="center"/>
+            </w:pPr>
+            <w:r/>
+            <w:r>
+              <w:rPr>
+                <w:rFonts w:ascii="Times New Roman" w:hAnsi="Times New Roman"/>
+                <w:sz w:val="16"/>
+              </w:rPr>
+              <w:t>11</w:t>
+            </w:r>
+          </w:p>
+        </w:tc>
+      </w:tr>
+      <w:tr>
+        <w:tc>
+          <w:tcPr>
+            <w:tcW w:type="dxa" w:w="1654"/>
+          </w:tcPr>
+          <w:p>
+            <w:pPr>
+              <w:jc w:val="left"/>
+            </w:pPr>
+            <w:r/>
+            <w:r>
+              <w:rPr>
+                <w:rFonts w:ascii="Times New Roman" w:hAnsi="Times New Roman"/>
+                <w:b/>
+                <w:sz w:val="16"/>
+              </w:rPr>
+              <w:t>**TOTAL GENERAL**</w:t>
+            </w:r>
+          </w:p>
+        </w:tc>
+        <w:tc>
+          <w:tcPr>
+            <w:tcW w:type="dxa" w:w="1654"/>
+          </w:tcPr>
+          <w:p>
+            <w:pPr>
+              <w:jc w:val="left"/>
+            </w:pPr>
+            <w:r/>
+            <w:r>
+              <w:rPr>
+                <w:rFonts w:ascii="Times New Roman" w:hAnsi="Times New Roman"/>
+                <w:sz w:val="16"/>
+              </w:rPr>
+            </w:r>
+          </w:p>
+        </w:tc>
+        <w:tc>
+          <w:tcPr>
+            <w:tcW w:type="dxa" w:w="1654"/>
+          </w:tcPr>
+          <w:p>
+            <w:pPr>
+              <w:jc w:val="center"/>
+            </w:pPr>
+            <w:r/>
+            <w:r>
+              <w:rPr>
+                <w:rFonts w:ascii="Times New Roman" w:hAnsi="Times New Roman"/>
+                <w:sz w:val="16"/>
+              </w:rPr>
+              <w:t>14</w:t>
+            </w:r>
+          </w:p>
+        </w:tc>
+        <w:tc>
+          <w:tcPr>
+            <w:tcW w:type="dxa" w:w="1654"/>
+          </w:tcPr>
+          <w:p>
+            <w:pPr>
+              <w:jc w:val="center"/>
+            </w:pPr>
+            <w:r/>
+            <w:r>
+              <w:rPr>
+                <w:rFonts w:ascii="Times New Roman" w:hAnsi="Times New Roman"/>
+                <w:sz w:val="16"/>
+              </w:rPr>
+              <w:t>28</w:t>
+            </w:r>
+          </w:p>
+        </w:tc>
+        <w:tc>
+          <w:tcPr>
+            <w:tcW w:type="dxa" w:w="1654"/>
+          </w:tcPr>
+          <w:p>
+            <w:pPr>
+              <w:jc w:val="center"/>
+            </w:pPr>
+            <w:r/>
+            <w:r>
+              <w:rPr>
+                <w:rFonts w:ascii="Times New Roman" w:hAnsi="Times New Roman"/>
+                <w:sz w:val="16"/>
+              </w:rPr>
+              <w:t>42</w:t>
+            </w:r>
+          </w:p>
+        </w:tc>
+      </w:tr>
+    </w:tbl>
+    <w:p>
+      <w:pPr>
+        <w:spacing w:before="120"/>
       </w:pPr>
       <w:r>
         <w:rPr>
           <w:rFonts w:ascii="Times New Roman" w:hAnsi="Times New Roman"/>
-          <w:i w:val="0"/>
-          <w:sz w:val="24"/>
-        </w:rPr>
-        <w:t>La población de trabajadores de Lubricantes y Equipos Varyná C.A. está conformada por un total de cuarenta y dos (42) trabajadores, distribuidos en catorce (14) del sexo femenino y veintiocho (28) del sexo masculino, organizados en los siguientes departamentos y áreas operativas:</w:t>
-      </w:r>
-    </w:p>
-    <w:p>
-      <w:pPr>
-        <w:spacing w:line="360" w:lineRule="auto" w:after="0" w:before="0"/>
-        <w:ind w:firstLine="709"/>
-        <w:jc w:val="both"/>
-      </w:pPr>
-      <w:r>
-        <w:rPr>
-          <w:rFonts w:ascii="Times New Roman" w:hAnsi="Times New Roman"/>
-          <w:i w:val="0"/>
-          <w:sz w:val="24"/>
-        </w:rPr>
-        <w:t>En la Alta Dirección labora 1 Gerente General (masculino). En la Dirección Operativa, 1 Gerente de Operaciones (masculino). En Control y Avance y Operaciones Morichal, 2 trabajadores (1 femenino, 1 masculino).</w:t>
-      </w:r>
-    </w:p>
-    <w:p>
-      <w:pPr>
-        <w:spacing w:line="360" w:lineRule="auto" w:after="0" w:before="0"/>
-        <w:ind w:firstLine="709"/>
-        <w:jc w:val="both"/>
-      </w:pPr>
-      <w:r>
-        <w:rPr>
-          <w:rFonts w:ascii="Times New Roman" w:hAnsi="Times New Roman"/>
-          <w:i w:val="0"/>
-          <w:sz w:val="24"/>
-        </w:rPr>
-        <w:t>En el Departamento Administrativo, área donde se desarrolla la pasantía, se desempeñan 3 trabajadores en Administración y Asistentes Administrativos (2 femenino, 1 masculino); 2 en Control de Avance, Logística y Compras o Procura (1 femenino, 1 masculino); y 2 operarios, supervisores de patio, mantenimiento y logística (masculino).</w:t>
-      </w:r>
-    </w:p>
-    <w:p>
-      <w:pPr>
-        <w:spacing w:line="360" w:lineRule="auto" w:after="0" w:before="0"/>
-        <w:ind w:firstLine="709"/>
-        <w:jc w:val="both"/>
-      </w:pPr>
-      <w:r>
-        <w:rPr>
-          <w:rFonts w:ascii="Times New Roman" w:hAnsi="Times New Roman"/>
-          <w:i w:val="0"/>
-          <w:sz w:val="24"/>
-        </w:rPr>
-        <w:t>En Contratación y Administración de Contratos laboran 3 trabajadores (2 femenino, 1 masculino). En Recursos Humanos, 3 trabajadores (2 femenino, 1 masculino).</w:t>
-      </w:r>
-    </w:p>
-    <w:p>
-      <w:pPr>
-        <w:spacing w:line="360" w:lineRule="auto" w:after="0" w:before="0"/>
-        <w:ind w:firstLine="709"/>
-        <w:jc w:val="both"/>
-      </w:pPr>
-      <w:r>
-        <w:rPr>
-          <w:rFonts w:ascii="Times New Roman" w:hAnsi="Times New Roman"/>
-          <w:i w:val="0"/>
-          <w:sz w:val="24"/>
-        </w:rPr>
-        <w:t>En Proyectos y Producción se desempeñan 3 Gerentes de Proyecto, Optimización y Servicios (1 femenino, 2 masculino); y 1 Gerente Metalmecánico (masculino).</w:t>
-      </w:r>
-    </w:p>
-    <w:p>
-      <w:pPr>
-        <w:spacing w:line="360" w:lineRule="auto" w:after="0" w:before="0"/>
-        <w:ind w:firstLine="709"/>
-        <w:jc w:val="both"/>
-      </w:pPr>
-      <w:r>
-        <w:rPr>
-          <w:rFonts w:ascii="Times New Roman" w:hAnsi="Times New Roman"/>
-          <w:i w:val="0"/>
-          <w:sz w:val="24"/>
-        </w:rPr>
-        <w:t>En Ingeniería y Campo laboran 5 Ingenieros Residentes y Coordinadores de SIHO-A y Calidad (2 femenino, 3 masculino); 4 Inspectores de SIHO, Ambiente, Paramédicos y Calidad (2 femenino, 2 masculino); y 11 Supervisores de Obras, Operadores, Chóferes, Soldadores y Obreros (1 femenino, 10 masculino).</w:t>
-      </w:r>
-    </w:p>
-    <w:p>
-      <w:pPr>
-        <w:spacing w:line="360" w:lineRule="auto" w:after="0" w:before="0"/>
-        <w:ind w:firstLine="709"/>
-        <w:jc w:val="both"/>
-      </w:pPr>
-      <w:r>
-        <w:rPr>
-          <w:rFonts w:ascii="Times New Roman" w:hAnsi="Times New Roman"/>
-          <w:i w:val="0"/>
-          <w:sz w:val="24"/>
+          <w:i/>
+          <w:sz w:val="16"/>
         </w:rPr>
         <w:t>Fuente: Departamento Administrativo de Lubricantes y Equipos Varyna, C.A. (2026).</w:t>
       </w:r>

</xml_diff>

<commit_message>
Poblacion tabla: columnas 3.5+5.09+2+2+2cm como el Gantt
</commit_message>
<xml_diff>
--- a/keidy/reportes/Informe_Pasantia_IUTECP.docx
+++ b/keidy/reportes/Informe_Pasantia_IUTECP.docx
@@ -2453,18 +2453,19 @@
         <w:tblW w:type="auto" w:w="0"/>
         <w:jc w:val="center"/>
         <w:tblLook w:firstColumn="1" w:firstRow="1" w:lastColumn="0" w:lastRow="0" w:noHBand="0" w:noVBand="1" w:val="04A0"/>
+        <w:tblLayout w:type="fixed"/>
       </w:tblPr>
       <w:tblGrid>
-        <w:gridCol w:w="1654"/>
-        <w:gridCol w:w="1654"/>
-        <w:gridCol w:w="1654"/>
-        <w:gridCol w:w="1654"/>
-        <w:gridCol w:w="1654"/>
+        <w:gridCol w:w="1984"/>
+        <w:gridCol w:w="2886"/>
+        <w:gridCol w:w="1134"/>
+        <w:gridCol w:w="1134"/>
+        <w:gridCol w:w="1134"/>
       </w:tblGrid>
       <w:tr>
         <w:tc>
           <w:tcPr>
-            <w:tcW w:type="dxa" w:w="1654"/>
+            <w:tcW w:type="dxa" w:w="1984"/>
             <w:shd w:fill="D9E2F3"/>
           </w:tcPr>
           <w:p>
@@ -2484,7 +2485,7 @@
         </w:tc>
         <w:tc>
           <w:tcPr>
-            <w:tcW w:type="dxa" w:w="1654"/>
+            <w:tcW w:type="dxa" w:w="2886"/>
             <w:shd w:fill="D9E2F3"/>
           </w:tcPr>
           <w:p>
@@ -2504,7 +2505,7 @@
         </w:tc>
         <w:tc>
           <w:tcPr>
-            <w:tcW w:type="dxa" w:w="1654"/>
+            <w:tcW w:type="dxa" w:w="1134"/>
             <w:shd w:fill="D9E2F3"/>
           </w:tcPr>
           <w:p>
@@ -2524,7 +2525,7 @@
         </w:tc>
         <w:tc>
           <w:tcPr>
-            <w:tcW w:type="dxa" w:w="1654"/>
+            <w:tcW w:type="dxa" w:w="1134"/>
             <w:shd w:fill="D9E2F3"/>
           </w:tcPr>
           <w:p>
@@ -2544,7 +2545,7 @@
         </w:tc>
         <w:tc>
           <w:tcPr>
-            <w:tcW w:type="dxa" w:w="1654"/>
+            <w:tcW w:type="dxa" w:w="1134"/>
             <w:shd w:fill="D9E2F3"/>
           </w:tcPr>
           <w:p>
@@ -2566,7 +2567,7 @@
       <w:tr>
         <w:tc>
           <w:tcPr>
-            <w:tcW w:type="dxa" w:w="1654"/>
+            <w:tcW w:type="dxa" w:w="1984"/>
           </w:tcPr>
           <w:p>
             <w:pPr>
@@ -2584,7 +2585,7 @@
         </w:tc>
         <w:tc>
           <w:tcPr>
-            <w:tcW w:type="dxa" w:w="1654"/>
+            <w:tcW w:type="dxa" w:w="2886"/>
           </w:tcPr>
           <w:p>
             <w:pPr>
@@ -2602,7 +2603,7 @@
         </w:tc>
         <w:tc>
           <w:tcPr>
-            <w:tcW w:type="dxa" w:w="1654"/>
+            <w:tcW w:type="dxa" w:w="1134"/>
           </w:tcPr>
           <w:p>
             <w:pPr>
@@ -2620,7 +2621,7 @@
         </w:tc>
         <w:tc>
           <w:tcPr>
-            <w:tcW w:type="dxa" w:w="1654"/>
+            <w:tcW w:type="dxa" w:w="1134"/>
           </w:tcPr>
           <w:p>
             <w:pPr>
@@ -2638,7 +2639,7 @@
         </w:tc>
         <w:tc>
           <w:tcPr>
-            <w:tcW w:type="dxa" w:w="1654"/>
+            <w:tcW w:type="dxa" w:w="1134"/>
           </w:tcPr>
           <w:p>
             <w:pPr>
@@ -2658,7 +2659,7 @@
       <w:tr>
         <w:tc>
           <w:tcPr>
-            <w:tcW w:type="dxa" w:w="1654"/>
+            <w:tcW w:type="dxa" w:w="1984"/>
           </w:tcPr>
           <w:p>
             <w:pPr>
@@ -2676,7 +2677,7 @@
         </w:tc>
         <w:tc>
           <w:tcPr>
-            <w:tcW w:type="dxa" w:w="1654"/>
+            <w:tcW w:type="dxa" w:w="2886"/>
           </w:tcPr>
           <w:p>
             <w:pPr>
@@ -2694,7 +2695,7 @@
         </w:tc>
         <w:tc>
           <w:tcPr>
-            <w:tcW w:type="dxa" w:w="1654"/>
+            <w:tcW w:type="dxa" w:w="1134"/>
           </w:tcPr>
           <w:p>
             <w:pPr>
@@ -2712,7 +2713,7 @@
         </w:tc>
         <w:tc>
           <w:tcPr>
-            <w:tcW w:type="dxa" w:w="1654"/>
+            <w:tcW w:type="dxa" w:w="1134"/>
           </w:tcPr>
           <w:p>
             <w:pPr>
@@ -2730,7 +2731,7 @@
         </w:tc>
         <w:tc>
           <w:tcPr>
-            <w:tcW w:type="dxa" w:w="1654"/>
+            <w:tcW w:type="dxa" w:w="1134"/>
           </w:tcPr>
           <w:p>
             <w:pPr>
@@ -2750,7 +2751,7 @@
       <w:tr>
         <w:tc>
           <w:tcPr>
-            <w:tcW w:type="dxa" w:w="1654"/>
+            <w:tcW w:type="dxa" w:w="1984"/>
           </w:tcPr>
           <w:p>
             <w:pPr>
@@ -2768,7 +2769,7 @@
         </w:tc>
         <w:tc>
           <w:tcPr>
-            <w:tcW w:type="dxa" w:w="1654"/>
+            <w:tcW w:type="dxa" w:w="2886"/>
           </w:tcPr>
           <w:p>
             <w:pPr>
@@ -2786,7 +2787,7 @@
         </w:tc>
         <w:tc>
           <w:tcPr>
-            <w:tcW w:type="dxa" w:w="1654"/>
+            <w:tcW w:type="dxa" w:w="1134"/>
           </w:tcPr>
           <w:p>
             <w:pPr>
@@ -2804,7 +2805,7 @@
         </w:tc>
         <w:tc>
           <w:tcPr>
-            <w:tcW w:type="dxa" w:w="1654"/>
+            <w:tcW w:type="dxa" w:w="1134"/>
           </w:tcPr>
           <w:p>
             <w:pPr>
@@ -2822,7 +2823,7 @@
         </w:tc>
         <w:tc>
           <w:tcPr>
-            <w:tcW w:type="dxa" w:w="1654"/>
+            <w:tcW w:type="dxa" w:w="1134"/>
           </w:tcPr>
           <w:p>
             <w:pPr>
@@ -2842,7 +2843,7 @@
       <w:tr>
         <w:tc>
           <w:tcPr>
-            <w:tcW w:type="dxa" w:w="1654"/>
+            <w:tcW w:type="dxa" w:w="1984"/>
           </w:tcPr>
           <w:p>
             <w:pPr>
@@ -2860,7 +2861,7 @@
         </w:tc>
         <w:tc>
           <w:tcPr>
-            <w:tcW w:type="dxa" w:w="1654"/>
+            <w:tcW w:type="dxa" w:w="2886"/>
           </w:tcPr>
           <w:p>
             <w:pPr>
@@ -2878,7 +2879,7 @@
         </w:tc>
         <w:tc>
           <w:tcPr>
-            <w:tcW w:type="dxa" w:w="1654"/>
+            <w:tcW w:type="dxa" w:w="1134"/>
           </w:tcPr>
           <w:p>
             <w:pPr>
@@ -2896,7 +2897,7 @@
         </w:tc>
         <w:tc>
           <w:tcPr>
-            <w:tcW w:type="dxa" w:w="1654"/>
+            <w:tcW w:type="dxa" w:w="1134"/>
           </w:tcPr>
           <w:p>
             <w:pPr>
@@ -2914,7 +2915,7 @@
         </w:tc>
         <w:tc>
           <w:tcPr>
-            <w:tcW w:type="dxa" w:w="1654"/>
+            <w:tcW w:type="dxa" w:w="1134"/>
           </w:tcPr>
           <w:p>
             <w:pPr>
@@ -2934,7 +2935,7 @@
       <w:tr>
         <w:tc>
           <w:tcPr>
-            <w:tcW w:type="dxa" w:w="1654"/>
+            <w:tcW w:type="dxa" w:w="1984"/>
           </w:tcPr>
           <w:p>
             <w:pPr>
@@ -2951,7 +2952,7 @@
         </w:tc>
         <w:tc>
           <w:tcPr>
-            <w:tcW w:type="dxa" w:w="1654"/>
+            <w:tcW w:type="dxa" w:w="2886"/>
           </w:tcPr>
           <w:p>
             <w:pPr>
@@ -2969,7 +2970,7 @@
         </w:tc>
         <w:tc>
           <w:tcPr>
-            <w:tcW w:type="dxa" w:w="1654"/>
+            <w:tcW w:type="dxa" w:w="1134"/>
           </w:tcPr>
           <w:p>
             <w:pPr>
@@ -2987,7 +2988,7 @@
         </w:tc>
         <w:tc>
           <w:tcPr>
-            <w:tcW w:type="dxa" w:w="1654"/>
+            <w:tcW w:type="dxa" w:w="1134"/>
           </w:tcPr>
           <w:p>
             <w:pPr>
@@ -3005,7 +3006,7 @@
         </w:tc>
         <w:tc>
           <w:tcPr>
-            <w:tcW w:type="dxa" w:w="1654"/>
+            <w:tcW w:type="dxa" w:w="1134"/>
           </w:tcPr>
           <w:p>
             <w:pPr>
@@ -3025,7 +3026,7 @@
       <w:tr>
         <w:tc>
           <w:tcPr>
-            <w:tcW w:type="dxa" w:w="1654"/>
+            <w:tcW w:type="dxa" w:w="1984"/>
           </w:tcPr>
           <w:p>
             <w:pPr>
@@ -3042,7 +3043,7 @@
         </w:tc>
         <w:tc>
           <w:tcPr>
-            <w:tcW w:type="dxa" w:w="1654"/>
+            <w:tcW w:type="dxa" w:w="2886"/>
           </w:tcPr>
           <w:p>
             <w:pPr>
@@ -3060,7 +3061,7 @@
         </w:tc>
         <w:tc>
           <w:tcPr>
-            <w:tcW w:type="dxa" w:w="1654"/>
+            <w:tcW w:type="dxa" w:w="1134"/>
           </w:tcPr>
           <w:p>
             <w:pPr>
@@ -3078,7 +3079,7 @@
         </w:tc>
         <w:tc>
           <w:tcPr>
-            <w:tcW w:type="dxa" w:w="1654"/>
+            <w:tcW w:type="dxa" w:w="1134"/>
           </w:tcPr>
           <w:p>
             <w:pPr>
@@ -3096,7 +3097,7 @@
         </w:tc>
         <w:tc>
           <w:tcPr>
-            <w:tcW w:type="dxa" w:w="1654"/>
+            <w:tcW w:type="dxa" w:w="1134"/>
           </w:tcPr>
           <w:p>
             <w:pPr>
@@ -3116,7 +3117,7 @@
       <w:tr>
         <w:tc>
           <w:tcPr>
-            <w:tcW w:type="dxa" w:w="1654"/>
+            <w:tcW w:type="dxa" w:w="1984"/>
           </w:tcPr>
           <w:p>
             <w:pPr>
@@ -3134,7 +3135,7 @@
         </w:tc>
         <w:tc>
           <w:tcPr>
-            <w:tcW w:type="dxa" w:w="1654"/>
+            <w:tcW w:type="dxa" w:w="2886"/>
           </w:tcPr>
           <w:p>
             <w:pPr>
@@ -3152,7 +3153,7 @@
         </w:tc>
         <w:tc>
           <w:tcPr>
-            <w:tcW w:type="dxa" w:w="1654"/>
+            <w:tcW w:type="dxa" w:w="1134"/>
           </w:tcPr>
           <w:p>
             <w:pPr>
@@ -3170,7 +3171,7 @@
         </w:tc>
         <w:tc>
           <w:tcPr>
-            <w:tcW w:type="dxa" w:w="1654"/>
+            <w:tcW w:type="dxa" w:w="1134"/>
           </w:tcPr>
           <w:p>
             <w:pPr>
@@ -3188,7 +3189,7 @@
         </w:tc>
         <w:tc>
           <w:tcPr>
-            <w:tcW w:type="dxa" w:w="1654"/>
+            <w:tcW w:type="dxa" w:w="1134"/>
           </w:tcPr>
           <w:p>
             <w:pPr>
@@ -3208,7 +3209,7 @@
       <w:tr>
         <w:tc>
           <w:tcPr>
-            <w:tcW w:type="dxa" w:w="1654"/>
+            <w:tcW w:type="dxa" w:w="1984"/>
           </w:tcPr>
           <w:p>
             <w:pPr>
@@ -3226,7 +3227,7 @@
         </w:tc>
         <w:tc>
           <w:tcPr>
-            <w:tcW w:type="dxa" w:w="1654"/>
+            <w:tcW w:type="dxa" w:w="2886"/>
           </w:tcPr>
           <w:p>
             <w:pPr>
@@ -3244,7 +3245,7 @@
         </w:tc>
         <w:tc>
           <w:tcPr>
-            <w:tcW w:type="dxa" w:w="1654"/>
+            <w:tcW w:type="dxa" w:w="1134"/>
           </w:tcPr>
           <w:p>
             <w:pPr>
@@ -3262,7 +3263,7 @@
         </w:tc>
         <w:tc>
           <w:tcPr>
-            <w:tcW w:type="dxa" w:w="1654"/>
+            <w:tcW w:type="dxa" w:w="1134"/>
           </w:tcPr>
           <w:p>
             <w:pPr>
@@ -3280,7 +3281,7 @@
         </w:tc>
         <w:tc>
           <w:tcPr>
-            <w:tcW w:type="dxa" w:w="1654"/>
+            <w:tcW w:type="dxa" w:w="1134"/>
           </w:tcPr>
           <w:p>
             <w:pPr>
@@ -3300,7 +3301,7 @@
       <w:tr>
         <w:tc>
           <w:tcPr>
-            <w:tcW w:type="dxa" w:w="1654"/>
+            <w:tcW w:type="dxa" w:w="1984"/>
           </w:tcPr>
           <w:p>
             <w:pPr>
@@ -3318,7 +3319,7 @@
         </w:tc>
         <w:tc>
           <w:tcPr>
-            <w:tcW w:type="dxa" w:w="1654"/>
+            <w:tcW w:type="dxa" w:w="2886"/>
           </w:tcPr>
           <w:p>
             <w:pPr>
@@ -3336,7 +3337,7 @@
         </w:tc>
         <w:tc>
           <w:tcPr>
-            <w:tcW w:type="dxa" w:w="1654"/>
+            <w:tcW w:type="dxa" w:w="1134"/>
           </w:tcPr>
           <w:p>
             <w:pPr>
@@ -3354,7 +3355,7 @@
         </w:tc>
         <w:tc>
           <w:tcPr>
-            <w:tcW w:type="dxa" w:w="1654"/>
+            <w:tcW w:type="dxa" w:w="1134"/>
           </w:tcPr>
           <w:p>
             <w:pPr>
@@ -3372,7 +3373,7 @@
         </w:tc>
         <w:tc>
           <w:tcPr>
-            <w:tcW w:type="dxa" w:w="1654"/>
+            <w:tcW w:type="dxa" w:w="1134"/>
           </w:tcPr>
           <w:p>
             <w:pPr>
@@ -3392,7 +3393,7 @@
       <w:tr>
         <w:tc>
           <w:tcPr>
-            <w:tcW w:type="dxa" w:w="1654"/>
+            <w:tcW w:type="dxa" w:w="1984"/>
           </w:tcPr>
           <w:p>
             <w:pPr>
@@ -3409,7 +3410,7 @@
         </w:tc>
         <w:tc>
           <w:tcPr>
-            <w:tcW w:type="dxa" w:w="1654"/>
+            <w:tcW w:type="dxa" w:w="2886"/>
           </w:tcPr>
           <w:p>
             <w:pPr>
@@ -3427,7 +3428,7 @@
         </w:tc>
         <w:tc>
           <w:tcPr>
-            <w:tcW w:type="dxa" w:w="1654"/>
+            <w:tcW w:type="dxa" w:w="1134"/>
           </w:tcPr>
           <w:p>
             <w:pPr>
@@ -3445,7 +3446,7 @@
         </w:tc>
         <w:tc>
           <w:tcPr>
-            <w:tcW w:type="dxa" w:w="1654"/>
+            <w:tcW w:type="dxa" w:w="1134"/>
           </w:tcPr>
           <w:p>
             <w:pPr>
@@ -3463,7 +3464,7 @@
         </w:tc>
         <w:tc>
           <w:tcPr>
-            <w:tcW w:type="dxa" w:w="1654"/>
+            <w:tcW w:type="dxa" w:w="1134"/>
           </w:tcPr>
           <w:p>
             <w:pPr>
@@ -3483,7 +3484,7 @@
       <w:tr>
         <w:tc>
           <w:tcPr>
-            <w:tcW w:type="dxa" w:w="1654"/>
+            <w:tcW w:type="dxa" w:w="1984"/>
           </w:tcPr>
           <w:p>
             <w:pPr>
@@ -3501,7 +3502,7 @@
         </w:tc>
         <w:tc>
           <w:tcPr>
-            <w:tcW w:type="dxa" w:w="1654"/>
+            <w:tcW w:type="dxa" w:w="2886"/>
           </w:tcPr>
           <w:p>
             <w:pPr>
@@ -3519,7 +3520,7 @@
         </w:tc>
         <w:tc>
           <w:tcPr>
-            <w:tcW w:type="dxa" w:w="1654"/>
+            <w:tcW w:type="dxa" w:w="1134"/>
           </w:tcPr>
           <w:p>
             <w:pPr>
@@ -3537,7 +3538,7 @@
         </w:tc>
         <w:tc>
           <w:tcPr>
-            <w:tcW w:type="dxa" w:w="1654"/>
+            <w:tcW w:type="dxa" w:w="1134"/>
           </w:tcPr>
           <w:p>
             <w:pPr>
@@ -3555,7 +3556,7 @@
         </w:tc>
         <w:tc>
           <w:tcPr>
-            <w:tcW w:type="dxa" w:w="1654"/>
+            <w:tcW w:type="dxa" w:w="1134"/>
           </w:tcPr>
           <w:p>
             <w:pPr>
@@ -3575,7 +3576,7 @@
       <w:tr>
         <w:tc>
           <w:tcPr>
-            <w:tcW w:type="dxa" w:w="1654"/>
+            <w:tcW w:type="dxa" w:w="1984"/>
           </w:tcPr>
           <w:p>
             <w:pPr>
@@ -3592,7 +3593,7 @@
         </w:tc>
         <w:tc>
           <w:tcPr>
-            <w:tcW w:type="dxa" w:w="1654"/>
+            <w:tcW w:type="dxa" w:w="2886"/>
           </w:tcPr>
           <w:p>
             <w:pPr>
@@ -3610,7 +3611,7 @@
         </w:tc>
         <w:tc>
           <w:tcPr>
-            <w:tcW w:type="dxa" w:w="1654"/>
+            <w:tcW w:type="dxa" w:w="1134"/>
           </w:tcPr>
           <w:p>
             <w:pPr>
@@ -3628,7 +3629,7 @@
         </w:tc>
         <w:tc>
           <w:tcPr>
-            <w:tcW w:type="dxa" w:w="1654"/>
+            <w:tcW w:type="dxa" w:w="1134"/>
           </w:tcPr>
           <w:p>
             <w:pPr>
@@ -3646,7 +3647,7 @@
         </w:tc>
         <w:tc>
           <w:tcPr>
-            <w:tcW w:type="dxa" w:w="1654"/>
+            <w:tcW w:type="dxa" w:w="1134"/>
           </w:tcPr>
           <w:p>
             <w:pPr>
@@ -3666,7 +3667,7 @@
       <w:tr>
         <w:tc>
           <w:tcPr>
-            <w:tcW w:type="dxa" w:w="1654"/>
+            <w:tcW w:type="dxa" w:w="1984"/>
           </w:tcPr>
           <w:p>
             <w:pPr>
@@ -3683,7 +3684,7 @@
         </w:tc>
         <w:tc>
           <w:tcPr>
-            <w:tcW w:type="dxa" w:w="1654"/>
+            <w:tcW w:type="dxa" w:w="2886"/>
           </w:tcPr>
           <w:p>
             <w:pPr>
@@ -3701,7 +3702,7 @@
         </w:tc>
         <w:tc>
           <w:tcPr>
-            <w:tcW w:type="dxa" w:w="1654"/>
+            <w:tcW w:type="dxa" w:w="1134"/>
           </w:tcPr>
           <w:p>
             <w:pPr>
@@ -3719,7 +3720,7 @@
         </w:tc>
         <w:tc>
           <w:tcPr>
-            <w:tcW w:type="dxa" w:w="1654"/>
+            <w:tcW w:type="dxa" w:w="1134"/>
           </w:tcPr>
           <w:p>
             <w:pPr>
@@ -3737,7 +3738,7 @@
         </w:tc>
         <w:tc>
           <w:tcPr>
-            <w:tcW w:type="dxa" w:w="1654"/>
+            <w:tcW w:type="dxa" w:w="1134"/>
           </w:tcPr>
           <w:p>
             <w:pPr>
@@ -3757,7 +3758,7 @@
       <w:tr>
         <w:tc>
           <w:tcPr>
-            <w:tcW w:type="dxa" w:w="1654"/>
+            <w:tcW w:type="dxa" w:w="1984"/>
           </w:tcPr>
           <w:p>
             <w:pPr>
@@ -3775,7 +3776,7 @@
         </w:tc>
         <w:tc>
           <w:tcPr>
-            <w:tcW w:type="dxa" w:w="1654"/>
+            <w:tcW w:type="dxa" w:w="2886"/>
           </w:tcPr>
           <w:p>
             <w:pPr>
@@ -3792,7 +3793,7 @@
         </w:tc>
         <w:tc>
           <w:tcPr>
-            <w:tcW w:type="dxa" w:w="1654"/>
+            <w:tcW w:type="dxa" w:w="1134"/>
           </w:tcPr>
           <w:p>
             <w:pPr>
@@ -3810,7 +3811,7 @@
         </w:tc>
         <w:tc>
           <w:tcPr>
-            <w:tcW w:type="dxa" w:w="1654"/>
+            <w:tcW w:type="dxa" w:w="1134"/>
           </w:tcPr>
           <w:p>
             <w:pPr>
@@ -3828,7 +3829,7 @@
         </w:tc>
         <w:tc>
           <w:tcPr>
-            <w:tcW w:type="dxa" w:w="1654"/>
+            <w:tcW w:type="dxa" w:w="1134"/>
           </w:tcPr>
           <w:p>
             <w:pPr>

</xml_diff>

<commit_message>
Poblacion tabla: usar aplicar_formato_tabla_xml como el Gantt
</commit_message>
<xml_diff>
--- a/keidy/reportes/Informe_Pasantia_IUTECP.docx
+++ b/keidy/reportes/Informe_Pasantia_IUTECP.docx
@@ -2465,7 +2465,7 @@
       <w:tr>
         <w:tc>
           <w:tcPr>
-            <w:tcW w:type="dxa" w:w="1984"/>
+            <w:tcW w:w="1984" w:type="dxa"/>
             <w:shd w:fill="D9E2F3"/>
           </w:tcPr>
           <w:p>
@@ -2485,7 +2485,7 @@
         </w:tc>
         <w:tc>
           <w:tcPr>
-            <w:tcW w:type="dxa" w:w="2886"/>
+            <w:tcW w:w="2886" w:type="dxa"/>
             <w:shd w:fill="D9E2F3"/>
           </w:tcPr>
           <w:p>
@@ -2505,7 +2505,7 @@
         </w:tc>
         <w:tc>
           <w:tcPr>
-            <w:tcW w:type="dxa" w:w="1134"/>
+            <w:tcW w:w="1134" w:type="dxa"/>
             <w:shd w:fill="D9E2F3"/>
           </w:tcPr>
           <w:p>
@@ -2525,7 +2525,7 @@
         </w:tc>
         <w:tc>
           <w:tcPr>
-            <w:tcW w:type="dxa" w:w="1134"/>
+            <w:tcW w:w="1134" w:type="dxa"/>
             <w:shd w:fill="D9E2F3"/>
           </w:tcPr>
           <w:p>
@@ -2545,7 +2545,7 @@
         </w:tc>
         <w:tc>
           <w:tcPr>
-            <w:tcW w:type="dxa" w:w="1134"/>
+            <w:tcW w:w="1134" w:type="dxa"/>
             <w:shd w:fill="D9E2F3"/>
           </w:tcPr>
           <w:p>

</xml_diff>

<commit_message>
Planificacion: 5 columnas (Obj, Var, Act, Tec, Inst); Gantt: encabezado con meses + semanas
</commit_message>
<xml_diff>
--- a/keidy/reportes/Informe_Pasantia_IUTECP.docx
+++ b/keidy/reportes/Informe_Pasantia_IUTECP.docx
@@ -4370,15 +4370,16 @@
         <w:tblLayout w:type="fixed"/>
       </w:tblPr>
       <w:tblGrid>
-        <w:gridCol w:w="2551"/>
-        <w:gridCol w:w="2551"/>
-        <w:gridCol w:w="1701"/>
-        <w:gridCol w:w="1984"/>
+        <w:gridCol w:w="1644"/>
+        <w:gridCol w:w="1644"/>
+        <w:gridCol w:w="1644"/>
+        <w:gridCol w:w="1644"/>
+        <w:gridCol w:w="1695"/>
       </w:tblGrid>
       <w:tr>
         <w:tc>
           <w:tcPr>
-            <w:tcW w:w="2551" w:type="dxa"/>
+            <w:tcW w:w="1644" w:type="dxa"/>
             <w:shd w:val="clear" w:color="auto" w:fill="4472C4"/>
           </w:tcPr>
           <w:p>
@@ -4393,13 +4394,34 @@
                 <w:color w:val="FFFFFF"/>
                 <w:sz w:val="20"/>
               </w:rPr>
-              <w:t>Objetivo Específico</w:t>
+              <w:t>Objetivo</w:t>
             </w:r>
           </w:p>
         </w:tc>
         <w:tc>
           <w:tcPr>
-            <w:tcW w:w="2551" w:type="dxa"/>
+            <w:tcW w:w="1644" w:type="dxa"/>
+            <w:shd w:val="clear" w:color="auto" w:fill="4472C4"/>
+          </w:tcPr>
+          <w:p>
+            <w:pPr>
+              <w:spacing w:before="60" w:after="60" w:line="240" w:lineRule="auto"/>
+              <w:jc w:val="center"/>
+            </w:pPr>
+            <w:r>
+              <w:rPr>
+                <w:rFonts w:ascii="Times New Roman" w:hAnsi="Times New Roman"/>
+                <w:b/>
+                <w:color w:val="FFFFFF"/>
+                <w:sz w:val="20"/>
+              </w:rPr>
+              <w:t>Variable</w:t>
+            </w:r>
+          </w:p>
+        </w:tc>
+        <w:tc>
+          <w:tcPr>
+            <w:tcW w:w="1644" w:type="dxa"/>
             <w:shd w:val="clear" w:color="auto" w:fill="4472C4"/>
           </w:tcPr>
           <w:p>
@@ -4420,7 +4442,7 @@
         </w:tc>
         <w:tc>
           <w:tcPr>
-            <w:tcW w:w="1701" w:type="dxa"/>
+            <w:tcW w:w="1644" w:type="dxa"/>
             <w:shd w:val="clear" w:color="auto" w:fill="4472C4"/>
           </w:tcPr>
           <w:p>
@@ -4435,13 +4457,13 @@
                 <w:color w:val="FFFFFF"/>
                 <w:sz w:val="20"/>
               </w:rPr>
-              <w:t>Recursos</w:t>
+              <w:t>Técnica</w:t>
             </w:r>
           </w:p>
         </w:tc>
         <w:tc>
           <w:tcPr>
-            <w:tcW w:w="1984" w:type="dxa"/>
+            <w:tcW w:w="1695" w:type="dxa"/>
             <w:shd w:val="clear" w:color="auto" w:fill="4472C4"/>
           </w:tcPr>
           <w:p>
@@ -4456,7 +4478,7 @@
                 <w:color w:val="FFFFFF"/>
                 <w:sz w:val="20"/>
               </w:rPr>
-              <w:t>Indicadores de Logro</w:t>
+              <w:t>Instrumento</w:t>
             </w:r>
           </w:p>
         </w:tc>
@@ -4464,7 +4486,7 @@
       <w:tr>
         <w:tc>
           <w:tcPr>
-            <w:tcW w:w="2551" w:type="dxa"/>
+            <w:tcW w:w="1644" w:type="dxa"/>
             <w:shd w:val="clear" w:color="auto" w:fill="FFFFFF"/>
           </w:tcPr>
           <w:p>
@@ -4485,7 +4507,7 @@
         </w:tc>
         <w:tc>
           <w:tcPr>
-            <w:tcW w:w="2551" w:type="dxa"/>
+            <w:tcW w:w="1644" w:type="dxa"/>
             <w:shd w:val="clear" w:color="auto" w:fill="FFFFFF"/>
           </w:tcPr>
           <w:p>
@@ -4500,13 +4522,13 @@
                 <w:color w:val="000000"/>
                 <w:sz w:val="20"/>
               </w:rPr>
-              <w:t>Aplicación de guías de observación directa y entrevistas al personal encargado del ciclo de compras de la empresa.</w:t>
+              <w:t>Flujo procedimental y canales de recepción de solicitudes.</w:t>
             </w:r>
           </w:p>
         </w:tc>
         <w:tc>
           <w:tcPr>
-            <w:tcW w:w="1701" w:type="dxa"/>
+            <w:tcW w:w="1644" w:type="dxa"/>
             <w:shd w:val="clear" w:color="auto" w:fill="FFFFFF"/>
           </w:tcPr>
           <w:p>
@@ -4521,13 +4543,13 @@
                 <w:color w:val="000000"/>
                 <w:sz w:val="20"/>
               </w:rPr>
-              <w:t>Guía de entrevista, libreta de notas de campo, computadora de oficina.</w:t>
+              <w:t>Observación directa del ciclo de compras y entrevistas al personal.</w:t>
             </w:r>
           </w:p>
         </w:tc>
         <w:tc>
           <w:tcPr>
-            <w:tcW w:w="1984" w:type="dxa"/>
+            <w:tcW w:w="1644" w:type="dxa"/>
             <w:shd w:val="clear" w:color="auto" w:fill="FFFFFF"/>
           </w:tcPr>
           <w:p>
@@ -4542,7 +4564,28 @@
                 <w:color w:val="000000"/>
                 <w:sz w:val="20"/>
               </w:rPr>
-              <w:t>Mapeo situacional del flujo actual de las solicitudes de compra elaborado.</w:t>
+              <w:t>Observación directa y entrevistas.</w:t>
+            </w:r>
+          </w:p>
+        </w:tc>
+        <w:tc>
+          <w:tcPr>
+            <w:tcW w:w="1695" w:type="dxa"/>
+            <w:shd w:val="clear" w:color="auto" w:fill="FFFFFF"/>
+          </w:tcPr>
+          <w:p>
+            <w:pPr>
+              <w:spacing w:before="60" w:after="60" w:line="240" w:lineRule="auto"/>
+              <w:jc w:val="both"/>
+            </w:pPr>
+            <w:r>
+              <w:rPr>
+                <w:rFonts w:ascii="Times New Roman" w:hAnsi="Times New Roman"/>
+                <w:b w:val="0"/>
+                <w:color w:val="000000"/>
+                <w:sz w:val="20"/>
+              </w:rPr>
+              <w:t>Guía de entrevista, libreta de notas de campo, computadora.</w:t>
             </w:r>
           </w:p>
         </w:tc>
@@ -4550,7 +4593,7 @@
       <w:tr>
         <w:tc>
           <w:tcPr>
-            <w:tcW w:w="2551" w:type="dxa"/>
+            <w:tcW w:w="1644" w:type="dxa"/>
             <w:shd w:val="clear" w:color="auto" w:fill="D9E1F2"/>
           </w:tcPr>
           <w:p>
@@ -4571,7 +4614,7 @@
         </w:tc>
         <w:tc>
           <w:tcPr>
-            <w:tcW w:w="2551" w:type="dxa"/>
+            <w:tcW w:w="1644" w:type="dxa"/>
             <w:shd w:val="clear" w:color="auto" w:fill="D9E1F2"/>
           </w:tcPr>
           <w:p>
@@ -4586,13 +4629,55 @@
                 <w:color w:val="000000"/>
                 <w:sz w:val="20"/>
               </w:rPr>
-              <w:t>Revisión y análisis de los tiempos promedio de respuesta en expedientes de compras anteriores y detección de fases críticas y pasos duplicados.</w:t>
+              <w:t>Tiempos de respuesta y etapas críticas del proceso de compras.</w:t>
             </w:r>
           </w:p>
         </w:tc>
         <w:tc>
           <w:tcPr>
-            <w:tcW w:w="1701" w:type="dxa"/>
+            <w:tcW w:w="1644" w:type="dxa"/>
+            <w:shd w:val="clear" w:color="auto" w:fill="D9E1F2"/>
+          </w:tcPr>
+          <w:p>
+            <w:pPr>
+              <w:spacing w:before="60" w:after="60" w:line="240" w:lineRule="auto"/>
+              <w:jc w:val="both"/>
+            </w:pPr>
+            <w:r>
+              <w:rPr>
+                <w:rFonts w:ascii="Times New Roman" w:hAnsi="Times New Roman"/>
+                <w:b w:val="0"/>
+                <w:color w:val="000000"/>
+                <w:sz w:val="20"/>
+              </w:rPr>
+              <w:t>Revisión de expedientes históricos y detección de fases duplicadas.</w:t>
+            </w:r>
+          </w:p>
+        </w:tc>
+        <w:tc>
+          <w:tcPr>
+            <w:tcW w:w="1644" w:type="dxa"/>
+            <w:shd w:val="clear" w:color="auto" w:fill="D9E1F2"/>
+          </w:tcPr>
+          <w:p>
+            <w:pPr>
+              <w:spacing w:before="60" w:after="60" w:line="240" w:lineRule="auto"/>
+              <w:jc w:val="both"/>
+            </w:pPr>
+            <w:r>
+              <w:rPr>
+                <w:rFonts w:ascii="Times New Roman" w:hAnsi="Times New Roman"/>
+                <w:b w:val="0"/>
+                <w:color w:val="000000"/>
+                <w:sz w:val="20"/>
+              </w:rPr>
+              <w:t>Análisis documental y revisión de tiempos.</w:t>
+            </w:r>
+          </w:p>
+        </w:tc>
+        <w:tc>
+          <w:tcPr>
+            <w:tcW w:w="1695" w:type="dxa"/>
             <w:shd w:val="clear" w:color="auto" w:fill="D9E1F2"/>
           </w:tcPr>
           <w:p>
@@ -4611,32 +4696,11 @@
             </w:r>
           </w:p>
         </w:tc>
-        <w:tc>
-          <w:tcPr>
-            <w:tcW w:w="1984" w:type="dxa"/>
-            <w:shd w:val="clear" w:color="auto" w:fill="D9E1F2"/>
-          </w:tcPr>
-          <w:p>
-            <w:pPr>
-              <w:spacing w:before="60" w:after="60" w:line="240" w:lineRule="auto"/>
-              <w:jc w:val="both"/>
-            </w:pPr>
-            <w:r>
-              <w:rPr>
-                <w:rFonts w:ascii="Times New Roman" w:hAnsi="Times New Roman"/>
-                <w:b w:val="0"/>
-                <w:color w:val="000000"/>
-                <w:sz w:val="20"/>
-              </w:rPr>
-              <w:t>Matriz de criticidad con los puntos de complejidad y retraso documental identificados.</w:t>
-            </w:r>
-          </w:p>
-        </w:tc>
       </w:tr>
       <w:tr>
         <w:tc>
           <w:tcPr>
-            <w:tcW w:w="2551" w:type="dxa"/>
+            <w:tcW w:w="1644" w:type="dxa"/>
             <w:shd w:val="clear" w:color="auto" w:fill="FFFFFF"/>
           </w:tcPr>
           <w:p>
@@ -4657,7 +4721,7 @@
         </w:tc>
         <w:tc>
           <w:tcPr>
-            <w:tcW w:w="2551" w:type="dxa"/>
+            <w:tcW w:w="1644" w:type="dxa"/>
             <w:shd w:val="clear" w:color="auto" w:fill="FFFFFF"/>
           </w:tcPr>
           <w:p>
@@ -4672,13 +4736,13 @@
                 <w:color w:val="000000"/>
                 <w:sz w:val="20"/>
               </w:rPr>
-              <w:t>Clasificación analítica de los factores determinantes de las demoras y redundancias mediante mesas de trabajo técnica con la administración.</w:t>
+              <w:t>Factores determinantes de demoras y redundancias.</w:t>
             </w:r>
           </w:p>
         </w:tc>
         <w:tc>
           <w:tcPr>
-            <w:tcW w:w="1701" w:type="dxa"/>
+            <w:tcW w:w="1644" w:type="dxa"/>
             <w:shd w:val="clear" w:color="auto" w:fill="FFFFFF"/>
           </w:tcPr>
           <w:p>
@@ -4693,13 +4757,13 @@
                 <w:color w:val="000000"/>
                 <w:sz w:val="20"/>
               </w:rPr>
-              <w:t>Diagramas causa-efecto, material de papelería, marco de control de procesos.</w:t>
+              <w:t>Clasificación analítica de causas mediante mesas de trabajo con la administración.</w:t>
             </w:r>
           </w:p>
         </w:tc>
         <w:tc>
           <w:tcPr>
-            <w:tcW w:w="1984" w:type="dxa"/>
+            <w:tcW w:w="1644" w:type="dxa"/>
             <w:shd w:val="clear" w:color="auto" w:fill="FFFFFF"/>
           </w:tcPr>
           <w:p>
@@ -4714,7 +4778,28 @@
                 <w:color w:val="000000"/>
                 <w:sz w:val="20"/>
               </w:rPr>
-              <w:t>Informe analítico con la jerarquización de las causas raíz de la complejidad procedimental.</w:t>
+              <w:t>Diagrama causa-efecto y jerarquización de factores.</w:t>
+            </w:r>
+          </w:p>
+        </w:tc>
+        <w:tc>
+          <w:tcPr>
+            <w:tcW w:w="1695" w:type="dxa"/>
+            <w:shd w:val="clear" w:color="auto" w:fill="FFFFFF"/>
+          </w:tcPr>
+          <w:p>
+            <w:pPr>
+              <w:spacing w:before="60" w:after="60" w:line="240" w:lineRule="auto"/>
+              <w:jc w:val="both"/>
+            </w:pPr>
+            <w:r>
+              <w:rPr>
+                <w:rFonts w:ascii="Times New Roman" w:hAnsi="Times New Roman"/>
+                <w:b w:val="0"/>
+                <w:color w:val="000000"/>
+                <w:sz w:val="20"/>
+              </w:rPr>
+              <w:t>Material de papelería, marco de control de procesos.</w:t>
             </w:r>
           </w:p>
         </w:tc>
@@ -4722,7 +4807,7 @@
       <w:tr>
         <w:tc>
           <w:tcPr>
-            <w:tcW w:w="2551" w:type="dxa"/>
+            <w:tcW w:w="1644" w:type="dxa"/>
             <w:shd w:val="clear" w:color="auto" w:fill="D9E1F2"/>
           </w:tcPr>
           <w:p>
@@ -4743,7 +4828,7 @@
         </w:tc>
         <w:tc>
           <w:tcPr>
-            <w:tcW w:w="2551" w:type="dxa"/>
+            <w:tcW w:w="1644" w:type="dxa"/>
             <w:shd w:val="clear" w:color="auto" w:fill="D9E1F2"/>
           </w:tcPr>
           <w:p>
@@ -4758,13 +4843,13 @@
                 <w:color w:val="000000"/>
                 <w:sz w:val="20"/>
               </w:rPr>
-              <w:t>Redacción del nuevo flujo de trabajo simplificado, asignación formal de roles y diseño de plantillas estandarizadas para cotizaciones.</w:t>
+              <w:t>Flujo de trabajo y formatos de control de la procura.</w:t>
             </w:r>
           </w:p>
         </w:tc>
         <w:tc>
           <w:tcPr>
-            <w:tcW w:w="1701" w:type="dxa"/>
+            <w:tcW w:w="1644" w:type="dxa"/>
             <w:shd w:val="clear" w:color="auto" w:fill="D9E1F2"/>
           </w:tcPr>
           <w:p>
@@ -4779,13 +4864,13 @@
                 <w:color w:val="000000"/>
                 <w:sz w:val="20"/>
               </w:rPr>
-              <w:t>Procesador de texto, guías metodológicas de administración, normativas de la empresa.</w:t>
+              <w:t>Redacción del nuevo flujo simplificado y diseño de plantillas estandarizadas.</w:t>
             </w:r>
           </w:p>
         </w:tc>
         <w:tc>
           <w:tcPr>
-            <w:tcW w:w="1984" w:type="dxa"/>
+            <w:tcW w:w="1644" w:type="dxa"/>
             <w:shd w:val="clear" w:color="auto" w:fill="D9E1F2"/>
           </w:tcPr>
           <w:p>
@@ -4800,7 +4885,28 @@
                 <w:color w:val="000000"/>
                 <w:sz w:val="20"/>
               </w:rPr>
-              <w:t>Propuesta de simplificación administrativa de la procura formulada y validada.</w:t>
+              <w:t>Diseño procedimental y estandarización de formatos.</w:t>
+            </w:r>
+          </w:p>
+        </w:tc>
+        <w:tc>
+          <w:tcPr>
+            <w:tcW w:w="1695" w:type="dxa"/>
+            <w:shd w:val="clear" w:color="auto" w:fill="D9E1F2"/>
+          </w:tcPr>
+          <w:p>
+            <w:pPr>
+              <w:spacing w:before="60" w:after="60" w:line="240" w:lineRule="auto"/>
+              <w:jc w:val="both"/>
+            </w:pPr>
+            <w:r>
+              <w:rPr>
+                <w:rFonts w:ascii="Times New Roman" w:hAnsi="Times New Roman"/>
+                <w:b w:val="0"/>
+                <w:color w:val="000000"/>
+                <w:sz w:val="20"/>
+              </w:rPr>
+              <w:t>Procesador de texto, guías metodológicas de administración.</w:t>
             </w:r>
           </w:p>
         </w:tc>
@@ -4900,7 +5006,96 @@
                 <w:color w:val="FFFFFF"/>
                 <w:sz w:val="20"/>
               </w:rPr>
-              <w:t>Actividades Administrativas</w:t>
+              <w:t>Semana</w:t>
+            </w:r>
+          </w:p>
+        </w:tc>
+        <w:tc>
+          <w:tcPr>
+            <w:tcW w:w="2092" w:type="dxa"/>
+            <w:gridSpan w:val="4"/>
+            <w:shd w:val="clear" w:color="auto" w:fill="4472C4"/>
+          </w:tcPr>
+          <w:p>
+            <w:pPr>
+              <w:spacing w:before="60" w:after="60" w:line="240" w:lineRule="auto"/>
+              <w:jc w:val="center"/>
+            </w:pPr>
+            <w:r>
+              <w:rPr>
+                <w:rFonts w:ascii="Times New Roman" w:hAnsi="Times New Roman"/>
+                <w:b/>
+                <w:color w:val="FFFFFF"/>
+                <w:sz w:val="20"/>
+              </w:rPr>
+              <w:t>JUNIO</w:t>
+            </w:r>
+          </w:p>
+        </w:tc>
+        <w:tc>
+          <w:tcPr>
+            <w:tcW w:w="2092" w:type="dxa"/>
+            <w:gridSpan w:val="4"/>
+            <w:shd w:val="clear" w:color="auto" w:fill="4472C4"/>
+          </w:tcPr>
+          <w:p>
+            <w:pPr>
+              <w:spacing w:before="60" w:after="60" w:line="240" w:lineRule="auto"/>
+              <w:jc w:val="center"/>
+            </w:pPr>
+            <w:r>
+              <w:rPr>
+                <w:rFonts w:ascii="Times New Roman" w:hAnsi="Times New Roman"/>
+                <w:b/>
+                <w:color w:val="FFFFFF"/>
+                <w:sz w:val="20"/>
+              </w:rPr>
+              <w:t>JULIO</w:t>
+            </w:r>
+          </w:p>
+        </w:tc>
+        <w:tc>
+          <w:tcPr>
+            <w:tcW w:w="1046" w:type="dxa"/>
+            <w:gridSpan w:val="2"/>
+            <w:shd w:val="clear" w:color="auto" w:fill="4472C4"/>
+          </w:tcPr>
+          <w:p>
+            <w:pPr>
+              <w:spacing w:before="60" w:after="60" w:line="240" w:lineRule="auto"/>
+              <w:jc w:val="center"/>
+            </w:pPr>
+            <w:r>
+              <w:rPr>
+                <w:rFonts w:ascii="Times New Roman" w:hAnsi="Times New Roman"/>
+                <w:b/>
+                <w:color w:val="FFFFFF"/>
+                <w:sz w:val="20"/>
+              </w:rPr>
+              <w:t>AGOSTO</w:t>
+            </w:r>
+          </w:p>
+        </w:tc>
+      </w:tr>
+      <w:tr>
+        <w:tc>
+          <w:tcPr>
+            <w:tcW w:w="3033" w:type="dxa"/>
+            <w:shd w:val="clear" w:color="auto" w:fill="4472C4"/>
+          </w:tcPr>
+          <w:p>
+            <w:pPr>
+              <w:spacing w:before="60" w:after="60" w:line="240" w:lineRule="auto"/>
+              <w:jc w:val="center"/>
+            </w:pPr>
+            <w:r>
+              <w:rPr>
+                <w:rFonts w:ascii="Times New Roman" w:hAnsi="Times New Roman"/>
+                <w:b/>
+                <w:color w:val="FFFFFF"/>
+                <w:sz w:val="20"/>
+              </w:rPr>
+              <w:t>Actividad</w:t>
             </w:r>
           </w:p>
         </w:tc>
@@ -4921,7 +5116,7 @@
                 <w:color w:val="FFFFFF"/>
                 <w:sz w:val="18"/>
               </w:rPr>
-              <w:t>S1</w:t>
+              <w:t>1</w:t>
             </w:r>
           </w:p>
         </w:tc>
@@ -4942,7 +5137,7 @@
                 <w:color w:val="FFFFFF"/>
                 <w:sz w:val="18"/>
               </w:rPr>
-              <w:t>S2</w:t>
+              <w:t>2</w:t>
             </w:r>
           </w:p>
         </w:tc>
@@ -4963,7 +5158,7 @@
                 <w:color w:val="FFFFFF"/>
                 <w:sz w:val="18"/>
               </w:rPr>
-              <w:t>S3</w:t>
+              <w:t>3</w:t>
             </w:r>
           </w:p>
         </w:tc>
@@ -4984,7 +5179,7 @@
                 <w:color w:val="FFFFFF"/>
                 <w:sz w:val="18"/>
               </w:rPr>
-              <w:t>S4</w:t>
+              <w:t>4</w:t>
             </w:r>
           </w:p>
         </w:tc>
@@ -5005,7 +5200,7 @@
                 <w:color w:val="FFFFFF"/>
                 <w:sz w:val="18"/>
               </w:rPr>
-              <w:t>S5</w:t>
+              <w:t>1</w:t>
             </w:r>
           </w:p>
         </w:tc>
@@ -5026,7 +5221,7 @@
                 <w:color w:val="FFFFFF"/>
                 <w:sz w:val="18"/>
               </w:rPr>
-              <w:t>S6</w:t>
+              <w:t>2</w:t>
             </w:r>
           </w:p>
         </w:tc>
@@ -5047,7 +5242,7 @@
                 <w:color w:val="FFFFFF"/>
                 <w:sz w:val="18"/>
               </w:rPr>
-              <w:t>S7</w:t>
+              <w:t>3</w:t>
             </w:r>
           </w:p>
         </w:tc>
@@ -5068,7 +5263,7 @@
                 <w:color w:val="FFFFFF"/>
                 <w:sz w:val="18"/>
               </w:rPr>
-              <w:t>S8</w:t>
+              <w:t>4</w:t>
             </w:r>
           </w:p>
         </w:tc>
@@ -5089,7 +5284,7 @@
                 <w:color w:val="FFFFFF"/>
                 <w:sz w:val="18"/>
               </w:rPr>
-              <w:t>S9</w:t>
+              <w:t>1</w:t>
             </w:r>
           </w:p>
         </w:tc>
@@ -5110,7 +5305,232 @@
                 <w:color w:val="FFFFFF"/>
                 <w:sz w:val="18"/>
               </w:rPr>
-              <w:t>S10</w:t>
+              <w:t>2</w:t>
+            </w:r>
+          </w:p>
+        </w:tc>
+      </w:tr>
+      <w:tr>
+        <w:tc>
+          <w:tcPr>
+            <w:tcW w:w="3033" w:type="dxa"/>
+            <w:shd w:val="clear" w:color="auto" w:fill="D9E1F2"/>
+          </w:tcPr>
+          <w:p>
+            <w:pPr>
+              <w:spacing w:before="60" w:after="60" w:line="240" w:lineRule="auto"/>
+              <w:jc w:val="both"/>
+            </w:pPr>
+            <w:r>
+              <w:rPr>
+                <w:rFonts w:ascii="Times New Roman" w:hAnsi="Times New Roman"/>
+                <w:b w:val="0"/>
+                <w:color w:val="000000"/>
+                <w:sz w:val="20"/>
+              </w:rPr>
+              <w:t>Reconocimiento del departamento y levantamiento del flujo actual de procura.</w:t>
+            </w:r>
+          </w:p>
+        </w:tc>
+        <w:tc>
+          <w:tcPr>
+            <w:tcW w:w="523" w:type="dxa"/>
+            <w:shd w:val="clear" w:color="auto" w:fill="70AD47"/>
+          </w:tcPr>
+          <w:p>
+            <w:pPr>
+              <w:spacing w:before="60" w:after="60" w:line="240" w:lineRule="auto"/>
+              <w:jc w:val="center"/>
+            </w:pPr>
+            <w:r>
+              <w:rPr>
+                <w:rFonts w:ascii="Times New Roman" w:hAnsi="Times New Roman"/>
+                <w:b w:val="0"/>
+                <w:color w:val="FFFFFF"/>
+                <w:sz w:val="18"/>
+              </w:rPr>
+              <w:t>✓</w:t>
+            </w:r>
+          </w:p>
+        </w:tc>
+        <w:tc>
+          <w:tcPr>
+            <w:tcW w:w="523" w:type="dxa"/>
+            <w:shd w:val="clear" w:color="auto" w:fill="70AD47"/>
+          </w:tcPr>
+          <w:p>
+            <w:pPr>
+              <w:spacing w:before="60" w:after="60" w:line="240" w:lineRule="auto"/>
+              <w:jc w:val="center"/>
+            </w:pPr>
+            <w:r>
+              <w:rPr>
+                <w:rFonts w:ascii="Times New Roman" w:hAnsi="Times New Roman"/>
+                <w:b w:val="0"/>
+                <w:color w:val="FFFFFF"/>
+                <w:sz w:val="18"/>
+              </w:rPr>
+              <w:t>✓</w:t>
+            </w:r>
+          </w:p>
+        </w:tc>
+        <w:tc>
+          <w:tcPr>
+            <w:tcW w:w="523" w:type="dxa"/>
+            <w:shd w:val="clear" w:color="auto" w:fill="D9E1F2"/>
+          </w:tcPr>
+          <w:p>
+            <w:pPr>
+              <w:spacing w:before="60" w:after="60" w:line="240" w:lineRule="auto"/>
+              <w:jc w:val="center"/>
+            </w:pPr>
+            <w:r>
+              <w:rPr>
+                <w:rFonts w:ascii="Times New Roman" w:hAnsi="Times New Roman"/>
+                <w:b w:val="0"/>
+                <w:color w:val="000000"/>
+                <w:sz w:val="18"/>
+              </w:rPr>
+            </w:r>
+          </w:p>
+        </w:tc>
+        <w:tc>
+          <w:tcPr>
+            <w:tcW w:w="523" w:type="dxa"/>
+            <w:shd w:val="clear" w:color="auto" w:fill="D9E1F2"/>
+          </w:tcPr>
+          <w:p>
+            <w:pPr>
+              <w:spacing w:before="60" w:after="60" w:line="240" w:lineRule="auto"/>
+              <w:jc w:val="center"/>
+            </w:pPr>
+            <w:r>
+              <w:rPr>
+                <w:rFonts w:ascii="Times New Roman" w:hAnsi="Times New Roman"/>
+                <w:b w:val="0"/>
+                <w:color w:val="000000"/>
+                <w:sz w:val="18"/>
+              </w:rPr>
+            </w:r>
+          </w:p>
+        </w:tc>
+        <w:tc>
+          <w:tcPr>
+            <w:tcW w:w="523" w:type="dxa"/>
+            <w:shd w:val="clear" w:color="auto" w:fill="D9E1F2"/>
+          </w:tcPr>
+          <w:p>
+            <w:pPr>
+              <w:spacing w:before="60" w:after="60" w:line="240" w:lineRule="auto"/>
+              <w:jc w:val="center"/>
+            </w:pPr>
+            <w:r>
+              <w:rPr>
+                <w:rFonts w:ascii="Times New Roman" w:hAnsi="Times New Roman"/>
+                <w:b w:val="0"/>
+                <w:color w:val="000000"/>
+                <w:sz w:val="18"/>
+              </w:rPr>
+            </w:r>
+          </w:p>
+        </w:tc>
+        <w:tc>
+          <w:tcPr>
+            <w:tcW w:w="523" w:type="dxa"/>
+            <w:shd w:val="clear" w:color="auto" w:fill="D9E1F2"/>
+          </w:tcPr>
+          <w:p>
+            <w:pPr>
+              <w:spacing w:before="60" w:after="60" w:line="240" w:lineRule="auto"/>
+              <w:jc w:val="center"/>
+            </w:pPr>
+            <w:r>
+              <w:rPr>
+                <w:rFonts w:ascii="Times New Roman" w:hAnsi="Times New Roman"/>
+                <w:b w:val="0"/>
+                <w:color w:val="000000"/>
+                <w:sz w:val="18"/>
+              </w:rPr>
+            </w:r>
+          </w:p>
+        </w:tc>
+        <w:tc>
+          <w:tcPr>
+            <w:tcW w:w="523" w:type="dxa"/>
+            <w:shd w:val="clear" w:color="auto" w:fill="D9E1F2"/>
+          </w:tcPr>
+          <w:p>
+            <w:pPr>
+              <w:spacing w:before="60" w:after="60" w:line="240" w:lineRule="auto"/>
+              <w:jc w:val="center"/>
+            </w:pPr>
+            <w:r>
+              <w:rPr>
+                <w:rFonts w:ascii="Times New Roman" w:hAnsi="Times New Roman"/>
+                <w:b w:val="0"/>
+                <w:color w:val="000000"/>
+                <w:sz w:val="18"/>
+              </w:rPr>
+            </w:r>
+          </w:p>
+        </w:tc>
+        <w:tc>
+          <w:tcPr>
+            <w:tcW w:w="523" w:type="dxa"/>
+            <w:shd w:val="clear" w:color="auto" w:fill="D9E1F2"/>
+          </w:tcPr>
+          <w:p>
+            <w:pPr>
+              <w:spacing w:before="60" w:after="60" w:line="240" w:lineRule="auto"/>
+              <w:jc w:val="center"/>
+            </w:pPr>
+            <w:r>
+              <w:rPr>
+                <w:rFonts w:ascii="Times New Roman" w:hAnsi="Times New Roman"/>
+                <w:b w:val="0"/>
+                <w:color w:val="000000"/>
+                <w:sz w:val="18"/>
+              </w:rPr>
+            </w:r>
+          </w:p>
+        </w:tc>
+        <w:tc>
+          <w:tcPr>
+            <w:tcW w:w="523" w:type="dxa"/>
+            <w:shd w:val="clear" w:color="auto" w:fill="D9E1F2"/>
+          </w:tcPr>
+          <w:p>
+            <w:pPr>
+              <w:spacing w:before="60" w:after="60" w:line="240" w:lineRule="auto"/>
+              <w:jc w:val="center"/>
+            </w:pPr>
+            <w:r>
+              <w:rPr>
+                <w:rFonts w:ascii="Times New Roman" w:hAnsi="Times New Roman"/>
+                <w:b w:val="0"/>
+                <w:color w:val="000000"/>
+                <w:sz w:val="18"/>
+              </w:rPr>
+            </w:r>
+          </w:p>
+        </w:tc>
+        <w:tc>
+          <w:tcPr>
+            <w:tcW w:w="523" w:type="dxa"/>
+            <w:shd w:val="clear" w:color="auto" w:fill="D9E1F2"/>
+          </w:tcPr>
+          <w:p>
+            <w:pPr>
+              <w:spacing w:before="60" w:after="60" w:line="240" w:lineRule="auto"/>
+              <w:jc w:val="center"/>
+            </w:pPr>
+            <w:r>
+              <w:rPr>
+                <w:rFonts w:ascii="Times New Roman" w:hAnsi="Times New Roman"/>
+                <w:b w:val="0"/>
+                <w:color w:val="000000"/>
+                <w:sz w:val="18"/>
+              </w:rPr>
             </w:r>
           </w:p>
         </w:tc>
@@ -5133,7 +5553,47 @@
                 <w:color w:val="000000"/>
                 <w:sz w:val="20"/>
               </w:rPr>
-              <w:t>Reconocimiento del departamento y levantamiento del flujo actual de procura.</w:t>
+              <w:t>Aplicación de entrevistas y detección de cuellos de botella en las aprobaciones.</w:t>
+            </w:r>
+          </w:p>
+        </w:tc>
+        <w:tc>
+          <w:tcPr>
+            <w:tcW w:w="523" w:type="dxa"/>
+            <w:shd w:val="clear" w:color="auto" w:fill="FFFFFF"/>
+          </w:tcPr>
+          <w:p>
+            <w:pPr>
+              <w:spacing w:before="60" w:after="60" w:line="240" w:lineRule="auto"/>
+              <w:jc w:val="center"/>
+            </w:pPr>
+            <w:r>
+              <w:rPr>
+                <w:rFonts w:ascii="Times New Roman" w:hAnsi="Times New Roman"/>
+                <w:b w:val="0"/>
+                <w:color w:val="000000"/>
+                <w:sz w:val="18"/>
+              </w:rPr>
+            </w:r>
+          </w:p>
+        </w:tc>
+        <w:tc>
+          <w:tcPr>
+            <w:tcW w:w="523" w:type="dxa"/>
+            <w:shd w:val="clear" w:color="auto" w:fill="FFFFFF"/>
+          </w:tcPr>
+          <w:p>
+            <w:pPr>
+              <w:spacing w:before="60" w:after="60" w:line="240" w:lineRule="auto"/>
+              <w:jc w:val="center"/>
+            </w:pPr>
+            <w:r>
+              <w:rPr>
+                <w:rFonts w:ascii="Times New Roman" w:hAnsi="Times New Roman"/>
+                <w:b w:val="0"/>
+                <w:color w:val="000000"/>
+                <w:sz w:val="18"/>
+              </w:rPr>
             </w:r>
           </w:p>
         </w:tc>
@@ -5299,46 +5759,6 @@
             </w:r>
           </w:p>
         </w:tc>
-        <w:tc>
-          <w:tcPr>
-            <w:tcW w:w="523" w:type="dxa"/>
-            <w:shd w:val="clear" w:color="auto" w:fill="FFFFFF"/>
-          </w:tcPr>
-          <w:p>
-            <w:pPr>
-              <w:spacing w:before="60" w:after="60" w:line="240" w:lineRule="auto"/>
-              <w:jc w:val="center"/>
-            </w:pPr>
-            <w:r>
-              <w:rPr>
-                <w:rFonts w:ascii="Times New Roman" w:hAnsi="Times New Roman"/>
-                <w:b w:val="0"/>
-                <w:color w:val="000000"/>
-                <w:sz w:val="18"/>
-              </w:rPr>
-            </w:r>
-          </w:p>
-        </w:tc>
-        <w:tc>
-          <w:tcPr>
-            <w:tcW w:w="523" w:type="dxa"/>
-            <w:shd w:val="clear" w:color="auto" w:fill="FFFFFF"/>
-          </w:tcPr>
-          <w:p>
-            <w:pPr>
-              <w:spacing w:before="60" w:after="60" w:line="240" w:lineRule="auto"/>
-              <w:jc w:val="center"/>
-            </w:pPr>
-            <w:r>
-              <w:rPr>
-                <w:rFonts w:ascii="Times New Roman" w:hAnsi="Times New Roman"/>
-                <w:b w:val="0"/>
-                <w:color w:val="000000"/>
-                <w:sz w:val="18"/>
-              </w:rPr>
-            </w:r>
-          </w:p>
-        </w:tc>
       </w:tr>
       <w:tr>
         <w:tc>
@@ -5358,7 +5778,27 @@
                 <w:color w:val="000000"/>
                 <w:sz w:val="20"/>
               </w:rPr>
-              <w:t>Aplicación de entrevistas y detección de cuellos de botella en las aprobaciones.</w:t>
+              <w:t>Análisis cuantitativo y cualitativo de causas de retraso en el ciclo de compras.</w:t>
+            </w:r>
+          </w:p>
+        </w:tc>
+        <w:tc>
+          <w:tcPr>
+            <w:tcW w:w="523" w:type="dxa"/>
+            <w:shd w:val="clear" w:color="auto" w:fill="D9E1F2"/>
+          </w:tcPr>
+          <w:p>
+            <w:pPr>
+              <w:spacing w:before="60" w:after="60" w:line="240" w:lineRule="auto"/>
+              <w:jc w:val="center"/>
+            </w:pPr>
+            <w:r>
+              <w:rPr>
+                <w:rFonts w:ascii="Times New Roman" w:hAnsi="Times New Roman"/>
+                <w:b w:val="0"/>
+                <w:color w:val="000000"/>
+                <w:sz w:val="18"/>
+              </w:rPr>
             </w:r>
           </w:p>
         </w:tc>
@@ -5544,26 +5984,6 @@
             </w:r>
           </w:p>
         </w:tc>
-        <w:tc>
-          <w:tcPr>
-            <w:tcW w:w="523" w:type="dxa"/>
-            <w:shd w:val="clear" w:color="auto" w:fill="D9E1F2"/>
-          </w:tcPr>
-          <w:p>
-            <w:pPr>
-              <w:spacing w:before="60" w:after="60" w:line="240" w:lineRule="auto"/>
-              <w:jc w:val="center"/>
-            </w:pPr>
-            <w:r>
-              <w:rPr>
-                <w:rFonts w:ascii="Times New Roman" w:hAnsi="Times New Roman"/>
-                <w:b w:val="0"/>
-                <w:color w:val="000000"/>
-                <w:sz w:val="18"/>
-              </w:rPr>
-            </w:r>
-          </w:p>
-        </w:tc>
       </w:tr>
       <w:tr>
         <w:tc>
@@ -5583,7 +6003,47 @@
                 <w:color w:val="000000"/>
                 <w:sz w:val="20"/>
               </w:rPr>
-              <w:t>Análisis cuantitativo y cualitativo de causas de retraso en el ciclo de compras.</w:t>
+              <w:t>Diseño del nuevo flujo optimizado, roles y plantillas de control.</w:t>
+            </w:r>
+          </w:p>
+        </w:tc>
+        <w:tc>
+          <w:tcPr>
+            <w:tcW w:w="523" w:type="dxa"/>
+            <w:shd w:val="clear" w:color="auto" w:fill="FFFFFF"/>
+          </w:tcPr>
+          <w:p>
+            <w:pPr>
+              <w:spacing w:before="60" w:after="60" w:line="240" w:lineRule="auto"/>
+              <w:jc w:val="center"/>
+            </w:pPr>
+            <w:r>
+              <w:rPr>
+                <w:rFonts w:ascii="Times New Roman" w:hAnsi="Times New Roman"/>
+                <w:b w:val="0"/>
+                <w:color w:val="000000"/>
+                <w:sz w:val="18"/>
+              </w:rPr>
+            </w:r>
+          </w:p>
+        </w:tc>
+        <w:tc>
+          <w:tcPr>
+            <w:tcW w:w="523" w:type="dxa"/>
+            <w:shd w:val="clear" w:color="auto" w:fill="FFFFFF"/>
+          </w:tcPr>
+          <w:p>
+            <w:pPr>
+              <w:spacing w:before="60" w:after="60" w:line="240" w:lineRule="auto"/>
+              <w:jc w:val="center"/>
+            </w:pPr>
+            <w:r>
+              <w:rPr>
+                <w:rFonts w:ascii="Times New Roman" w:hAnsi="Times New Roman"/>
+                <w:b w:val="0"/>
+                <w:color w:val="000000"/>
+                <w:sz w:val="18"/>
+              </w:rPr>
             </w:r>
           </w:p>
         </w:tc>
@@ -5749,46 +6209,6 @@
             </w:r>
           </w:p>
         </w:tc>
-        <w:tc>
-          <w:tcPr>
-            <w:tcW w:w="523" w:type="dxa"/>
-            <w:shd w:val="clear" w:color="auto" w:fill="FFFFFF"/>
-          </w:tcPr>
-          <w:p>
-            <w:pPr>
-              <w:spacing w:before="60" w:after="60" w:line="240" w:lineRule="auto"/>
-              <w:jc w:val="center"/>
-            </w:pPr>
-            <w:r>
-              <w:rPr>
-                <w:rFonts w:ascii="Times New Roman" w:hAnsi="Times New Roman"/>
-                <w:b w:val="0"/>
-                <w:color w:val="000000"/>
-                <w:sz w:val="18"/>
-              </w:rPr>
-            </w:r>
-          </w:p>
-        </w:tc>
-        <w:tc>
-          <w:tcPr>
-            <w:tcW w:w="523" w:type="dxa"/>
-            <w:shd w:val="clear" w:color="auto" w:fill="FFFFFF"/>
-          </w:tcPr>
-          <w:p>
-            <w:pPr>
-              <w:spacing w:before="60" w:after="60" w:line="240" w:lineRule="auto"/>
-              <w:jc w:val="center"/>
-            </w:pPr>
-            <w:r>
-              <w:rPr>
-                <w:rFonts w:ascii="Times New Roman" w:hAnsi="Times New Roman"/>
-                <w:b w:val="0"/>
-                <w:color w:val="000000"/>
-                <w:sz w:val="18"/>
-              </w:rPr>
-            </w:r>
-          </w:p>
-        </w:tc>
       </w:tr>
       <w:tr>
         <w:tc>
@@ -5808,7 +6228,27 @@
                 <w:color w:val="000000"/>
                 <w:sz w:val="20"/>
               </w:rPr>
-              <w:t>Diseño del nuevo flujo optimizado, roles y plantillas de control.</w:t>
+              <w:t>Redacción y validación de la propuesta de mejora procedimental.</w:t>
+            </w:r>
+          </w:p>
+        </w:tc>
+        <w:tc>
+          <w:tcPr>
+            <w:tcW w:w="523" w:type="dxa"/>
+            <w:shd w:val="clear" w:color="auto" w:fill="D9E1F2"/>
+          </w:tcPr>
+          <w:p>
+            <w:pPr>
+              <w:spacing w:before="60" w:after="60" w:line="240" w:lineRule="auto"/>
+              <w:jc w:val="center"/>
+            </w:pPr>
+            <w:r>
+              <w:rPr>
+                <w:rFonts w:ascii="Times New Roman" w:hAnsi="Times New Roman"/>
+                <w:b w:val="0"/>
+                <w:color w:val="000000"/>
+                <w:sz w:val="18"/>
+              </w:rPr>
             </w:r>
           </w:p>
         </w:tc>
@@ -5994,26 +6434,6 @@
             </w:r>
           </w:p>
         </w:tc>
-        <w:tc>
-          <w:tcPr>
-            <w:tcW w:w="523" w:type="dxa"/>
-            <w:shd w:val="clear" w:color="auto" w:fill="D9E1F2"/>
-          </w:tcPr>
-          <w:p>
-            <w:pPr>
-              <w:spacing w:before="60" w:after="60" w:line="240" w:lineRule="auto"/>
-              <w:jc w:val="center"/>
-            </w:pPr>
-            <w:r>
-              <w:rPr>
-                <w:rFonts w:ascii="Times New Roman" w:hAnsi="Times New Roman"/>
-                <w:b w:val="0"/>
-                <w:color w:val="000000"/>
-                <w:sz w:val="18"/>
-              </w:rPr>
-            </w:r>
-          </w:p>
-        </w:tc>
       </w:tr>
       <w:tr>
         <w:tc>
@@ -6033,7 +6453,47 @@
                 <w:color w:val="000000"/>
                 <w:sz w:val="20"/>
               </w:rPr>
-              <w:t>Redacción y validación de la propuesta de mejora procedimental.</w:t>
+              <w:t>Presentación formal de la propuesta a la gerencia y ajustes finales.</w:t>
+            </w:r>
+          </w:p>
+        </w:tc>
+        <w:tc>
+          <w:tcPr>
+            <w:tcW w:w="523" w:type="dxa"/>
+            <w:shd w:val="clear" w:color="auto" w:fill="FFFFFF"/>
+          </w:tcPr>
+          <w:p>
+            <w:pPr>
+              <w:spacing w:before="60" w:after="60" w:line="240" w:lineRule="auto"/>
+              <w:jc w:val="center"/>
+            </w:pPr>
+            <w:r>
+              <w:rPr>
+                <w:rFonts w:ascii="Times New Roman" w:hAnsi="Times New Roman"/>
+                <w:b w:val="0"/>
+                <w:color w:val="000000"/>
+                <w:sz w:val="18"/>
+              </w:rPr>
+            </w:r>
+          </w:p>
+        </w:tc>
+        <w:tc>
+          <w:tcPr>
+            <w:tcW w:w="523" w:type="dxa"/>
+            <w:shd w:val="clear" w:color="auto" w:fill="FFFFFF"/>
+          </w:tcPr>
+          <w:p>
+            <w:pPr>
+              <w:spacing w:before="60" w:after="60" w:line="240" w:lineRule="auto"/>
+              <w:jc w:val="center"/>
+            </w:pPr>
+            <w:r>
+              <w:rPr>
+                <w:rFonts w:ascii="Times New Roman" w:hAnsi="Times New Roman"/>
+                <w:b w:val="0"/>
+                <w:color w:val="000000"/>
+                <w:sz w:val="18"/>
+              </w:rPr>
             </w:r>
           </w:p>
         </w:tc>
@@ -6199,46 +6659,6 @@
             </w:r>
           </w:p>
         </w:tc>
-        <w:tc>
-          <w:tcPr>
-            <w:tcW w:w="523" w:type="dxa"/>
-            <w:shd w:val="clear" w:color="auto" w:fill="FFFFFF"/>
-          </w:tcPr>
-          <w:p>
-            <w:pPr>
-              <w:spacing w:before="60" w:after="60" w:line="240" w:lineRule="auto"/>
-              <w:jc w:val="center"/>
-            </w:pPr>
-            <w:r>
-              <w:rPr>
-                <w:rFonts w:ascii="Times New Roman" w:hAnsi="Times New Roman"/>
-                <w:b w:val="0"/>
-                <w:color w:val="000000"/>
-                <w:sz w:val="18"/>
-              </w:rPr>
-            </w:r>
-          </w:p>
-        </w:tc>
-        <w:tc>
-          <w:tcPr>
-            <w:tcW w:w="523" w:type="dxa"/>
-            <w:shd w:val="clear" w:color="auto" w:fill="FFFFFF"/>
-          </w:tcPr>
-          <w:p>
-            <w:pPr>
-              <w:spacing w:before="60" w:after="60" w:line="240" w:lineRule="auto"/>
-              <w:jc w:val="center"/>
-            </w:pPr>
-            <w:r>
-              <w:rPr>
-                <w:rFonts w:ascii="Times New Roman" w:hAnsi="Times New Roman"/>
-                <w:b w:val="0"/>
-                <w:color w:val="000000"/>
-                <w:sz w:val="18"/>
-              </w:rPr>
-            </w:r>
-          </w:p>
-        </w:tc>
       </w:tr>
       <w:tr>
         <w:tc>
@@ -6258,7 +6678,28 @@
                 <w:color w:val="000000"/>
                 <w:sz w:val="20"/>
               </w:rPr>
-              <w:t>Presentación formal de la propuesta a la gerencia y ajustes finales.</w:t>
+              <w:t>Inducción institucional y familiarización con el sistema de compras vigente.</w:t>
+            </w:r>
+          </w:p>
+        </w:tc>
+        <w:tc>
+          <w:tcPr>
+            <w:tcW w:w="523" w:type="dxa"/>
+            <w:shd w:val="clear" w:color="auto" w:fill="70AD47"/>
+          </w:tcPr>
+          <w:p>
+            <w:pPr>
+              <w:spacing w:before="60" w:after="60" w:line="240" w:lineRule="auto"/>
+              <w:jc w:val="center"/>
+            </w:pPr>
+            <w:r>
+              <w:rPr>
+                <w:rFonts w:ascii="Times New Roman" w:hAnsi="Times New Roman"/>
+                <w:b w:val="0"/>
+                <w:color w:val="FFFFFF"/>
+                <w:sz w:val="18"/>
+              </w:rPr>
+              <w:t>✓</w:t>
             </w:r>
           </w:p>
         </w:tc>
@@ -6425,7 +6866,7 @@
         <w:tc>
           <w:tcPr>
             <w:tcW w:w="523" w:type="dxa"/>
-            <w:shd w:val="clear" w:color="auto" w:fill="70AD47"/>
+            <w:shd w:val="clear" w:color="auto" w:fill="D9E1F2"/>
           </w:tcPr>
           <w:p>
             <w:pPr>
@@ -6436,10 +6877,72 @@
               <w:rPr>
                 <w:rFonts w:ascii="Times New Roman" w:hAnsi="Times New Roman"/>
                 <w:b w:val="0"/>
-                <w:color w:val="FFFFFF"/>
+                <w:color w:val="000000"/>
                 <w:sz w:val="18"/>
               </w:rPr>
-              <w:t>✓</w:t>
+            </w:r>
+          </w:p>
+        </w:tc>
+      </w:tr>
+      <w:tr>
+        <w:tc>
+          <w:tcPr>
+            <w:tcW w:w="3033" w:type="dxa"/>
+            <w:shd w:val="clear" w:color="auto" w:fill="FFFFFF"/>
+          </w:tcPr>
+          <w:p>
+            <w:pPr>
+              <w:spacing w:before="60" w:after="60" w:line="240" w:lineRule="auto"/>
+              <w:jc w:val="both"/>
+            </w:pPr>
+            <w:r>
+              <w:rPr>
+                <w:rFonts w:ascii="Times New Roman" w:hAnsi="Times New Roman"/>
+                <w:b w:val="0"/>
+                <w:color w:val="000000"/>
+                <w:sz w:val="20"/>
+              </w:rPr>
+              <w:t>Apoyo en la recepción y tramitación de solicitudes de compra del departamento.</w:t>
+            </w:r>
+          </w:p>
+        </w:tc>
+        <w:tc>
+          <w:tcPr>
+            <w:tcW w:w="523" w:type="dxa"/>
+            <w:shd w:val="clear" w:color="auto" w:fill="FFFFFF"/>
+          </w:tcPr>
+          <w:p>
+            <w:pPr>
+              <w:spacing w:before="60" w:after="60" w:line="240" w:lineRule="auto"/>
+              <w:jc w:val="center"/>
+            </w:pPr>
+            <w:r>
+              <w:rPr>
+                <w:rFonts w:ascii="Times New Roman" w:hAnsi="Times New Roman"/>
+                <w:b w:val="0"/>
+                <w:color w:val="000000"/>
+                <w:sz w:val="18"/>
+              </w:rPr>
+            </w:r>
+          </w:p>
+        </w:tc>
+        <w:tc>
+          <w:tcPr>
+            <w:tcW w:w="523" w:type="dxa"/>
+            <w:shd w:val="clear" w:color="auto" w:fill="FFFFFF"/>
+          </w:tcPr>
+          <w:p>
+            <w:pPr>
+              <w:spacing w:before="60" w:after="60" w:line="240" w:lineRule="auto"/>
+              <w:jc w:val="center"/>
+            </w:pPr>
+            <w:r>
+              <w:rPr>
+                <w:rFonts w:ascii="Times New Roman" w:hAnsi="Times New Roman"/>
+                <w:b w:val="0"/>
+                <w:color w:val="000000"/>
+                <w:sz w:val="18"/>
+              </w:rPr>
             </w:r>
           </w:p>
         </w:tc>
@@ -6464,26 +6967,23 @@
             </w:r>
           </w:p>
         </w:tc>
-      </w:tr>
-      <w:tr>
         <w:tc>
           <w:tcPr>
-            <w:tcW w:w="3033" w:type="dxa"/>
+            <w:tcW w:w="523" w:type="dxa"/>
             <w:shd w:val="clear" w:color="auto" w:fill="FFFFFF"/>
           </w:tcPr>
           <w:p>
             <w:pPr>
               <w:spacing w:before="60" w:after="60" w:line="240" w:lineRule="auto"/>
-              <w:jc w:val="both"/>
+              <w:jc w:val="center"/>
             </w:pPr>
             <w:r>
               <w:rPr>
                 <w:rFonts w:ascii="Times New Roman" w:hAnsi="Times New Roman"/>
                 <w:b w:val="0"/>
                 <w:color w:val="000000"/>
-                <w:sz w:val="20"/>
+                <w:sz w:val="18"/>
               </w:rPr>
-              <w:t>Inducción institucional y familiarización con el sistema de compras vigente.</w:t>
             </w:r>
           </w:p>
         </w:tc>
@@ -6505,6 +7005,354 @@
                 <w:sz w:val="18"/>
               </w:rPr>
               <w:t>✓</w:t>
+            </w:r>
+          </w:p>
+        </w:tc>
+        <w:tc>
+          <w:tcPr>
+            <w:tcW w:w="523" w:type="dxa"/>
+            <w:shd w:val="clear" w:color="auto" w:fill="FFFFFF"/>
+          </w:tcPr>
+          <w:p>
+            <w:pPr>
+              <w:spacing w:before="60" w:after="60" w:line="240" w:lineRule="auto"/>
+              <w:jc w:val="center"/>
+            </w:pPr>
+            <w:r>
+              <w:rPr>
+                <w:rFonts w:ascii="Times New Roman" w:hAnsi="Times New Roman"/>
+                <w:b w:val="0"/>
+                <w:color w:val="000000"/>
+                <w:sz w:val="18"/>
+              </w:rPr>
+            </w:r>
+          </w:p>
+        </w:tc>
+        <w:tc>
+          <w:tcPr>
+            <w:tcW w:w="523" w:type="dxa"/>
+            <w:shd w:val="clear" w:color="auto" w:fill="FFFFFF"/>
+          </w:tcPr>
+          <w:p>
+            <w:pPr>
+              <w:spacing w:before="60" w:after="60" w:line="240" w:lineRule="auto"/>
+              <w:jc w:val="center"/>
+            </w:pPr>
+            <w:r>
+              <w:rPr>
+                <w:rFonts w:ascii="Times New Roman" w:hAnsi="Times New Roman"/>
+                <w:b w:val="0"/>
+                <w:color w:val="000000"/>
+                <w:sz w:val="18"/>
+              </w:rPr>
+            </w:r>
+          </w:p>
+        </w:tc>
+        <w:tc>
+          <w:tcPr>
+            <w:tcW w:w="523" w:type="dxa"/>
+            <w:shd w:val="clear" w:color="auto" w:fill="FFFFFF"/>
+          </w:tcPr>
+          <w:p>
+            <w:pPr>
+              <w:spacing w:before="60" w:after="60" w:line="240" w:lineRule="auto"/>
+              <w:jc w:val="center"/>
+            </w:pPr>
+            <w:r>
+              <w:rPr>
+                <w:rFonts w:ascii="Times New Roman" w:hAnsi="Times New Roman"/>
+                <w:b w:val="0"/>
+                <w:color w:val="000000"/>
+                <w:sz w:val="18"/>
+              </w:rPr>
+            </w:r>
+          </w:p>
+        </w:tc>
+        <w:tc>
+          <w:tcPr>
+            <w:tcW w:w="523" w:type="dxa"/>
+            <w:shd w:val="clear" w:color="auto" w:fill="FFFFFF"/>
+          </w:tcPr>
+          <w:p>
+            <w:pPr>
+              <w:spacing w:before="60" w:after="60" w:line="240" w:lineRule="auto"/>
+              <w:jc w:val="center"/>
+            </w:pPr>
+            <w:r>
+              <w:rPr>
+                <w:rFonts w:ascii="Times New Roman" w:hAnsi="Times New Roman"/>
+                <w:b w:val="0"/>
+                <w:color w:val="000000"/>
+                <w:sz w:val="18"/>
+              </w:rPr>
+            </w:r>
+          </w:p>
+        </w:tc>
+        <w:tc>
+          <w:tcPr>
+            <w:tcW w:w="523" w:type="dxa"/>
+            <w:shd w:val="clear" w:color="auto" w:fill="FFFFFF"/>
+          </w:tcPr>
+          <w:p>
+            <w:pPr>
+              <w:spacing w:before="60" w:after="60" w:line="240" w:lineRule="auto"/>
+              <w:jc w:val="center"/>
+            </w:pPr>
+            <w:r>
+              <w:rPr>
+                <w:rFonts w:ascii="Times New Roman" w:hAnsi="Times New Roman"/>
+                <w:b w:val="0"/>
+                <w:color w:val="000000"/>
+                <w:sz w:val="18"/>
+              </w:rPr>
+            </w:r>
+          </w:p>
+        </w:tc>
+      </w:tr>
+      <w:tr>
+        <w:tc>
+          <w:tcPr>
+            <w:tcW w:w="3033" w:type="dxa"/>
+            <w:shd w:val="clear" w:color="auto" w:fill="D9E1F2"/>
+          </w:tcPr>
+          <w:p>
+            <w:pPr>
+              <w:spacing w:before="60" w:after="60" w:line="240" w:lineRule="auto"/>
+              <w:jc w:val="both"/>
+            </w:pPr>
+            <w:r>
+              <w:rPr>
+                <w:rFonts w:ascii="Times New Roman" w:hAnsi="Times New Roman"/>
+                <w:b w:val="0"/>
+                <w:color w:val="000000"/>
+                <w:sz w:val="20"/>
+              </w:rPr>
+              <w:t>Seguimiento a cotizaciones y actualización de expedientes de proveedores.</w:t>
+            </w:r>
+          </w:p>
+        </w:tc>
+        <w:tc>
+          <w:tcPr>
+            <w:tcW w:w="523" w:type="dxa"/>
+            <w:shd w:val="clear" w:color="auto" w:fill="D9E1F2"/>
+          </w:tcPr>
+          <w:p>
+            <w:pPr>
+              <w:spacing w:before="60" w:after="60" w:line="240" w:lineRule="auto"/>
+              <w:jc w:val="center"/>
+            </w:pPr>
+            <w:r>
+              <w:rPr>
+                <w:rFonts w:ascii="Times New Roman" w:hAnsi="Times New Roman"/>
+                <w:b w:val="0"/>
+                <w:color w:val="000000"/>
+                <w:sz w:val="18"/>
+              </w:rPr>
+            </w:r>
+          </w:p>
+        </w:tc>
+        <w:tc>
+          <w:tcPr>
+            <w:tcW w:w="523" w:type="dxa"/>
+            <w:shd w:val="clear" w:color="auto" w:fill="D9E1F2"/>
+          </w:tcPr>
+          <w:p>
+            <w:pPr>
+              <w:spacing w:before="60" w:after="60" w:line="240" w:lineRule="auto"/>
+              <w:jc w:val="center"/>
+            </w:pPr>
+            <w:r>
+              <w:rPr>
+                <w:rFonts w:ascii="Times New Roman" w:hAnsi="Times New Roman"/>
+                <w:b w:val="0"/>
+                <w:color w:val="000000"/>
+                <w:sz w:val="18"/>
+              </w:rPr>
+            </w:r>
+          </w:p>
+        </w:tc>
+        <w:tc>
+          <w:tcPr>
+            <w:tcW w:w="523" w:type="dxa"/>
+            <w:shd w:val="clear" w:color="auto" w:fill="D9E1F2"/>
+          </w:tcPr>
+          <w:p>
+            <w:pPr>
+              <w:spacing w:before="60" w:after="60" w:line="240" w:lineRule="auto"/>
+              <w:jc w:val="center"/>
+            </w:pPr>
+            <w:r>
+              <w:rPr>
+                <w:rFonts w:ascii="Times New Roman" w:hAnsi="Times New Roman"/>
+                <w:b w:val="0"/>
+                <w:color w:val="000000"/>
+                <w:sz w:val="18"/>
+              </w:rPr>
+            </w:r>
+          </w:p>
+        </w:tc>
+        <w:tc>
+          <w:tcPr>
+            <w:tcW w:w="523" w:type="dxa"/>
+            <w:shd w:val="clear" w:color="auto" w:fill="D9E1F2"/>
+          </w:tcPr>
+          <w:p>
+            <w:pPr>
+              <w:spacing w:before="60" w:after="60" w:line="240" w:lineRule="auto"/>
+              <w:jc w:val="center"/>
+            </w:pPr>
+            <w:r>
+              <w:rPr>
+                <w:rFonts w:ascii="Times New Roman" w:hAnsi="Times New Roman"/>
+                <w:b w:val="0"/>
+                <w:color w:val="000000"/>
+                <w:sz w:val="18"/>
+              </w:rPr>
+            </w:r>
+          </w:p>
+        </w:tc>
+        <w:tc>
+          <w:tcPr>
+            <w:tcW w:w="523" w:type="dxa"/>
+            <w:shd w:val="clear" w:color="auto" w:fill="D9E1F2"/>
+          </w:tcPr>
+          <w:p>
+            <w:pPr>
+              <w:spacing w:before="60" w:after="60" w:line="240" w:lineRule="auto"/>
+              <w:jc w:val="center"/>
+            </w:pPr>
+            <w:r>
+              <w:rPr>
+                <w:rFonts w:ascii="Times New Roman" w:hAnsi="Times New Roman"/>
+                <w:b w:val="0"/>
+                <w:color w:val="000000"/>
+                <w:sz w:val="18"/>
+              </w:rPr>
+            </w:r>
+          </w:p>
+        </w:tc>
+        <w:tc>
+          <w:tcPr>
+            <w:tcW w:w="523" w:type="dxa"/>
+            <w:shd w:val="clear" w:color="auto" w:fill="70AD47"/>
+          </w:tcPr>
+          <w:p>
+            <w:pPr>
+              <w:spacing w:before="60" w:after="60" w:line="240" w:lineRule="auto"/>
+              <w:jc w:val="center"/>
+            </w:pPr>
+            <w:r>
+              <w:rPr>
+                <w:rFonts w:ascii="Times New Roman" w:hAnsi="Times New Roman"/>
+                <w:b w:val="0"/>
+                <w:color w:val="FFFFFF"/>
+                <w:sz w:val="18"/>
+              </w:rPr>
+              <w:t>✓</w:t>
+            </w:r>
+          </w:p>
+        </w:tc>
+        <w:tc>
+          <w:tcPr>
+            <w:tcW w:w="523" w:type="dxa"/>
+            <w:shd w:val="clear" w:color="auto" w:fill="D9E1F2"/>
+          </w:tcPr>
+          <w:p>
+            <w:pPr>
+              <w:spacing w:before="60" w:after="60" w:line="240" w:lineRule="auto"/>
+              <w:jc w:val="center"/>
+            </w:pPr>
+            <w:r>
+              <w:rPr>
+                <w:rFonts w:ascii="Times New Roman" w:hAnsi="Times New Roman"/>
+                <w:b w:val="0"/>
+                <w:color w:val="000000"/>
+                <w:sz w:val="18"/>
+              </w:rPr>
+            </w:r>
+          </w:p>
+        </w:tc>
+        <w:tc>
+          <w:tcPr>
+            <w:tcW w:w="523" w:type="dxa"/>
+            <w:shd w:val="clear" w:color="auto" w:fill="70AD47"/>
+          </w:tcPr>
+          <w:p>
+            <w:pPr>
+              <w:spacing w:before="60" w:after="60" w:line="240" w:lineRule="auto"/>
+              <w:jc w:val="center"/>
+            </w:pPr>
+            <w:r>
+              <w:rPr>
+                <w:rFonts w:ascii="Times New Roman" w:hAnsi="Times New Roman"/>
+                <w:b w:val="0"/>
+                <w:color w:val="FFFFFF"/>
+                <w:sz w:val="18"/>
+              </w:rPr>
+              <w:t>✓</w:t>
+            </w:r>
+          </w:p>
+        </w:tc>
+        <w:tc>
+          <w:tcPr>
+            <w:tcW w:w="523" w:type="dxa"/>
+            <w:shd w:val="clear" w:color="auto" w:fill="D9E1F2"/>
+          </w:tcPr>
+          <w:p>
+            <w:pPr>
+              <w:spacing w:before="60" w:after="60" w:line="240" w:lineRule="auto"/>
+              <w:jc w:val="center"/>
+            </w:pPr>
+            <w:r>
+              <w:rPr>
+                <w:rFonts w:ascii="Times New Roman" w:hAnsi="Times New Roman"/>
+                <w:b w:val="0"/>
+                <w:color w:val="000000"/>
+                <w:sz w:val="18"/>
+              </w:rPr>
+            </w:r>
+          </w:p>
+        </w:tc>
+        <w:tc>
+          <w:tcPr>
+            <w:tcW w:w="523" w:type="dxa"/>
+            <w:shd w:val="clear" w:color="auto" w:fill="D9E1F2"/>
+          </w:tcPr>
+          <w:p>
+            <w:pPr>
+              <w:spacing w:before="60" w:after="60" w:line="240" w:lineRule="auto"/>
+              <w:jc w:val="center"/>
+            </w:pPr>
+            <w:r>
+              <w:rPr>
+                <w:rFonts w:ascii="Times New Roman" w:hAnsi="Times New Roman"/>
+                <w:b w:val="0"/>
+                <w:color w:val="000000"/>
+                <w:sz w:val="18"/>
+              </w:rPr>
+            </w:r>
+          </w:p>
+        </w:tc>
+      </w:tr>
+      <w:tr>
+        <w:tc>
+          <w:tcPr>
+            <w:tcW w:w="3033" w:type="dxa"/>
+            <w:shd w:val="clear" w:color="auto" w:fill="FFFFFF"/>
+          </w:tcPr>
+          <w:p>
+            <w:pPr>
+              <w:spacing w:before="60" w:after="60" w:line="240" w:lineRule="auto"/>
+              <w:jc w:val="both"/>
+            </w:pPr>
+            <w:r>
+              <w:rPr>
+                <w:rFonts w:ascii="Times New Roman" w:hAnsi="Times New Roman"/>
+                <w:b w:val="0"/>
+                <w:color w:val="000000"/>
+                <w:sz w:val="20"/>
+              </w:rPr>
+              <w:t>Apoyo en el cierre administrativo del período y archivo de órdenes de compra.</w:t>
             </w:r>
           </w:p>
         </w:tc>
@@ -6652,659 +7500,6 @@
           <w:tcPr>
             <w:tcW w:w="523" w:type="dxa"/>
             <w:shd w:val="clear" w:color="auto" w:fill="FFFFFF"/>
-          </w:tcPr>
-          <w:p>
-            <w:pPr>
-              <w:spacing w:before="60" w:after="60" w:line="240" w:lineRule="auto"/>
-              <w:jc w:val="center"/>
-            </w:pPr>
-            <w:r>
-              <w:rPr>
-                <w:rFonts w:ascii="Times New Roman" w:hAnsi="Times New Roman"/>
-                <w:b w:val="0"/>
-                <w:color w:val="000000"/>
-                <w:sz w:val="18"/>
-              </w:rPr>
-            </w:r>
-          </w:p>
-        </w:tc>
-        <w:tc>
-          <w:tcPr>
-            <w:tcW w:w="523" w:type="dxa"/>
-            <w:shd w:val="clear" w:color="auto" w:fill="FFFFFF"/>
-          </w:tcPr>
-          <w:p>
-            <w:pPr>
-              <w:spacing w:before="60" w:after="60" w:line="240" w:lineRule="auto"/>
-              <w:jc w:val="center"/>
-            </w:pPr>
-            <w:r>
-              <w:rPr>
-                <w:rFonts w:ascii="Times New Roman" w:hAnsi="Times New Roman"/>
-                <w:b w:val="0"/>
-                <w:color w:val="000000"/>
-                <w:sz w:val="18"/>
-              </w:rPr>
-            </w:r>
-          </w:p>
-        </w:tc>
-      </w:tr>
-      <w:tr>
-        <w:tc>
-          <w:tcPr>
-            <w:tcW w:w="3033" w:type="dxa"/>
-            <w:shd w:val="clear" w:color="auto" w:fill="D9E1F2"/>
-          </w:tcPr>
-          <w:p>
-            <w:pPr>
-              <w:spacing w:before="60" w:after="60" w:line="240" w:lineRule="auto"/>
-              <w:jc w:val="both"/>
-            </w:pPr>
-            <w:r>
-              <w:rPr>
-                <w:rFonts w:ascii="Times New Roman" w:hAnsi="Times New Roman"/>
-                <w:b w:val="0"/>
-                <w:color w:val="000000"/>
-                <w:sz w:val="20"/>
-              </w:rPr>
-              <w:t>Apoyo en la recepción y tramitación de solicitudes de compra del departamento.</w:t>
-            </w:r>
-          </w:p>
-        </w:tc>
-        <w:tc>
-          <w:tcPr>
-            <w:tcW w:w="523" w:type="dxa"/>
-            <w:shd w:val="clear" w:color="auto" w:fill="D9E1F2"/>
-          </w:tcPr>
-          <w:p>
-            <w:pPr>
-              <w:spacing w:before="60" w:after="60" w:line="240" w:lineRule="auto"/>
-              <w:jc w:val="center"/>
-            </w:pPr>
-            <w:r>
-              <w:rPr>
-                <w:rFonts w:ascii="Times New Roman" w:hAnsi="Times New Roman"/>
-                <w:b w:val="0"/>
-                <w:color w:val="000000"/>
-                <w:sz w:val="18"/>
-              </w:rPr>
-            </w:r>
-          </w:p>
-        </w:tc>
-        <w:tc>
-          <w:tcPr>
-            <w:tcW w:w="523" w:type="dxa"/>
-            <w:shd w:val="clear" w:color="auto" w:fill="D9E1F2"/>
-          </w:tcPr>
-          <w:p>
-            <w:pPr>
-              <w:spacing w:before="60" w:after="60" w:line="240" w:lineRule="auto"/>
-              <w:jc w:val="center"/>
-            </w:pPr>
-            <w:r>
-              <w:rPr>
-                <w:rFonts w:ascii="Times New Roman" w:hAnsi="Times New Roman"/>
-                <w:b w:val="0"/>
-                <w:color w:val="000000"/>
-                <w:sz w:val="18"/>
-              </w:rPr>
-            </w:r>
-          </w:p>
-        </w:tc>
-        <w:tc>
-          <w:tcPr>
-            <w:tcW w:w="523" w:type="dxa"/>
-            <w:shd w:val="clear" w:color="auto" w:fill="70AD47"/>
-          </w:tcPr>
-          <w:p>
-            <w:pPr>
-              <w:spacing w:before="60" w:after="60" w:line="240" w:lineRule="auto"/>
-              <w:jc w:val="center"/>
-            </w:pPr>
-            <w:r>
-              <w:rPr>
-                <w:rFonts w:ascii="Times New Roman" w:hAnsi="Times New Roman"/>
-                <w:b w:val="0"/>
-                <w:color w:val="FFFFFF"/>
-                <w:sz w:val="18"/>
-              </w:rPr>
-              <w:t>✓</w:t>
-            </w:r>
-          </w:p>
-        </w:tc>
-        <w:tc>
-          <w:tcPr>
-            <w:tcW w:w="523" w:type="dxa"/>
-            <w:shd w:val="clear" w:color="auto" w:fill="D9E1F2"/>
-          </w:tcPr>
-          <w:p>
-            <w:pPr>
-              <w:spacing w:before="60" w:after="60" w:line="240" w:lineRule="auto"/>
-              <w:jc w:val="center"/>
-            </w:pPr>
-            <w:r>
-              <w:rPr>
-                <w:rFonts w:ascii="Times New Roman" w:hAnsi="Times New Roman"/>
-                <w:b w:val="0"/>
-                <w:color w:val="000000"/>
-                <w:sz w:val="18"/>
-              </w:rPr>
-            </w:r>
-          </w:p>
-        </w:tc>
-        <w:tc>
-          <w:tcPr>
-            <w:tcW w:w="523" w:type="dxa"/>
-            <w:shd w:val="clear" w:color="auto" w:fill="70AD47"/>
-          </w:tcPr>
-          <w:p>
-            <w:pPr>
-              <w:spacing w:before="60" w:after="60" w:line="240" w:lineRule="auto"/>
-              <w:jc w:val="center"/>
-            </w:pPr>
-            <w:r>
-              <w:rPr>
-                <w:rFonts w:ascii="Times New Roman" w:hAnsi="Times New Roman"/>
-                <w:b w:val="0"/>
-                <w:color w:val="FFFFFF"/>
-                <w:sz w:val="18"/>
-              </w:rPr>
-              <w:t>✓</w:t>
-            </w:r>
-          </w:p>
-        </w:tc>
-        <w:tc>
-          <w:tcPr>
-            <w:tcW w:w="523" w:type="dxa"/>
-            <w:shd w:val="clear" w:color="auto" w:fill="D9E1F2"/>
-          </w:tcPr>
-          <w:p>
-            <w:pPr>
-              <w:spacing w:before="60" w:after="60" w:line="240" w:lineRule="auto"/>
-              <w:jc w:val="center"/>
-            </w:pPr>
-            <w:r>
-              <w:rPr>
-                <w:rFonts w:ascii="Times New Roman" w:hAnsi="Times New Roman"/>
-                <w:b w:val="0"/>
-                <w:color w:val="000000"/>
-                <w:sz w:val="18"/>
-              </w:rPr>
-            </w:r>
-          </w:p>
-        </w:tc>
-        <w:tc>
-          <w:tcPr>
-            <w:tcW w:w="523" w:type="dxa"/>
-            <w:shd w:val="clear" w:color="auto" w:fill="D9E1F2"/>
-          </w:tcPr>
-          <w:p>
-            <w:pPr>
-              <w:spacing w:before="60" w:after="60" w:line="240" w:lineRule="auto"/>
-              <w:jc w:val="center"/>
-            </w:pPr>
-            <w:r>
-              <w:rPr>
-                <w:rFonts w:ascii="Times New Roman" w:hAnsi="Times New Roman"/>
-                <w:b w:val="0"/>
-                <w:color w:val="000000"/>
-                <w:sz w:val="18"/>
-              </w:rPr>
-            </w:r>
-          </w:p>
-        </w:tc>
-        <w:tc>
-          <w:tcPr>
-            <w:tcW w:w="523" w:type="dxa"/>
-            <w:shd w:val="clear" w:color="auto" w:fill="D9E1F2"/>
-          </w:tcPr>
-          <w:p>
-            <w:pPr>
-              <w:spacing w:before="60" w:after="60" w:line="240" w:lineRule="auto"/>
-              <w:jc w:val="center"/>
-            </w:pPr>
-            <w:r>
-              <w:rPr>
-                <w:rFonts w:ascii="Times New Roman" w:hAnsi="Times New Roman"/>
-                <w:b w:val="0"/>
-                <w:color w:val="000000"/>
-                <w:sz w:val="18"/>
-              </w:rPr>
-            </w:r>
-          </w:p>
-        </w:tc>
-        <w:tc>
-          <w:tcPr>
-            <w:tcW w:w="523" w:type="dxa"/>
-            <w:shd w:val="clear" w:color="auto" w:fill="D9E1F2"/>
-          </w:tcPr>
-          <w:p>
-            <w:pPr>
-              <w:spacing w:before="60" w:after="60" w:line="240" w:lineRule="auto"/>
-              <w:jc w:val="center"/>
-            </w:pPr>
-            <w:r>
-              <w:rPr>
-                <w:rFonts w:ascii="Times New Roman" w:hAnsi="Times New Roman"/>
-                <w:b w:val="0"/>
-                <w:color w:val="000000"/>
-                <w:sz w:val="18"/>
-              </w:rPr>
-            </w:r>
-          </w:p>
-        </w:tc>
-        <w:tc>
-          <w:tcPr>
-            <w:tcW w:w="523" w:type="dxa"/>
-            <w:shd w:val="clear" w:color="auto" w:fill="D9E1F2"/>
-          </w:tcPr>
-          <w:p>
-            <w:pPr>
-              <w:spacing w:before="60" w:after="60" w:line="240" w:lineRule="auto"/>
-              <w:jc w:val="center"/>
-            </w:pPr>
-            <w:r>
-              <w:rPr>
-                <w:rFonts w:ascii="Times New Roman" w:hAnsi="Times New Roman"/>
-                <w:b w:val="0"/>
-                <w:color w:val="000000"/>
-                <w:sz w:val="18"/>
-              </w:rPr>
-            </w:r>
-          </w:p>
-        </w:tc>
-      </w:tr>
-      <w:tr>
-        <w:tc>
-          <w:tcPr>
-            <w:tcW w:w="3033" w:type="dxa"/>
-            <w:shd w:val="clear" w:color="auto" w:fill="FFFFFF"/>
-          </w:tcPr>
-          <w:p>
-            <w:pPr>
-              <w:spacing w:before="60" w:after="60" w:line="240" w:lineRule="auto"/>
-              <w:jc w:val="both"/>
-            </w:pPr>
-            <w:r>
-              <w:rPr>
-                <w:rFonts w:ascii="Times New Roman" w:hAnsi="Times New Roman"/>
-                <w:b w:val="0"/>
-                <w:color w:val="000000"/>
-                <w:sz w:val="20"/>
-              </w:rPr>
-              <w:t>Seguimiento a cotizaciones y actualización de expedientes de proveedores.</w:t>
-            </w:r>
-          </w:p>
-        </w:tc>
-        <w:tc>
-          <w:tcPr>
-            <w:tcW w:w="523" w:type="dxa"/>
-            <w:shd w:val="clear" w:color="auto" w:fill="FFFFFF"/>
-          </w:tcPr>
-          <w:p>
-            <w:pPr>
-              <w:spacing w:before="60" w:after="60" w:line="240" w:lineRule="auto"/>
-              <w:jc w:val="center"/>
-            </w:pPr>
-            <w:r>
-              <w:rPr>
-                <w:rFonts w:ascii="Times New Roman" w:hAnsi="Times New Roman"/>
-                <w:b w:val="0"/>
-                <w:color w:val="000000"/>
-                <w:sz w:val="18"/>
-              </w:rPr>
-            </w:r>
-          </w:p>
-        </w:tc>
-        <w:tc>
-          <w:tcPr>
-            <w:tcW w:w="523" w:type="dxa"/>
-            <w:shd w:val="clear" w:color="auto" w:fill="FFFFFF"/>
-          </w:tcPr>
-          <w:p>
-            <w:pPr>
-              <w:spacing w:before="60" w:after="60" w:line="240" w:lineRule="auto"/>
-              <w:jc w:val="center"/>
-            </w:pPr>
-            <w:r>
-              <w:rPr>
-                <w:rFonts w:ascii="Times New Roman" w:hAnsi="Times New Roman"/>
-                <w:b w:val="0"/>
-                <w:color w:val="000000"/>
-                <w:sz w:val="18"/>
-              </w:rPr>
-            </w:r>
-          </w:p>
-        </w:tc>
-        <w:tc>
-          <w:tcPr>
-            <w:tcW w:w="523" w:type="dxa"/>
-            <w:shd w:val="clear" w:color="auto" w:fill="FFFFFF"/>
-          </w:tcPr>
-          <w:p>
-            <w:pPr>
-              <w:spacing w:before="60" w:after="60" w:line="240" w:lineRule="auto"/>
-              <w:jc w:val="center"/>
-            </w:pPr>
-            <w:r>
-              <w:rPr>
-                <w:rFonts w:ascii="Times New Roman" w:hAnsi="Times New Roman"/>
-                <w:b w:val="0"/>
-                <w:color w:val="000000"/>
-                <w:sz w:val="18"/>
-              </w:rPr>
-            </w:r>
-          </w:p>
-        </w:tc>
-        <w:tc>
-          <w:tcPr>
-            <w:tcW w:w="523" w:type="dxa"/>
-            <w:shd w:val="clear" w:color="auto" w:fill="FFFFFF"/>
-          </w:tcPr>
-          <w:p>
-            <w:pPr>
-              <w:spacing w:before="60" w:after="60" w:line="240" w:lineRule="auto"/>
-              <w:jc w:val="center"/>
-            </w:pPr>
-            <w:r>
-              <w:rPr>
-                <w:rFonts w:ascii="Times New Roman" w:hAnsi="Times New Roman"/>
-                <w:b w:val="0"/>
-                <w:color w:val="000000"/>
-                <w:sz w:val="18"/>
-              </w:rPr>
-            </w:r>
-          </w:p>
-        </w:tc>
-        <w:tc>
-          <w:tcPr>
-            <w:tcW w:w="523" w:type="dxa"/>
-            <w:shd w:val="clear" w:color="auto" w:fill="FFFFFF"/>
-          </w:tcPr>
-          <w:p>
-            <w:pPr>
-              <w:spacing w:before="60" w:after="60" w:line="240" w:lineRule="auto"/>
-              <w:jc w:val="center"/>
-            </w:pPr>
-            <w:r>
-              <w:rPr>
-                <w:rFonts w:ascii="Times New Roman" w:hAnsi="Times New Roman"/>
-                <w:b w:val="0"/>
-                <w:color w:val="000000"/>
-                <w:sz w:val="18"/>
-              </w:rPr>
-            </w:r>
-          </w:p>
-        </w:tc>
-        <w:tc>
-          <w:tcPr>
-            <w:tcW w:w="523" w:type="dxa"/>
-            <w:shd w:val="clear" w:color="auto" w:fill="70AD47"/>
-          </w:tcPr>
-          <w:p>
-            <w:pPr>
-              <w:spacing w:before="60" w:after="60" w:line="240" w:lineRule="auto"/>
-              <w:jc w:val="center"/>
-            </w:pPr>
-            <w:r>
-              <w:rPr>
-                <w:rFonts w:ascii="Times New Roman" w:hAnsi="Times New Roman"/>
-                <w:b w:val="0"/>
-                <w:color w:val="FFFFFF"/>
-                <w:sz w:val="18"/>
-              </w:rPr>
-              <w:t>✓</w:t>
-            </w:r>
-          </w:p>
-        </w:tc>
-        <w:tc>
-          <w:tcPr>
-            <w:tcW w:w="523" w:type="dxa"/>
-            <w:shd w:val="clear" w:color="auto" w:fill="FFFFFF"/>
-          </w:tcPr>
-          <w:p>
-            <w:pPr>
-              <w:spacing w:before="60" w:after="60" w:line="240" w:lineRule="auto"/>
-              <w:jc w:val="center"/>
-            </w:pPr>
-            <w:r>
-              <w:rPr>
-                <w:rFonts w:ascii="Times New Roman" w:hAnsi="Times New Roman"/>
-                <w:b w:val="0"/>
-                <w:color w:val="000000"/>
-                <w:sz w:val="18"/>
-              </w:rPr>
-            </w:r>
-          </w:p>
-        </w:tc>
-        <w:tc>
-          <w:tcPr>
-            <w:tcW w:w="523" w:type="dxa"/>
-            <w:shd w:val="clear" w:color="auto" w:fill="70AD47"/>
-          </w:tcPr>
-          <w:p>
-            <w:pPr>
-              <w:spacing w:before="60" w:after="60" w:line="240" w:lineRule="auto"/>
-              <w:jc w:val="center"/>
-            </w:pPr>
-            <w:r>
-              <w:rPr>
-                <w:rFonts w:ascii="Times New Roman" w:hAnsi="Times New Roman"/>
-                <w:b w:val="0"/>
-                <w:color w:val="FFFFFF"/>
-                <w:sz w:val="18"/>
-              </w:rPr>
-              <w:t>✓</w:t>
-            </w:r>
-          </w:p>
-        </w:tc>
-        <w:tc>
-          <w:tcPr>
-            <w:tcW w:w="523" w:type="dxa"/>
-            <w:shd w:val="clear" w:color="auto" w:fill="FFFFFF"/>
-          </w:tcPr>
-          <w:p>
-            <w:pPr>
-              <w:spacing w:before="60" w:after="60" w:line="240" w:lineRule="auto"/>
-              <w:jc w:val="center"/>
-            </w:pPr>
-            <w:r>
-              <w:rPr>
-                <w:rFonts w:ascii="Times New Roman" w:hAnsi="Times New Roman"/>
-                <w:b w:val="0"/>
-                <w:color w:val="000000"/>
-                <w:sz w:val="18"/>
-              </w:rPr>
-            </w:r>
-          </w:p>
-        </w:tc>
-        <w:tc>
-          <w:tcPr>
-            <w:tcW w:w="523" w:type="dxa"/>
-            <w:shd w:val="clear" w:color="auto" w:fill="FFFFFF"/>
-          </w:tcPr>
-          <w:p>
-            <w:pPr>
-              <w:spacing w:before="60" w:after="60" w:line="240" w:lineRule="auto"/>
-              <w:jc w:val="center"/>
-            </w:pPr>
-            <w:r>
-              <w:rPr>
-                <w:rFonts w:ascii="Times New Roman" w:hAnsi="Times New Roman"/>
-                <w:b w:val="0"/>
-                <w:color w:val="000000"/>
-                <w:sz w:val="18"/>
-              </w:rPr>
-            </w:r>
-          </w:p>
-        </w:tc>
-      </w:tr>
-      <w:tr>
-        <w:tc>
-          <w:tcPr>
-            <w:tcW w:w="3033" w:type="dxa"/>
-            <w:shd w:val="clear" w:color="auto" w:fill="D9E1F2"/>
-          </w:tcPr>
-          <w:p>
-            <w:pPr>
-              <w:spacing w:before="60" w:after="60" w:line="240" w:lineRule="auto"/>
-              <w:jc w:val="both"/>
-            </w:pPr>
-            <w:r>
-              <w:rPr>
-                <w:rFonts w:ascii="Times New Roman" w:hAnsi="Times New Roman"/>
-                <w:b w:val="0"/>
-                <w:color w:val="000000"/>
-                <w:sz w:val="20"/>
-              </w:rPr>
-              <w:t>Apoyo en el cierre administrativo del período y archivo de órdenes de compra.</w:t>
-            </w:r>
-          </w:p>
-        </w:tc>
-        <w:tc>
-          <w:tcPr>
-            <w:tcW w:w="523" w:type="dxa"/>
-            <w:shd w:val="clear" w:color="auto" w:fill="D9E1F2"/>
-          </w:tcPr>
-          <w:p>
-            <w:pPr>
-              <w:spacing w:before="60" w:after="60" w:line="240" w:lineRule="auto"/>
-              <w:jc w:val="center"/>
-            </w:pPr>
-            <w:r>
-              <w:rPr>
-                <w:rFonts w:ascii="Times New Roman" w:hAnsi="Times New Roman"/>
-                <w:b w:val="0"/>
-                <w:color w:val="000000"/>
-                <w:sz w:val="18"/>
-              </w:rPr>
-            </w:r>
-          </w:p>
-        </w:tc>
-        <w:tc>
-          <w:tcPr>
-            <w:tcW w:w="523" w:type="dxa"/>
-            <w:shd w:val="clear" w:color="auto" w:fill="D9E1F2"/>
-          </w:tcPr>
-          <w:p>
-            <w:pPr>
-              <w:spacing w:before="60" w:after="60" w:line="240" w:lineRule="auto"/>
-              <w:jc w:val="center"/>
-            </w:pPr>
-            <w:r>
-              <w:rPr>
-                <w:rFonts w:ascii="Times New Roman" w:hAnsi="Times New Roman"/>
-                <w:b w:val="0"/>
-                <w:color w:val="000000"/>
-                <w:sz w:val="18"/>
-              </w:rPr>
-            </w:r>
-          </w:p>
-        </w:tc>
-        <w:tc>
-          <w:tcPr>
-            <w:tcW w:w="523" w:type="dxa"/>
-            <w:shd w:val="clear" w:color="auto" w:fill="D9E1F2"/>
-          </w:tcPr>
-          <w:p>
-            <w:pPr>
-              <w:spacing w:before="60" w:after="60" w:line="240" w:lineRule="auto"/>
-              <w:jc w:val="center"/>
-            </w:pPr>
-            <w:r>
-              <w:rPr>
-                <w:rFonts w:ascii="Times New Roman" w:hAnsi="Times New Roman"/>
-                <w:b w:val="0"/>
-                <w:color w:val="000000"/>
-                <w:sz w:val="18"/>
-              </w:rPr>
-            </w:r>
-          </w:p>
-        </w:tc>
-        <w:tc>
-          <w:tcPr>
-            <w:tcW w:w="523" w:type="dxa"/>
-            <w:shd w:val="clear" w:color="auto" w:fill="D9E1F2"/>
-          </w:tcPr>
-          <w:p>
-            <w:pPr>
-              <w:spacing w:before="60" w:after="60" w:line="240" w:lineRule="auto"/>
-              <w:jc w:val="center"/>
-            </w:pPr>
-            <w:r>
-              <w:rPr>
-                <w:rFonts w:ascii="Times New Roman" w:hAnsi="Times New Roman"/>
-                <w:b w:val="0"/>
-                <w:color w:val="000000"/>
-                <w:sz w:val="18"/>
-              </w:rPr>
-            </w:r>
-          </w:p>
-        </w:tc>
-        <w:tc>
-          <w:tcPr>
-            <w:tcW w:w="523" w:type="dxa"/>
-            <w:shd w:val="clear" w:color="auto" w:fill="D9E1F2"/>
-          </w:tcPr>
-          <w:p>
-            <w:pPr>
-              <w:spacing w:before="60" w:after="60" w:line="240" w:lineRule="auto"/>
-              <w:jc w:val="center"/>
-            </w:pPr>
-            <w:r>
-              <w:rPr>
-                <w:rFonts w:ascii="Times New Roman" w:hAnsi="Times New Roman"/>
-                <w:b w:val="0"/>
-                <w:color w:val="000000"/>
-                <w:sz w:val="18"/>
-              </w:rPr>
-            </w:r>
-          </w:p>
-        </w:tc>
-        <w:tc>
-          <w:tcPr>
-            <w:tcW w:w="523" w:type="dxa"/>
-            <w:shd w:val="clear" w:color="auto" w:fill="D9E1F2"/>
-          </w:tcPr>
-          <w:p>
-            <w:pPr>
-              <w:spacing w:before="60" w:after="60" w:line="240" w:lineRule="auto"/>
-              <w:jc w:val="center"/>
-            </w:pPr>
-            <w:r>
-              <w:rPr>
-                <w:rFonts w:ascii="Times New Roman" w:hAnsi="Times New Roman"/>
-                <w:b w:val="0"/>
-                <w:color w:val="000000"/>
-                <w:sz w:val="18"/>
-              </w:rPr>
-            </w:r>
-          </w:p>
-        </w:tc>
-        <w:tc>
-          <w:tcPr>
-            <w:tcW w:w="523" w:type="dxa"/>
-            <w:shd w:val="clear" w:color="auto" w:fill="D9E1F2"/>
-          </w:tcPr>
-          <w:p>
-            <w:pPr>
-              <w:spacing w:before="60" w:after="60" w:line="240" w:lineRule="auto"/>
-              <w:jc w:val="center"/>
-            </w:pPr>
-            <w:r>
-              <w:rPr>
-                <w:rFonts w:ascii="Times New Roman" w:hAnsi="Times New Roman"/>
-                <w:b w:val="0"/>
-                <w:color w:val="000000"/>
-                <w:sz w:val="18"/>
-              </w:rPr>
-            </w:r>
-          </w:p>
-        </w:tc>
-        <w:tc>
-          <w:tcPr>
-            <w:tcW w:w="523" w:type="dxa"/>
-            <w:shd w:val="clear" w:color="auto" w:fill="D9E1F2"/>
           </w:tcPr>
           <w:p>
             <w:pPr>

</xml_diff>

<commit_message>
Indice: CAPÍTULO I/II/III/IV/V en vez de solo numero romano
</commit_message>
<xml_diff>
--- a/keidy/reportes/Informe_Pasantia_IUTECP.docx
+++ b/keidy/reportes/Informe_Pasantia_IUTECP.docx
@@ -603,7 +603,7 @@
           <w:b/>
           <w:sz w:val="24"/>
         </w:rPr>
-        <w:t>I REALIDAD ORGANIZACIONAL</w:t>
+        <w:t>CAPÍTULO I: REALIDAD ORGANIZACIONAL</w:t>
         <w:tab/>
       </w:r>
       <w:r>
@@ -903,7 +903,7 @@
           <w:b/>
           <w:sz w:val="24"/>
         </w:rPr>
-        <w:t>II DIAGNÓSTICO SITUACIONAL</w:t>
+        <w:t>CAPÍTULO II: DIAGNÓSTICO SITUACIONAL</w:t>
         <w:tab/>
       </w:r>
       <w:r>
@@ -1083,7 +1083,7 @@
           <w:b/>
           <w:sz w:val="24"/>
         </w:rPr>
-        <w:t>III MARCO TEÓRICO</w:t>
+        <w:t>CAPÍTULO III: MARCO TEÓRICO</w:t>
         <w:tab/>
       </w:r>
       <w:r>
@@ -1143,7 +1143,7 @@
           <w:b/>
           <w:sz w:val="24"/>
         </w:rPr>
-        <w:t>IV ACTIVIDADES REALIZADAS</w:t>
+        <w:t>CAPÍTULO IV: ACTIVIDADES REALIZADAS</w:t>
         <w:tab/>
       </w:r>
       <w:r>
@@ -1203,7 +1203,7 @@
           <w:b/>
           <w:sz w:val="24"/>
         </w:rPr>
-        <w:t>V CONCLUSIONES Y RECOMENDACIONES</w:t>
+        <w:t>CAPÍTULO V: CONCLUSIONES Y RECOMENDACIONES</w:t>
         <w:tab/>
       </w:r>
       <w:r>

</xml_diff>

<commit_message>
Agregar paginas Aprobacion Tutor Industrial y Academico con membrete
</commit_message>
<xml_diff>
--- a/keidy/reportes/Informe_Pasantia_IUTECP.docx
+++ b/keidy/reportes/Informe_Pasantia_IUTECP.docx
@@ -390,6 +390,328 @@
     </w:p>
     <w:p>
       <w:pPr>
+        <w:spacing w:line="276" w:lineRule="auto" w:before="0" w:after="0"/>
+        <w:jc w:val="center"/>
+      </w:pPr>
+      <w:r>
+        <w:rPr>
+          <w:rFonts w:ascii="Times New Roman" w:hAnsi="Times New Roman"/>
+          <w:b/>
+          <w:sz w:val="24"/>
+        </w:rPr>
+        <w:t>REPÚBLICA BOLIVARIANA DE VENEZUELA</w:t>
+      </w:r>
+    </w:p>
+    <w:p>
+      <w:pPr>
+        <w:spacing w:line="276" w:lineRule="auto" w:before="0" w:after="0"/>
+        <w:jc w:val="center"/>
+      </w:pPr>
+      <w:r>
+        <w:rPr>
+          <w:rFonts w:ascii="Times New Roman" w:hAnsi="Times New Roman"/>
+          <w:b/>
+          <w:sz w:val="24"/>
+        </w:rPr>
+        <w:t>MINISTERIO DEL PODER POPULAR PARA LA EDUCACIÓN</w:t>
+      </w:r>
+    </w:p>
+    <w:p>
+      <w:pPr>
+        <w:spacing w:line="276" w:lineRule="auto" w:before="0" w:after="0"/>
+        <w:jc w:val="center"/>
+      </w:pPr>
+      <w:r>
+        <w:rPr>
+          <w:rFonts w:ascii="Times New Roman" w:hAnsi="Times New Roman"/>
+          <w:b/>
+          <w:sz w:val="24"/>
+        </w:rPr>
+        <w:t>INSTITUTO UNIVERSITARIO DE TECNOLOGÍA</w:t>
+      </w:r>
+    </w:p>
+    <w:p>
+      <w:pPr>
+        <w:spacing w:line="276" w:lineRule="auto" w:before="0" w:after="0"/>
+        <w:jc w:val="center"/>
+      </w:pPr>
+      <w:r>
+        <w:rPr>
+          <w:rFonts w:ascii="Times New Roman" w:hAnsi="Times New Roman"/>
+          <w:b/>
+          <w:sz w:val="24"/>
+        </w:rPr>
+        <w:t>"ELÍAS CALIXTO POMPA"</w:t>
+      </w:r>
+    </w:p>
+    <w:p>
+      <w:pPr>
+        <w:spacing w:line="276" w:lineRule="auto" w:before="0" w:after="0"/>
+        <w:jc w:val="center"/>
+      </w:pPr>
+      <w:r>
+        <w:rPr>
+          <w:rFonts w:ascii="Times New Roman" w:hAnsi="Times New Roman"/>
+          <w:b/>
+          <w:sz w:val="24"/>
+        </w:rPr>
+        <w:t>EL TIGRE, ESTADO ANZOÁTEGUI</w:t>
+      </w:r>
+    </w:p>
+    <w:p/>
+    <w:p>
+      <w:pPr>
+        <w:spacing w:before="480" w:after="480"/>
+        <w:jc w:val="center"/>
+      </w:pPr>
+      <w:r>
+        <w:rPr>
+          <w:rFonts w:ascii="Times New Roman" w:hAnsi="Times New Roman"/>
+          <w:b/>
+          <w:sz w:val="24"/>
+        </w:rPr>
+        <w:t>APROBACIÓN DEL TUTOR INDUSTRIAL</w:t>
+      </w:r>
+    </w:p>
+    <w:p>
+      <w:pPr>
+        <w:spacing w:line="360" w:lineRule="auto"/>
+        <w:ind w:firstLine="0"/>
+        <w:jc w:val="both"/>
+      </w:pPr>
+      <w:r>
+        <w:rPr>
+          <w:rFonts w:ascii="Times New Roman" w:hAnsi="Times New Roman"/>
+          <w:sz w:val="24"/>
+        </w:rPr>
+        <w:t>En mi carácter de tutor industrial del informe de pasantías presentado por: Keidy Guzmán, de Cédula de Identidad V-28.706.352; para optar al grado de Técnico Superior Universitario en la especialidad de: Administración, cuyo título es; “PROPUESTA DE SIMPLIFICACIÓN ADMINISTRATIVA DE LA PROCURA EN LUBRICANTES Y EQUIPOS VARYNA, C.A.”, manifiesto que cumple con los requisitos exigidos por el Instituto Universitario de Tecnología “Elías Calixto Pompa” (IUTECP); y que, por lo tanto, considero que reúne los méritos suficientes para ser evaluado por el jurado que se decida designar a tal fin.</w:t>
+      </w:r>
+    </w:p>
+    <w:p/>
+    <w:p/>
+    <w:p>
+      <w:pPr>
+        <w:spacing w:line="360" w:lineRule="auto"/>
+        <w:jc w:val="left"/>
+      </w:pPr>
+      <w:r>
+        <w:rPr>
+          <w:rFonts w:ascii="Times New Roman" w:hAnsi="Times New Roman"/>
+          <w:sz w:val="24"/>
+        </w:rPr>
+        <w:t>En la Ciudad de El Tigre, a los ___ días del mes de _______ de 2026</w:t>
+      </w:r>
+    </w:p>
+    <w:p/>
+    <w:p/>
+    <w:p/>
+    <w:p/>
+    <w:p/>
+    <w:p/>
+    <w:p>
+      <w:pPr>
+        <w:tabs>
+          <w:tab w:pos="10205" w:val="left"/>
+        </w:tabs>
+        <w:jc w:val="left"/>
+      </w:pPr>
+      <w:r>
+        <w:rPr>
+          <w:rFonts w:ascii="Times New Roman" w:hAnsi="Times New Roman"/>
+          <w:sz w:val="24"/>
+        </w:rPr>
+        <w:t>Apellidos y Nombres</w:t>
+      </w:r>
+      <w:r>
+        <w:rPr>
+          <w:rFonts w:ascii="Times New Roman" w:hAnsi="Times New Roman"/>
+          <w:sz w:val="24"/>
+        </w:rPr>
+        <w:tab/>
+      </w:r>
+      <w:r>
+        <w:rPr>
+          <w:rFonts w:ascii="Times New Roman" w:hAnsi="Times New Roman"/>
+          <w:sz w:val="24"/>
+        </w:rPr>
+        <w:t>C.I.: _______________</w:t>
+      </w:r>
+    </w:p>
+    <w:p>
+      <w:pPr>
+        <w:sectPr>
+          <w:footerReference w:type="default" r:id="rId14"/>
+          <w:pgSz w:w="12240" w:h="15840"/>
+          <w:pgMar w:top="1701" w:right="1701" w:bottom="1701" w:left="2268" w:header="720" w:footer="720" w:gutter="0"/>
+          <w:cols w:space="720"/>
+          <w:titlePg/>
+          <w:docGrid w:linePitch="360"/>
+        </w:sectPr>
+      </w:pPr>
+    </w:p>
+    <w:p>
+      <w:pPr>
+        <w:spacing w:line="276" w:lineRule="auto" w:before="0" w:after="0"/>
+        <w:jc w:val="center"/>
+      </w:pPr>
+      <w:r>
+        <w:rPr>
+          <w:rFonts w:ascii="Times New Roman" w:hAnsi="Times New Roman"/>
+          <w:b/>
+          <w:sz w:val="24"/>
+        </w:rPr>
+        <w:t>REPÚBLICA BOLIVARIANA DE VENEZUELA</w:t>
+      </w:r>
+    </w:p>
+    <w:p>
+      <w:pPr>
+        <w:spacing w:line="276" w:lineRule="auto" w:before="0" w:after="0"/>
+        <w:jc w:val="center"/>
+      </w:pPr>
+      <w:r>
+        <w:rPr>
+          <w:rFonts w:ascii="Times New Roman" w:hAnsi="Times New Roman"/>
+          <w:b/>
+          <w:sz w:val="24"/>
+        </w:rPr>
+        <w:t>MINISTERIO DEL PODER POPULAR PARA LA EDUCACIÓN</w:t>
+      </w:r>
+    </w:p>
+    <w:p>
+      <w:pPr>
+        <w:spacing w:line="276" w:lineRule="auto" w:before="0" w:after="0"/>
+        <w:jc w:val="center"/>
+      </w:pPr>
+      <w:r>
+        <w:rPr>
+          <w:rFonts w:ascii="Times New Roman" w:hAnsi="Times New Roman"/>
+          <w:b/>
+          <w:sz w:val="24"/>
+        </w:rPr>
+        <w:t>INSTITUTO UNIVERSITARIO DE TECNOLOGÍA</w:t>
+      </w:r>
+    </w:p>
+    <w:p>
+      <w:pPr>
+        <w:spacing w:line="276" w:lineRule="auto" w:before="0" w:after="0"/>
+        <w:jc w:val="center"/>
+      </w:pPr>
+      <w:r>
+        <w:rPr>
+          <w:rFonts w:ascii="Times New Roman" w:hAnsi="Times New Roman"/>
+          <w:b/>
+          <w:sz w:val="24"/>
+        </w:rPr>
+        <w:t>"ELÍAS CALIXTO POMPA"</w:t>
+      </w:r>
+    </w:p>
+    <w:p>
+      <w:pPr>
+        <w:spacing w:line="276" w:lineRule="auto" w:before="0" w:after="0"/>
+        <w:jc w:val="center"/>
+      </w:pPr>
+      <w:r>
+        <w:rPr>
+          <w:rFonts w:ascii="Times New Roman" w:hAnsi="Times New Roman"/>
+          <w:b/>
+          <w:sz w:val="24"/>
+        </w:rPr>
+        <w:t>EL TIGRE, ESTADO ANZOÁTEGUI</w:t>
+      </w:r>
+    </w:p>
+    <w:p/>
+    <w:p>
+      <w:pPr>
+        <w:spacing w:before="480" w:after="480"/>
+        <w:jc w:val="center"/>
+      </w:pPr>
+      <w:r>
+        <w:rPr>
+          <w:rFonts w:ascii="Times New Roman" w:hAnsi="Times New Roman"/>
+          <w:b/>
+          <w:sz w:val="24"/>
+        </w:rPr>
+        <w:t>APROBACIÓN DEL TUTOR ACADÉMICO</w:t>
+      </w:r>
+    </w:p>
+    <w:p>
+      <w:pPr>
+        <w:spacing w:line="360" w:lineRule="auto"/>
+        <w:ind w:firstLine="0"/>
+        <w:jc w:val="both"/>
+      </w:pPr>
+      <w:r>
+        <w:rPr>
+          <w:rFonts w:ascii="Times New Roman" w:hAnsi="Times New Roman"/>
+          <w:sz w:val="24"/>
+        </w:rPr>
+        <w:t>En mi carácter de tutor académico del informe de pasantías presentado por: Keidy Guzmán, de Cédula de Identidad V-28.706.352; para optar al grado de Técnico Superior Universitario en la especialidad de: Administración, cuyo título es; “PROPUESTA DE SIMPLIFICACIÓN ADMINISTRATIVA DE LA PROCURA EN LUBRICANTES Y EQUIPOS VARYNA, C.A.”, manifiesto que cumple con los requisitos exigidos por el Instituto Universitario de Tecnología “Elías Calixto Pompa” (IUTECP); y que, por lo tanto, considero que reúne los méritos suficientes para ser evaluado por el jurado que se decida designar a tal fin.</w:t>
+      </w:r>
+    </w:p>
+    <w:p/>
+    <w:p/>
+    <w:p>
+      <w:pPr>
+        <w:spacing w:line="360" w:lineRule="auto"/>
+        <w:jc w:val="left"/>
+      </w:pPr>
+      <w:r>
+        <w:rPr>
+          <w:rFonts w:ascii="Times New Roman" w:hAnsi="Times New Roman"/>
+          <w:sz w:val="24"/>
+        </w:rPr>
+        <w:t>En la Ciudad de El Tigre, a los ___ días del mes de _______ de 2026</w:t>
+      </w:r>
+    </w:p>
+    <w:p/>
+    <w:p/>
+    <w:p/>
+    <w:p/>
+    <w:p/>
+    <w:p/>
+    <w:p>
+      <w:pPr>
+        <w:tabs>
+          <w:tab w:pos="10205" w:val="left"/>
+        </w:tabs>
+        <w:jc w:val="left"/>
+      </w:pPr>
+      <w:r>
+        <w:rPr>
+          <w:rFonts w:ascii="Times New Roman" w:hAnsi="Times New Roman"/>
+          <w:sz w:val="24"/>
+        </w:rPr>
+        <w:t>Apellidos y Nombres</w:t>
+      </w:r>
+      <w:r>
+        <w:rPr>
+          <w:rFonts w:ascii="Times New Roman" w:hAnsi="Times New Roman"/>
+          <w:sz w:val="24"/>
+        </w:rPr>
+        <w:tab/>
+      </w:r>
+      <w:r>
+        <w:rPr>
+          <w:rFonts w:ascii="Times New Roman" w:hAnsi="Times New Roman"/>
+          <w:sz w:val="24"/>
+        </w:rPr>
+        <w:t>C.I.: _______________</w:t>
+      </w:r>
+    </w:p>
+    <w:p>
+      <w:pPr>
+        <w:sectPr>
+          <w:footerReference w:type="default" r:id="rId15"/>
+          <w:pgSz w:w="12240" w:h="15840"/>
+          <w:pgMar w:top="1701" w:right="1701" w:bottom="1701" w:left="2268" w:header="720" w:footer="720" w:gutter="0"/>
+          <w:cols w:space="720"/>
+          <w:titlePg/>
+          <w:docGrid w:linePitch="360"/>
+        </w:sectPr>
+      </w:pPr>
+    </w:p>
+    <w:p>
+      <w:pPr>
         <w:spacing w:before="1140" w:after="480"/>
         <w:jc w:val="center"/>
       </w:pPr>
@@ -405,7 +727,7 @@
     <w:p>
       <w:pPr>
         <w:sectPr>
-          <w:footerReference w:type="default" r:id="rId14"/>
+          <w:footerReference w:type="default" r:id="rId16"/>
           <w:pgSz w:w="12240" w:h="15840"/>
           <w:pgMar w:top="1701" w:right="1701" w:bottom="1701" w:left="2268" w:header="720" w:footer="720" w:gutter="0"/>
           <w:cols w:space="720"/>
@@ -426,6 +748,66 @@
           <w:sz w:val="24"/>
         </w:rPr>
         <w:t>pp.</w:t>
+      </w:r>
+    </w:p>
+    <w:p>
+      <w:pPr>
+        <w:tabs>
+          <w:tab w:pos="8271" w:val="right" w:leader="dot"/>
+        </w:tabs>
+        <w:spacing w:line="360" w:lineRule="auto" w:before="0" w:after="80"/>
+        <w:ind w:left="0"/>
+      </w:pPr>
+      <w:r>
+        <w:rPr>
+          <w:rFonts w:ascii="Times New Roman" w:hAnsi="Times New Roman"/>
+          <w:b w:val="0"/>
+          <w:sz w:val="24"/>
+        </w:rPr>
+        <w:t>APROBACIÓN DEL TUTOR INDUSTRIAL</w:t>
+        <w:tab/>
+      </w:r>
+      <w:r>
+        <w:rPr>
+          <w:rFonts w:ascii="Times New Roman" w:hAnsi="Times New Roman"/>
+          <w:b w:val="0"/>
+          <w:sz w:val="24"/>
+        </w:rPr>
+        <w:fldChar w:fldCharType="begin"/>
+        <w:instrText xml:space="preserve"> PAGEREF bm_aprob_ind \h </w:instrText>
+        <w:fldChar w:fldCharType="separate"/>
+        <w:t>?</w:t>
+        <w:fldChar w:fldCharType="end"/>
+      </w:r>
+    </w:p>
+    <w:p>
+      <w:pPr>
+        <w:tabs>
+          <w:tab w:pos="8271" w:val="right" w:leader="dot"/>
+        </w:tabs>
+        <w:spacing w:line="360" w:lineRule="auto" w:before="0" w:after="80"/>
+        <w:ind w:left="0"/>
+      </w:pPr>
+      <w:r>
+        <w:rPr>
+          <w:rFonts w:ascii="Times New Roman" w:hAnsi="Times New Roman"/>
+          <w:b w:val="0"/>
+          <w:sz w:val="24"/>
+        </w:rPr>
+        <w:t>APROBACIÓN DEL TUTOR ACADÉMICO</w:t>
+        <w:tab/>
+      </w:r>
+      <w:r>
+        <w:rPr>
+          <w:rFonts w:ascii="Times New Roman" w:hAnsi="Times New Roman"/>
+          <w:b w:val="0"/>
+          <w:sz w:val="24"/>
+        </w:rPr>
+        <w:fldChar w:fldCharType="begin"/>
+        <w:instrText xml:space="preserve"> PAGEREF bm_aprob_acad \h </w:instrText>
+        <w:fldChar w:fldCharType="separate"/>
+        <w:t>?</w:t>
+        <w:fldChar w:fldCharType="end"/>
       </w:r>
     </w:p>
     <w:p>
@@ -1342,7 +1724,7 @@
     <w:p>
       <w:pPr>
         <w:sectPr>
-          <w:footerReference w:type="default" r:id="rId15"/>
+          <w:footerReference w:type="default" r:id="rId17"/>
           <w:type w:val="continuous"/>
           <w:pgSz w:w="12240" w:h="15840"/>
           <w:pgMar w:top="1701" w:right="1701" w:bottom="1701" w:left="2268" w:header="720" w:footer="720" w:gutter="0"/>
@@ -1371,7 +1753,7 @@
     <w:p>
       <w:pPr>
         <w:sectPr>
-          <w:footerReference w:type="default" r:id="rId16"/>
+          <w:footerReference w:type="default" r:id="rId18"/>
           <w:pgSz w:w="12240" w:h="15840"/>
           <w:pgMar w:top="1701" w:right="1701" w:bottom="1701" w:left="2268" w:header="720" w:footer="720" w:gutter="0"/>
           <w:cols w:space="720"/>
@@ -1474,7 +1856,7 @@
     <w:p>
       <w:pPr>
         <w:sectPr>
-          <w:footerReference w:type="default" r:id="rId17"/>
+          <w:footerReference w:type="default" r:id="rId19"/>
           <w:type w:val="continuous"/>
           <w:pgSz w:w="12240" w:h="15840"/>
           <w:pgMar w:top="1701" w:right="1701" w:bottom="1701" w:left="2268" w:header="720" w:footer="720" w:gutter="0"/>
@@ -1503,7 +1885,7 @@
     <w:p>
       <w:pPr>
         <w:sectPr>
-          <w:footerReference w:type="default" r:id="rId18"/>
+          <w:footerReference w:type="default" r:id="rId20"/>
           <w:pgSz w:w="12240" w:h="15840"/>
           <w:pgMar w:top="1701" w:right="1701" w:bottom="1701" w:left="2268" w:header="720" w:footer="720" w:gutter="0"/>
           <w:cols w:space="720"/>
@@ -1515,7 +1897,7 @@
     <w:p>
       <w:pPr>
         <w:sectPr>
-          <w:footerReference w:type="default" r:id="rId19"/>
+          <w:footerReference w:type="default" r:id="rId21"/>
           <w:type w:val="continuous"/>
           <w:pgSz w:w="12240" w:h="15840"/>
           <w:pgMar w:top="1701" w:right="1701" w:bottom="1701" w:left="2268" w:header="720" w:footer="720" w:gutter="0"/>
@@ -1544,7 +1926,7 @@
     <w:p>
       <w:pPr>
         <w:sectPr>
-          <w:footerReference w:type="default" r:id="rId20"/>
+          <w:footerReference w:type="default" r:id="rId22"/>
           <w:pgSz w:w="12240" w:h="15840"/>
           <w:pgMar w:top="1701" w:right="1701" w:bottom="1701" w:left="2268" w:header="720" w:footer="720" w:gutter="0"/>
           <w:cols w:space="720"/>
@@ -1647,7 +2029,7 @@
     <w:p>
       <w:pPr>
         <w:sectPr>
-          <w:footerReference w:type="default" r:id="rId21"/>
+          <w:footerReference w:type="default" r:id="rId23"/>
           <w:type w:val="continuous"/>
           <w:pgSz w:w="12240" w:h="15840"/>
           <w:pgMar w:top="1701" w:right="1701" w:bottom="1701" w:left="2268" w:header="720" w:footer="720" w:gutter="0"/>
@@ -1676,7 +2058,7 @@
     <w:p>
       <w:pPr>
         <w:sectPr>
-          <w:footerReference w:type="default" r:id="rId22"/>
+          <w:footerReference w:type="default" r:id="rId24"/>
           <w:pgSz w:w="12240" w:h="15840"/>
           <w:pgMar w:top="1701" w:right="1701" w:bottom="1701" w:left="2268" w:header="720" w:footer="720" w:gutter="0"/>
           <w:cols w:space="720"/>
@@ -1715,7 +2097,7 @@
     <w:p>
       <w:pPr>
         <w:sectPr>
-          <w:footerReference w:type="default" r:id="rId23"/>
+          <w:footerReference w:type="default" r:id="rId25"/>
           <w:type w:val="continuous"/>
           <w:pgSz w:w="12240" w:h="15840"/>
           <w:pgMar w:top="1701" w:right="1701" w:bottom="1701" w:left="2268" w:header="720" w:footer="720" w:gutter="0"/>
@@ -1744,7 +2126,7 @@
     <w:p>
       <w:pPr>
         <w:sectPr>
-          <w:footerReference w:type="default" r:id="rId24"/>
+          <w:footerReference w:type="default" r:id="rId26"/>
           <w:pgSz w:w="12240" w:h="15840"/>
           <w:pgMar w:top="1701" w:right="1701" w:bottom="1701" w:left="2268" w:header="720" w:footer="720" w:gutter="0"/>
           <w:cols w:space="720"/>
@@ -1786,7 +2168,7 @@
     <w:p>
       <w:pPr>
         <w:sectPr>
-          <w:footerReference w:type="default" r:id="rId25"/>
+          <w:footerReference w:type="default" r:id="rId27"/>
           <w:type w:val="continuous"/>
           <w:pgSz w:w="12240" w:h="15840"/>
           <w:pgMar w:top="1701" w:right="1701" w:bottom="1701" w:left="2268" w:header="720" w:footer="720" w:gutter="0"/>
@@ -1815,7 +2197,7 @@
     <w:p>
       <w:pPr>
         <w:sectPr>
-          <w:footerReference w:type="default" r:id="rId26"/>
+          <w:footerReference w:type="default" r:id="rId28"/>
           <w:pgSz w:w="12240" w:h="15840"/>
           <w:pgMar w:top="1701" w:right="1701" w:bottom="1701" w:left="2268" w:header="720" w:footer="720" w:gutter="0"/>
           <w:cols w:space="720"/>
@@ -1842,7 +2224,7 @@
     <w:p>
       <w:pPr>
         <w:sectPr>
-          <w:footerReference w:type="default" r:id="rId27"/>
+          <w:footerReference w:type="default" r:id="rId29"/>
           <w:type w:val="continuous"/>
           <w:pgSz w:w="12240" w:h="15840"/>
           <w:pgMar w:top="1701" w:right="1701" w:bottom="1701" w:left="2268" w:header="720" w:footer="720" w:gutter="0"/>
@@ -1885,7 +2267,7 @@
     <w:p>
       <w:pPr>
         <w:sectPr>
-          <w:footerReference w:type="default" r:id="rId28"/>
+          <w:footerReference w:type="default" r:id="rId30"/>
           <w:pgSz w:w="12240" w:h="15840"/>
           <w:pgMar w:top="1701" w:right="1701" w:bottom="1701" w:left="2268" w:header="720" w:footer="720" w:gutter="0"/>
           <w:cols w:space="720"/>
@@ -4078,7 +4460,7 @@
     <w:p>
       <w:pPr>
         <w:sectPr>
-          <w:footerReference w:type="default" r:id="rId29"/>
+          <w:footerReference w:type="default" r:id="rId31"/>
           <w:type w:val="continuous"/>
           <w:pgSz w:w="12240" w:h="15840"/>
           <w:pgMar w:top="1701" w:right="1701" w:bottom="1701" w:left="2268" w:header="720" w:footer="720" w:gutter="0"/>
@@ -4121,7 +4503,7 @@
     <w:p>
       <w:pPr>
         <w:sectPr>
-          <w:footerReference w:type="default" r:id="rId30"/>
+          <w:footerReference w:type="default" r:id="rId32"/>
           <w:pgSz w:w="12240" w:h="15840"/>
           <w:pgMar w:top="1701" w:right="1701" w:bottom="1701" w:left="2268" w:header="720" w:footer="720" w:gutter="0"/>
           <w:cols w:space="720"/>
@@ -7564,7 +7946,7 @@
     <w:p>
       <w:pPr>
         <w:sectPr>
-          <w:footerReference w:type="default" r:id="rId31"/>
+          <w:footerReference w:type="default" r:id="rId33"/>
           <w:type w:val="continuous"/>
           <w:pgSz w:w="12240" w:h="15840"/>
           <w:pgMar w:top="1701" w:right="1701" w:bottom="1701" w:left="2268" w:header="720" w:footer="720" w:gutter="0"/>
@@ -7607,7 +7989,7 @@
     <w:p>
       <w:pPr>
         <w:sectPr>
-          <w:footerReference w:type="default" r:id="rId32"/>
+          <w:footerReference w:type="default" r:id="rId34"/>
           <w:pgSz w:w="12240" w:h="15840"/>
           <w:pgMar w:top="1701" w:right="1701" w:bottom="1701" w:left="2268" w:header="720" w:footer="720" w:gutter="0"/>
           <w:cols w:space="720"/>
@@ -7952,7 +8334,7 @@
     <w:p>
       <w:pPr>
         <w:sectPr>
-          <w:footerReference w:type="default" r:id="rId33"/>
+          <w:footerReference w:type="default" r:id="rId35"/>
           <w:type w:val="continuous"/>
           <w:pgSz w:w="12240" w:h="15840"/>
           <w:pgMar w:top="1701" w:right="1701" w:bottom="1701" w:left="2268" w:header="720" w:footer="720" w:gutter="0"/>
@@ -7995,7 +8377,7 @@
     <w:p>
       <w:pPr>
         <w:sectPr>
-          <w:footerReference w:type="default" r:id="rId34"/>
+          <w:footerReference w:type="default" r:id="rId36"/>
           <w:pgSz w:w="12240" w:h="15840"/>
           <w:pgMar w:top="1701" w:right="1701" w:bottom="1701" w:left="2268" w:header="720" w:footer="720" w:gutter="0"/>
           <w:cols w:space="720"/>
@@ -8758,7 +9140,7 @@
     <w:p>
       <w:pPr>
         <w:sectPr>
-          <w:footerReference w:type="default" r:id="rId35"/>
+          <w:footerReference w:type="default" r:id="rId37"/>
           <w:type w:val="continuous"/>
           <w:pgSz w:w="12240" w:h="15840"/>
           <w:pgMar w:top="1701" w:right="1701" w:bottom="1701" w:left="2268" w:header="720" w:footer="720" w:gutter="0"/>
@@ -8801,7 +9183,7 @@
     <w:p>
       <w:pPr>
         <w:sectPr>
-          <w:footerReference w:type="default" r:id="rId36"/>
+          <w:footerReference w:type="default" r:id="rId38"/>
           <w:pgSz w:w="12240" w:h="15840"/>
           <w:pgMar w:top="1701" w:right="1701" w:bottom="1701" w:left="2268" w:header="720" w:footer="720" w:gutter="0"/>
           <w:cols w:space="720"/>
@@ -9013,7 +9395,7 @@
     <w:p>
       <w:pPr>
         <w:sectPr>
-          <w:footerReference w:type="default" r:id="rId37"/>
+          <w:footerReference w:type="default" r:id="rId39"/>
           <w:type w:val="continuous"/>
           <w:pgSz w:w="12240" w:h="15840"/>
           <w:pgMar w:top="1701" w:right="1701" w:bottom="1701" w:left="2268" w:header="720" w:footer="720" w:gutter="0"/>
@@ -9042,7 +9424,7 @@
     <w:p>
       <w:pPr>
         <w:sectPr>
-          <w:footerReference w:type="default" r:id="rId38"/>
+          <w:footerReference w:type="default" r:id="rId40"/>
           <w:pgSz w:w="12240" w:h="15840"/>
           <w:pgMar w:top="1701" w:right="1701" w:bottom="1701" w:left="2268" w:header="720" w:footer="720" w:gutter="0"/>
           <w:cols w:space="720"/>
@@ -9143,7 +9525,7 @@
     <w:p>
       <w:pPr>
         <w:sectPr>
-          <w:footerReference w:type="default" r:id="rId39"/>
+          <w:footerReference w:type="default" r:id="rId41"/>
           <w:type w:val="continuous"/>
           <w:pgSz w:w="12240" w:h="15840"/>
           <w:pgMar w:top="1701" w:right="1701" w:bottom="1701" w:left="2268" w:header="720" w:footer="720" w:gutter="0"/>
@@ -9170,7 +9552,7 @@
       <w:bookmarkEnd w:id="bm_anexos"/>
     </w:p>
     <w:sectPr>
-      <w:footerReference w:type="default" r:id="rId40"/>
+      <w:footerReference w:type="default" r:id="rId42"/>
       <w:pgSz w:w="12240" w:h="15840"/>
       <w:pgMar w:top="1701" w:right="1701" w:bottom="1701" w:left="2268" w:header="720" w:footer="720" w:gutter="0"/>
       <w:cols w:space="720"/>
@@ -9351,7 +9733,7 @@
         <w:sz w:val="24"/>
       </w:rPr>
       <w:fldChar w:fldCharType="begin"/>
-      <w:instrText xml:space="preserve"> PAGE </w:instrText>
+      <w:instrText xml:space="preserve"> PAGE \* roman </w:instrText>
       <w:fldChar w:fldCharType="separate"/>
       <w:fldChar w:fldCharType="end"/>
     </w:r>
@@ -9372,7 +9754,7 @@
         <w:sz w:val="24"/>
       </w:rPr>
       <w:fldChar w:fldCharType="begin"/>
-      <w:instrText xml:space="preserve"> PAGE </w:instrText>
+      <w:instrText xml:space="preserve"> PAGE \* roman </w:instrText>
       <w:fldChar w:fldCharType="separate"/>
       <w:fldChar w:fldCharType="end"/>
     </w:r>
@@ -9626,7 +10008,60 @@
   <w:p>
     <w:pPr>
       <w:pStyle w:val="Footer"/>
+      <w:jc w:val="center"/>
     </w:pPr>
+    <w:r>
+      <w:rPr>
+        <w:rFonts w:ascii="Times New Roman" w:hAnsi="Times New Roman"/>
+        <w:sz w:val="24"/>
+      </w:rPr>
+      <w:fldChar w:fldCharType="begin"/>
+      <w:instrText xml:space="preserve"> PAGE \* roman </w:instrText>
+      <w:fldChar w:fldCharType="separate"/>
+      <w:fldChar w:fldCharType="end"/>
+    </w:r>
+  </w:p>
+</w:ftr>
+</file>
+
+<file path=word/footer30.xml><?xml version="1.0" encoding="utf-8"?>
+<w:ftr xmlns:m="http://schemas.openxmlformats.org/officeDocument/2006/math" xmlns:mc="http://schemas.openxmlformats.org/markup-compatibility/2006" xmlns:mo="http://schemas.microsoft.com/office/mac/office/2008/main" xmlns:mv="urn:schemas-microsoft-com:mac:vml" xmlns:o="urn:schemas-microsoft-com:office:office" xmlns:r="http://schemas.openxmlformats.org/officeDocument/2006/relationships" xmlns:v="urn:schemas-microsoft-com:vml" xmlns:w10="urn:schemas-microsoft-com:office:word" xmlns:w14="http://schemas.microsoft.com/office/word/2010/wordml" xmlns:w="http://schemas.openxmlformats.org/wordprocessingml/2006/main" xmlns:wne="http://schemas.microsoft.com/office/word/2006/wordml" xmlns:wp14="http://schemas.microsoft.com/office/word/2010/wordprocessingDrawing" xmlns:wp="http://schemas.openxmlformats.org/drawingml/2006/wordprocessingDrawing" xmlns:wpc="http://schemas.microsoft.com/office/word/2010/wordprocessingCanvas" xmlns:wpg="http://schemas.microsoft.com/office/word/2010/wordprocessingGroup" xmlns:wpi="http://schemas.microsoft.com/office/word/2010/wordprocessingInk" xmlns:wps="http://schemas.microsoft.com/office/word/2010/wordprocessingShape" mc:Ignorable="w14 wp14">
+  <w:p>
+    <w:pPr>
+      <w:pStyle w:val="Footer"/>
+      <w:jc w:val="center"/>
+    </w:pPr>
+    <w:r>
+      <w:rPr>
+        <w:rFonts w:ascii="Times New Roman" w:hAnsi="Times New Roman"/>
+        <w:sz w:val="24"/>
+      </w:rPr>
+      <w:fldChar w:fldCharType="begin"/>
+      <w:instrText xml:space="preserve"> PAGE </w:instrText>
+      <w:fldChar w:fldCharType="separate"/>
+      <w:fldChar w:fldCharType="end"/>
+    </w:r>
+  </w:p>
+</w:ftr>
+</file>
+
+<file path=word/footer31.xml><?xml version="1.0" encoding="utf-8"?>
+<w:ftr xmlns:m="http://schemas.openxmlformats.org/officeDocument/2006/math" xmlns:mc="http://schemas.openxmlformats.org/markup-compatibility/2006" xmlns:mo="http://schemas.microsoft.com/office/mac/office/2008/main" xmlns:mv="urn:schemas-microsoft-com:mac:vml" xmlns:o="urn:schemas-microsoft-com:office:office" xmlns:r="http://schemas.openxmlformats.org/officeDocument/2006/relationships" xmlns:v="urn:schemas-microsoft-com:vml" xmlns:w10="urn:schemas-microsoft-com:office:word" xmlns:w14="http://schemas.microsoft.com/office/word/2010/wordml" xmlns:w="http://schemas.openxmlformats.org/wordprocessingml/2006/main" xmlns:wne="http://schemas.microsoft.com/office/word/2006/wordml" xmlns:wp14="http://schemas.microsoft.com/office/word/2010/wordprocessingDrawing" xmlns:wp="http://schemas.openxmlformats.org/drawingml/2006/wordprocessingDrawing" xmlns:wpc="http://schemas.microsoft.com/office/word/2010/wordprocessingCanvas" xmlns:wpg="http://schemas.microsoft.com/office/word/2010/wordprocessingGroup" xmlns:wpi="http://schemas.microsoft.com/office/word/2010/wordprocessingInk" xmlns:wps="http://schemas.microsoft.com/office/word/2010/wordprocessingShape" mc:Ignorable="w14 wp14">
+  <w:p>
+    <w:pPr>
+      <w:pStyle w:val="Footer"/>
+      <w:jc w:val="center"/>
+    </w:pPr>
+    <w:r>
+      <w:rPr>
+        <w:rFonts w:ascii="Times New Roman" w:hAnsi="Times New Roman"/>
+        <w:sz w:val="24"/>
+      </w:rPr>
+      <w:fldChar w:fldCharType="begin"/>
+      <w:instrText xml:space="preserve"> PAGE </w:instrText>
+      <w:fldChar w:fldCharType="separate"/>
+      <w:fldChar w:fldCharType="end"/>
+    </w:r>
   </w:p>
 </w:ftr>
 </file>
@@ -9636,7 +10071,18 @@
   <w:p>
     <w:pPr>
       <w:pStyle w:val="Footer"/>
+      <w:jc w:val="center"/>
     </w:pPr>
+    <w:r>
+      <w:rPr>
+        <w:rFonts w:ascii="Times New Roman" w:hAnsi="Times New Roman"/>
+        <w:sz w:val="24"/>
+      </w:rPr>
+      <w:fldChar w:fldCharType="begin"/>
+      <w:instrText xml:space="preserve"> PAGE \* roman </w:instrText>
+      <w:fldChar w:fldCharType="separate"/>
+      <w:fldChar w:fldCharType="end"/>
+    </w:r>
   </w:p>
 </w:ftr>
 </file>
@@ -9646,18 +10092,7 @@
   <w:p>
     <w:pPr>
       <w:pStyle w:val="Footer"/>
-      <w:jc w:val="center"/>
     </w:pPr>
-    <w:r>
-      <w:rPr>
-        <w:rFonts w:ascii="Times New Roman" w:hAnsi="Times New Roman"/>
-        <w:sz w:val="24"/>
-      </w:rPr>
-      <w:fldChar w:fldCharType="begin"/>
-      <w:instrText xml:space="preserve"> PAGE \* roman </w:instrText>
-      <w:fldChar w:fldCharType="separate"/>
-      <w:fldChar w:fldCharType="end"/>
-    </w:r>
   </w:p>
 </w:ftr>
 </file>
@@ -9667,18 +10102,7 @@
   <w:p>
     <w:pPr>
       <w:pStyle w:val="Footer"/>
-      <w:jc w:val="center"/>
     </w:pPr>
-    <w:r>
-      <w:rPr>
-        <w:rFonts w:ascii="Times New Roman" w:hAnsi="Times New Roman"/>
-        <w:sz w:val="24"/>
-      </w:rPr>
-      <w:fldChar w:fldCharType="begin"/>
-      <w:instrText xml:space="preserve"> PAGE \* roman </w:instrText>
-      <w:fldChar w:fldCharType="separate"/>
-      <w:fldChar w:fldCharType="end"/>
-    </w:r>
   </w:p>
 </w:ftr>
 </file>

</xml_diff>

<commit_message>
Resumir estructura organizativa de Keidy
</commit_message>
<xml_diff>
--- a/keidy/reportes/Informe_Pasantia_IUTECP.docx
+++ b/keidy/reportes/Informe_Pasantia_IUTECP.docx
@@ -4581,127 +4581,7 @@
           <w:i w:val="0"/>
           <w:sz w:val="24"/>
         </w:rPr>
-        <w:t>A continuación, se presenta la estructura organizativa de la empresa, reflejando las líneas de mando y la distribución de los departamentos administrativos y de procura. Los departamentos que conforman la organización son los siguientes:</w:t>
-      </w:r>
-    </w:p>
-    <w:p>
-      <w:pPr>
-        <w:spacing w:line="360" w:lineRule="auto" w:after="0" w:before="0"/>
-        <w:ind w:firstLine="709"/>
-        <w:jc w:val="both"/>
-      </w:pPr>
-      <w:r>
-        <w:rPr>
-          <w:rFonts w:ascii="Times New Roman" w:hAnsi="Times New Roman"/>
-          <w:i w:val="0"/>
-          <w:sz w:val="24"/>
-        </w:rPr>
-        <w:t>Gerencia General: Es la máxima autoridad ejecutiva encargada de la dirección estratégica, la toma de decisiones corporativas y el cumplimiento de los objetivos globales de la organización.</w:t>
-      </w:r>
-    </w:p>
-    <w:p>
-      <w:pPr>
-        <w:spacing w:line="360" w:lineRule="auto" w:after="0" w:before="0"/>
-        <w:ind w:firstLine="709"/>
-        <w:jc w:val="both"/>
-      </w:pPr>
-      <w:r>
-        <w:rPr>
-          <w:rFonts w:ascii="Times New Roman" w:hAnsi="Times New Roman"/>
-          <w:i w:val="0"/>
-          <w:sz w:val="24"/>
-        </w:rPr>
-        <w:t>Gerencia de Operaciones: Coordina y supervisa la ejecución técnica y operativa de los proyectos, garantizando la eficiencia en el uso de recursos e infraestructura en campo.</w:t>
-      </w:r>
-    </w:p>
-    <w:p>
-      <w:pPr>
-        <w:spacing w:line="360" w:lineRule="auto" w:after="0" w:before="0"/>
-        <w:ind w:firstLine="709"/>
-        <w:jc w:val="both"/>
-      </w:pPr>
-      <w:r>
-        <w:rPr>
-          <w:rFonts w:ascii="Times New Roman" w:hAnsi="Times New Roman"/>
-          <w:i w:val="0"/>
-          <w:sz w:val="24"/>
-        </w:rPr>
-        <w:t>Gerencia de Control y Avance (y Operaciones Morichal): Responsable de monitorear el rendimiento, cumplimiento de metas de avance físico de obras y la logística operativa regional en el área de Morichal.</w:t>
-      </w:r>
-    </w:p>
-    <w:p>
-      <w:pPr>
-        <w:spacing w:line="360" w:lineRule="auto" w:after="0" w:before="0"/>
-        <w:ind w:firstLine="709"/>
-        <w:jc w:val="both"/>
-      </w:pPr>
-      <w:r>
-        <w:rPr>
-          <w:rFonts w:ascii="Times New Roman" w:hAnsi="Times New Roman"/>
-          <w:i w:val="0"/>
-          <w:sz w:val="24"/>
-        </w:rPr>
-        <w:t>Departamento Administrativo (Área de Pasantía): Unidad encargada de la gestión financiera, presupuestaria, logística interna, control contable e inventarios. En este departamento se desenvuelve la pasante en el rol de Asistente Administrativo, brindando apoyo operativo y de control, con énfasis en el área de Procura (Compras y Logística) mediante la recepción de requerimientos, solicitud de cotizaciones, selección de proveedores y seguimiento a la adquisición oportuna de bienes, materiales y servicios esenciales.</w:t>
-      </w:r>
-    </w:p>
-    <w:p>
-      <w:pPr>
-        <w:spacing w:line="360" w:lineRule="auto" w:after="0" w:before="0"/>
-        <w:ind w:firstLine="709"/>
-        <w:jc w:val="both"/>
-      </w:pPr>
-      <w:r>
-        <w:rPr>
-          <w:rFonts w:ascii="Times New Roman" w:hAnsi="Times New Roman"/>
-          <w:i w:val="0"/>
-          <w:sz w:val="24"/>
-        </w:rPr>
-        <w:t>Gerencia de Contratación y Administración de Contratos: Encargada del análisis de costos, estimaciones presupuestarias, planificación y control legal y operativo de las licitaciones y contratos vigentes.</w:t>
-      </w:r>
-    </w:p>
-    <w:p>
-      <w:pPr>
-        <w:spacing w:line="360" w:lineRule="auto" w:after="0" w:before="0"/>
-        <w:ind w:firstLine="709"/>
-        <w:jc w:val="both"/>
-      </w:pPr>
-      <w:r>
-        <w:rPr>
-          <w:rFonts w:ascii="Times New Roman" w:hAnsi="Times New Roman"/>
-          <w:i w:val="0"/>
-          <w:sz w:val="24"/>
-        </w:rPr>
-        <w:t>Gerencia de Recursos Humanos y Relaciones Laborales: Dirige el reclutamiento, selección, administración de personal, nómina y la gestión del clima laboral de la empresa.</w:t>
-      </w:r>
-    </w:p>
-    <w:p>
-      <w:pPr>
-        <w:spacing w:line="360" w:lineRule="auto" w:after="0" w:before="0"/>
-        <w:ind w:firstLine="709"/>
-        <w:jc w:val="both"/>
-      </w:pPr>
-      <w:r>
-        <w:rPr>
-          <w:rFonts w:ascii="Times New Roman" w:hAnsi="Times New Roman"/>
-          <w:i w:val="0"/>
-          <w:sz w:val="24"/>
-        </w:rPr>
-        <w:t>Gerencias Técnicas (Proyectos, Optimización, Servicios Eléctricos y Metalmecánico): Áreas especializadas dedicadas al diseño, mantenimiento, ejecución de estructuras metálicas y optimización de servicios de ingeniería en campo.</w:t>
-      </w:r>
-    </w:p>
-    <w:p>
-      <w:pPr>
-        <w:spacing w:line="360" w:lineRule="auto" w:after="0" w:before="0"/>
-        <w:ind w:firstLine="709"/>
-        <w:jc w:val="both"/>
-      </w:pPr>
-      <w:r>
-        <w:rPr>
-          <w:rFonts w:ascii="Times New Roman" w:hAnsi="Times New Roman"/>
-          <w:i w:val="0"/>
-          <w:sz w:val="24"/>
-        </w:rPr>
-        <w:t>Coordinaciones de SIHO-A y Calidad: Unidades orientadas a garantizar la Seguridad Industrial, Higiene Ocupacional y Ambiente, asegurando el cumplimiento de normas de prevención de riesgos y estándares de calidad en las operaciones.</w:t>
+        <w:t>La estructura organizativa de Lubricantes y Equipos Varyna, C.A. es de tipo jerárquico-funcional y está integrada por la Gerencia General, Gerencia de Operaciones, Gerencia de Control y Avance, Departamento Administrativo, Gerencia de Contratación y Administración de Contratos, Recursos Humanos, gerencias técnicas y coordinaciones de SIHO-A y Calidad. El Departamento Administrativo, área de pasantía, coordina procesos financieros, logísticos y de procura, incluyendo la recepción de requerimientos, solicitud de cotizaciones, selección de proveedores y seguimiento de adquisiciones. A continuación, se presentan el organigrama general y las unidades relacionadas con el área de procura.</w:t>
       </w:r>
     </w:p>
     <w:p>

</xml_diff>